<commit_message>
Rewrite v1.1 in place after independent review
</commit_message>
<xml_diff>
--- a/docs/ACBI_Technical_Solution_Proposal_v1.1.docx
+++ b/docs/ACBI_Technical_Solution_Proposal_v1.1.docx
@@ -257,6 +257,197 @@
         <w:t>Based on arc42 Template Version 9.0-EN (July 2025)</w:t>
       </w:r>
     </w:p>
+    <w:p>
+      <w:r>
+        <w:rPr>
+          <w:b/>
+          <w:bCs/>
+        </w:rPr>
+        <w:t xml:space="preserve">Revision History</w:t>
+      </w:r>
+    </w:p>
+    <w:tbl>
+      <w:tblPr>
+        <w:tblStyle w:val="TableGrid"/>
+        <w:tblW w:w="9648" w:type="dxa"/>
+        <w:jc w:val="center"/>
+        <w:tblLook w:val="04A0" w:firstRow="1" w:lastRow="0" w:firstColumn="1" w:lastColumn="0" w:noHBand="0" w:noVBand="1"/>
+      </w:tblPr>
+      <w:tblGrid>
+        <w:gridCol w:w="1100"/>
+        <w:gridCol w:w="1400"/>
+        <w:gridCol w:w="7148"/>
+      </w:tblGrid>
+      <w:tr>
+        <w:trPr>
+          <w:tblHeader/>
+          <w:jc w:val="center"/>
+        </w:trPr>
+        <w:tc>
+          <w:tcPr>
+            <w:tcW w:w="1100" w:type="dxa"/>
+            <w:shd w:val="clear" w:color="auto" w:fill="D9EAF7"/>
+          </w:tcPr>
+          <w:p>
+            <w:pPr>
+              <w:spacing w:after="0"/>
+            </w:pPr>
+            <w:r>
+              <w:rPr>
+                <w:b/>
+                <w:bCs/>
+                <w:sz w:val="20"/>
+              </w:rPr>
+              <w:t xml:space="preserve">Version</w:t>
+            </w:r>
+          </w:p>
+        </w:tc>
+        <w:tc>
+          <w:tcPr>
+            <w:tcW w:w="1400" w:type="dxa"/>
+            <w:shd w:val="clear" w:color="auto" w:fill="D9EAF7"/>
+          </w:tcPr>
+          <w:p>
+            <w:pPr>
+              <w:spacing w:after="0"/>
+            </w:pPr>
+            <w:r>
+              <w:rPr>
+                <w:b/>
+                <w:bCs/>
+                <w:sz w:val="20"/>
+              </w:rPr>
+              <w:t xml:space="preserve">Date</w:t>
+            </w:r>
+          </w:p>
+        </w:tc>
+        <w:tc>
+          <w:tcPr>
+            <w:tcW w:w="7148" w:type="dxa"/>
+            <w:shd w:val="clear" w:color="auto" w:fill="D9EAF7"/>
+          </w:tcPr>
+          <w:p>
+            <w:pPr>
+              <w:spacing w:after="0"/>
+            </w:pPr>
+            <w:r>
+              <w:rPr>
+                <w:b/>
+                <w:bCs/>
+                <w:sz w:val="20"/>
+              </w:rPr>
+              <w:t xml:space="preserve">Changes</w:t>
+            </w:r>
+          </w:p>
+        </w:tc>
+      </w:tr>
+      <w:tr>
+        <w:trPr>
+          <w:jc w:val="center"/>
+        </w:trPr>
+        <w:tc>
+          <w:tcPr>
+            <w:tcW w:w="1100" w:type="dxa"/>
+          </w:tcPr>
+          <w:p>
+            <w:pPr>
+              <w:spacing w:after="0"/>
+            </w:pPr>
+            <w:r>
+              <w:rPr>
+                <w:sz w:val="18"/>
+              </w:rPr>
+              <w:t xml:space="preserve">1.0</w:t>
+            </w:r>
+          </w:p>
+        </w:tc>
+        <w:tc>
+          <w:tcPr>
+            <w:tcW w:w="1400" w:type="dxa"/>
+          </w:tcPr>
+          <w:p>
+            <w:pPr>
+              <w:spacing w:after="0"/>
+            </w:pPr>
+            <w:r>
+              <w:rPr>
+                <w:sz w:val="18"/>
+              </w:rPr>
+              <w:t xml:space="preserve">17/9/2026</w:t>
+            </w:r>
+          </w:p>
+        </w:tc>
+        <w:tc>
+          <w:tcPr>
+            <w:tcW w:w="7148" w:type="dxa"/>
+          </w:tcPr>
+          <w:p>
+            <w:pPr>
+              <w:spacing w:after="0"/>
+            </w:pPr>
+            <w:r>
+              <w:rPr>
+                <w:sz w:val="18"/>
+              </w:rPr>
+              <w:t xml:space="preserve">Initial proposal.</w:t>
+            </w:r>
+          </w:p>
+        </w:tc>
+      </w:tr>
+      <w:tr>
+        <w:trPr>
+          <w:jc w:val="center"/>
+        </w:trPr>
+        <w:tc>
+          <w:tcPr>
+            <w:tcW w:w="1100" w:type="dxa"/>
+          </w:tcPr>
+          <w:p>
+            <w:pPr>
+              <w:spacing w:after="0"/>
+            </w:pPr>
+            <w:r>
+              <w:rPr>
+                <w:sz w:val="18"/>
+              </w:rPr>
+              <w:t xml:space="preserve">1.1</w:t>
+            </w:r>
+          </w:p>
+        </w:tc>
+        <w:tc>
+          <w:tcPr>
+            <w:tcW w:w="1400" w:type="dxa"/>
+          </w:tcPr>
+          <w:p>
+            <w:pPr>
+              <w:spacing w:after="0"/>
+            </w:pPr>
+            <w:r>
+              <w:rPr>
+                <w:sz w:val="18"/>
+              </w:rPr>
+              <w:t xml:space="preserve">14/10/2026</w:t>
+            </w:r>
+          </w:p>
+        </w:tc>
+        <w:tc>
+          <w:tcPr>
+            <w:tcW w:w="7148" w:type="dxa"/>
+          </w:tcPr>
+          <w:p>
+            <w:pPr>
+              <w:spacing w:after="0"/>
+            </w:pPr>
+            <w:r>
+              <w:rPr>
+                <w:sz w:val="18"/>
+              </w:rPr>
+              <w:t xml:space="preserve">Aligned with the implemented prototype: data sent to external services (3.2); processing order and refusal of the IT Administrator role (6.1, 6.2); SQL validation limits and correction (8.3); conversation handling, comparisons and multi-request messages (8.4); visualization selection (8.5, 9.4); AI availability and provider operation (8.6, 9.2); additional mitigations (11.2, 11.3); indicative AI cost (Appendix B). Spelling and heading corrections.</w:t>
+            </w:r>
+          </w:p>
+        </w:tc>
+      </w:tr>
+    </w:tbl>
     <w:p>
       <w:r>
         <w:br w:type="page"/>
@@ -771,7 +962,7 @@
                 <w:rStyle w:val="Hyperlink"/>
                 <w:noProof/>
               </w:rPr>
-              <w:t>2.1 Technical Constrains</w:t>
+              <w:t>2.1 Technical Constraints</w:t>
             </w:r>
             <w:r>
               <w:rPr>
@@ -1958,7 +2149,7 @@
                 <w:rStyle w:val="Hyperlink"/>
                 <w:noProof/>
               </w:rPr>
-              <w:t>No Data Found</w:t>
+              <w:t>6.3 No Data Found</w:t>
             </w:r>
             <w:r>
               <w:rPr>
@@ -4091,7 +4282,7 @@
         <w:t>AI-Powered Conversational Business Intelligence System</w:t>
       </w:r>
       <w:r>
-        <w:t xml:space="preserve"> (ACBI) System allows users to query business data though voice or chat using AI chatbot</w:t>
+        <w:t xml:space="preserve"> (ACBI) System allows users to query business data through voice or chat using AI chatbot</w:t>
       </w:r>
       <w:r>
         <w:t>.</w:t>
@@ -4109,12 +4300,12 @@
     </w:p>
     <w:p>
       <w:r>
-        <w:t>The overall goal of the ACBI System is to enable users to access business data though an AI chatbot and receive clear, data-backed answer in the form of summaries, tables and chart within their access permissions</w:t>
+        <w:t>The overall goal of the ACBI System is to enable users to access business data through an AI chatbot and receive clear, data-backed answer in the form of summaries, tables and chart within their access permissions</w:t>
       </w:r>
     </w:p>
     <w:p>
       <w:r>
-        <w:t>The system aims to simplify access to business information though natural language, reducing reliance on manually navigating management dashboards and reports.</w:t>
+        <w:t>The system aims to simplify access to business information through natural language, reducing reliance on manually navigating management dashboards and reports.</w:t>
       </w:r>
     </w:p>
     <w:p>
@@ -4125,7 +4316,7 @@
         <w:t>s</w:t>
       </w:r>
       <w:r>
-        <w:t xml:space="preserve"> are still being defined, this document primarily focuses on quality goals and evaluates technologies, architectural pattens and framework</w:t>
+        <w:t xml:space="preserve"> are still being defined, this document primarily focuses on quality goals and evaluates technologies, architectural patterns and framework</w:t>
       </w:r>
       <w:r>
         <w:t>s</w:t>
@@ -4159,7 +4350,7 @@
         </w:numPr>
       </w:pPr>
       <w:r>
-        <w:t>Accept user questions though text or voice and identify their intent and query conditions.</w:t>
+        <w:t>Accept user questions through text or voice and identify their intent and query conditions.</w:t>
       </w:r>
     </w:p>
     <w:p>
@@ -5125,7 +5316,7 @@
       </w:pPr>
       <w:bookmarkStart w:id="6" w:name="_Toc240609467"/>
       <w:r>
-        <w:t>2.1 Technical Constrains</w:t>
+        <w:t>2.1 Technical Constraints</w:t>
       </w:r>
       <w:bookmarkEnd w:id="6"/>
     </w:p>
@@ -5480,25 +5671,18 @@
     </w:p>
     <w:p>
       <w:pPr>
-        <w:pStyle w:val="Heading2"/>
         <w:rPr>
-          <w:rFonts w:ascii="Arial" w:eastAsiaTheme="minorEastAsia" w:hAnsi="Arial" w:cstheme="minorBidi"/>
-          <w:color w:val="auto"/>
-          <w:sz w:val="22"/>
-          <w:szCs w:val="22"/>
+          <w:b/>
+          <w:bCs/>
         </w:rPr>
       </w:pPr>
-      <w:bookmarkStart w:id="8" w:name="_Toc240609469"/>
       <w:r>
         <w:rPr>
-          <w:rFonts w:ascii="Arial" w:eastAsiaTheme="minorEastAsia" w:hAnsi="Arial" w:cstheme="minorBidi"/>
-          <w:color w:val="auto"/>
-          <w:sz w:val="22"/>
-          <w:szCs w:val="22"/>
+          <w:b/>
+          <w:bCs/>
         </w:rPr>
         <w:t>Business Definition Constraints</w:t>
       </w:r>
-      <w:bookmarkEnd w:id="8"/>
     </w:p>
     <w:tbl>
       <w:tblPr>
@@ -6301,21 +6485,21 @@
     </w:p>
     <w:p>
       <w:r>
-        <w:t xml:space="preserve">The AI service has no access path to the data warehouse, but information does leave the system. The table lists exactly what each external call carries and which setting controls it.</w:t>
+        <w:t xml:space="preserve">The external AI service has no access path to the company data warehouse, but information still leaves the system. The table lists what each external call carries and the setting that controls it.</w:t>
       </w:r>
     </w:p>
     <w:tbl>
       <w:tblPr>
         <w:tblStyle w:val="TableGrid"/>
-        <w:tblW w:w="10150" w:type="dxa"/>
+        <w:tblW w:w="9648" w:type="dxa"/>
         <w:jc w:val="center"/>
         <w:tblLook w:val="04A0" w:firstRow="1" w:lastRow="0" w:firstColumn="1" w:lastColumn="0" w:noHBand="0" w:noVBand="1"/>
       </w:tblPr>
       <w:tblGrid>
         <w:gridCol w:w="1700"/>
-        <w:gridCol w:w="3900"/>
-        <w:gridCol w:w="2300"/>
-        <w:gridCol w:w="2250"/>
+        <w:gridCol w:w="4300"/>
+        <w:gridCol w:w="1700"/>
+        <w:gridCol w:w="1948"/>
       </w:tblGrid>
       <w:tr>
         <w:trPr>
@@ -6343,7 +6527,7 @@
         </w:tc>
         <w:tc>
           <w:tcPr>
-            <w:tcW w:w="3900" w:type="dxa"/>
+            <w:tcW w:w="4300" w:type="dxa"/>
             <w:shd w:val="clear" w:color="auto" w:fill="D9EAF7"/>
           </w:tcPr>
           <w:p>
@@ -6362,7 +6546,7 @@
         </w:tc>
         <w:tc>
           <w:tcPr>
-            <w:tcW w:w="2300" w:type="dxa"/>
+            <w:tcW w:w="1700" w:type="dxa"/>
             <w:shd w:val="clear" w:color="auto" w:fill="D9EAF7"/>
           </w:tcPr>
           <w:p>
@@ -6381,7 +6565,7 @@
         </w:tc>
         <w:tc>
           <w:tcPr>
-            <w:tcW w:w="2250" w:type="dxa"/>
+            <w:tcW w:w="1948" w:type="dxa"/>
             <w:shd w:val="clear" w:color="auto" w:fill="D9EAF7"/>
           </w:tcPr>
           <w:p>
@@ -6421,7 +6605,7 @@
         </w:tc>
         <w:tc>
           <w:tcPr>
-            <w:tcW w:w="3900" w:type="dxa"/>
+            <w:tcW w:w="4300" w:type="dxa"/>
           </w:tcPr>
           <w:p>
             <w:pPr>
@@ -6431,13 +6615,13 @@
               <w:rPr>
                 <w:sz w:val="18"/>
               </w:rPr>
-              <w:t xml:space="preserve">The question (up to 1,000 characters); the data date; the approved catalogue of metrics, dimensions, territory and factory names; the previous request slots; up to 6 recent turns with amounts and ratios replaced by [number]</w:t>
-            </w:r>
-          </w:p>
-        </w:tc>
-        <w:tc>
-          <w:tcPr>
-            <w:tcW w:w="2300" w:type="dxa"/>
+              <w:t xml:space="preserve">The question (up to 1,000 characters); the data date; the full approved catalogue of metrics, dimensions and their members (up to 40 per dimension, with factory identifiers), not filtered by role; the request slots and any pending clarification from the previous turn; up to 6 recent turns, in which formatted amounts and decimal ratios of earlier answers are replaced by a placeholder</w:t>
+            </w:r>
+          </w:p>
+        </w:tc>
+        <w:tc>
+          <w:tcPr>
+            <w:tcW w:w="1700" w:type="dxa"/>
           </w:tcPr>
           <w:p>
             <w:pPr>
@@ -6447,13 +6631,13 @@
               <w:rPr>
                 <w:sz w:val="18"/>
               </w:rPr>
-              <w:t xml:space="preserve">Result rows; amounts of the previous answer; passwords, keys, roles, user identifiers</w:t>
-            </w:r>
-          </w:p>
-        </w:tc>
-        <w:tc>
-          <w:tcPr>
-            <w:tcW w:w="2250" w:type="dxa"/>
+              <w:t xml:space="preserve">Result rows; passwords, keys, roles and user identifiers</w:t>
+            </w:r>
+          </w:p>
+        </w:tc>
+        <w:tc>
+          <w:tcPr>
+            <w:tcW w:w="1948" w:type="dxa"/>
           </w:tcPr>
           <w:p>
             <w:pPr>
@@ -6463,7 +6647,7 @@
               <w:rPr>
                 <w:sz w:val="18"/>
               </w:rPr>
-              <w:t xml:space="preserve">Used whenever the dictionary cannot resolve the question</w:t>
+              <w:t xml:space="preserve">Used for questions the backend rules cannot read. Reading plain questions by rules is an optional setting (LOCAL_INTENT_ENABLED, off by default) and is also the fallback when the AI service is unavailable</w:t>
             </w:r>
           </w:p>
         </w:tc>
@@ -6484,13 +6668,13 @@
               <w:rPr>
                 <w:sz w:val="18"/>
               </w:rPr>
-              <w:t xml:space="preserve">SQL proposal (RAG)</w:t>
-            </w:r>
-          </w:p>
-        </w:tc>
-        <w:tc>
-          <w:tcPr>
-            <w:tcW w:w="3900" w:type="dxa"/>
+              <w:t xml:space="preserve">Questions about the data or the previous answer</w:t>
+            </w:r>
+          </w:p>
+        </w:tc>
+        <w:tc>
+          <w:tcPr>
+            <w:tcW w:w="4300" w:type="dxa"/>
           </w:tcPr>
           <w:p>
             <w:pPr>
@@ -6500,13 +6684,13 @@
               <w:rPr>
                 <w:sz w:val="18"/>
               </w:rPr>
-              <w:t xml:space="preserve">The question; the request slots (without period, factory or territory); approved metric definitions; source mappings; table and column names permitted for the role; at most 2 example SQL statements</w:t>
-            </w:r>
-          </w:p>
-        </w:tc>
-        <w:tc>
-          <w:tcPr>
-            <w:tcW w:w="2300" w:type="dxa"/>
+              <w:t xml:space="preserve">The question; approved metadata visible to the user's role (metrics, dimensions and members, data coverage dates, permitted table and column names); a description of the previous answer, including its answer text with figures</w:t>
+            </w:r>
+          </w:p>
+        </w:tc>
+        <w:tc>
+          <w:tcPr>
+            <w:tcW w:w="1700" w:type="dxa"/>
           </w:tcPr>
           <w:p>
             <w:pPr>
@@ -6516,13 +6700,13 @@
               <w:rPr>
                 <w:sz w:val="18"/>
               </w:rPr>
-              <w:t xml:space="preserve">Result rows; the full schema</w:t>
-            </w:r>
-          </w:p>
-        </w:tc>
-        <w:tc>
-          <w:tcPr>
-            <w:tcW w:w="2250" w:type="dxa"/>
+              <w:t xml:space="preserve">Result tables</w:t>
+            </w:r>
+          </w:p>
+        </w:tc>
+        <w:tc>
+          <w:tcPr>
+            <w:tcW w:w="1948" w:type="dxa"/>
           </w:tcPr>
           <w:p>
             <w:pPr>
@@ -6532,7 +6716,7 @@
               <w:rPr>
                 <w:sz w:val="18"/>
               </w:rPr>
-              <w:t xml:space="preserve">EXTERNAL_METADATA_ENABLED</w:t>
+              <w:t xml:space="preserve">Used when AI is enabled</w:t>
             </w:r>
           </w:p>
         </w:tc>
@@ -6553,13 +6737,13 @@
               <w:rPr>
                 <w:sz w:val="18"/>
               </w:rPr>
-              <w:t xml:space="preserve">Chart selection</w:t>
-            </w:r>
-          </w:p>
-        </w:tc>
-        <w:tc>
-          <w:tcPr>
-            <w:tcW w:w="3900" w:type="dxa"/>
+              <w:t xml:space="preserve">SQL proposal (RAG Text-to-SQL)</w:t>
+            </w:r>
+          </w:p>
+        </w:tc>
+        <w:tc>
+          <w:tcPr>
+            <w:tcW w:w="4300" w:type="dxa"/>
           </w:tcPr>
           <w:p>
             <w:pPr>
@@ -6569,13 +6753,13 @@
               <w:rPr>
                 <w:sz w:val="18"/>
               </w:rPr>
-              <w:t xml:space="preserve">The question; the number of rows, column names and column types</w:t>
-            </w:r>
-          </w:p>
-        </w:tc>
-        <w:tc>
-          <w:tcPr>
-            <w:tcW w:w="2300" w:type="dxa"/>
+              <w:t xml:space="preserve">The question; the request slots without dates, factory or territory (growth metrics keep them); approved metric definitions and source mappings; table and column names permitted for the role; at most 2 approved example statements</w:t>
+            </w:r>
+          </w:p>
+        </w:tc>
+        <w:tc>
+          <w:tcPr>
+            <w:tcW w:w="1700" w:type="dxa"/>
           </w:tcPr>
           <w:p>
             <w:pPr>
@@ -6585,13 +6769,13 @@
               <w:rPr>
                 <w:sz w:val="18"/>
               </w:rPr>
-              <w:t xml:space="preserve">Values in the result</w:t>
-            </w:r>
-          </w:p>
-        </w:tc>
-        <w:tc>
-          <w:tcPr>
-            <w:tcW w:w="2250" w:type="dxa"/>
+              <w:t xml:space="preserve">Result rows; the full schema</w:t>
+            </w:r>
+          </w:p>
+        </w:tc>
+        <w:tc>
+          <w:tcPr>
+            <w:tcW w:w="1948" w:type="dxa"/>
           </w:tcPr>
           <w:p>
             <w:pPr>
@@ -6601,7 +6785,7 @@
               <w:rPr>
                 <w:sz w:val="18"/>
               </w:rPr>
-              <w:t xml:space="preserve">EXTERNAL_METADATA_ENABLED</w:t>
+              <w:t xml:space="preserve">EXTERNAL_METADATA_ENABLED, off by default; without it only the standard query builder runs</w:t>
             </w:r>
           </w:p>
         </w:tc>
@@ -6622,13 +6806,13 @@
               <w:rPr>
                 <w:sz w:val="18"/>
               </w:rPr>
-              <w:t xml:space="preserve">AI summary</w:t>
-            </w:r>
-          </w:p>
-        </w:tc>
-        <w:tc>
-          <w:tcPr>
-            <w:tcW w:w="3900" w:type="dxa"/>
+              <w:t xml:space="preserve">Visualization proposal</w:t>
+            </w:r>
+          </w:p>
+        </w:tc>
+        <w:tc>
+          <w:tcPr>
+            <w:tcW w:w="4300" w:type="dxa"/>
           </w:tcPr>
           <w:p>
             <w:pPr>
@@ -6638,13 +6822,13 @@
               <w:rPr>
                 <w:sz w:val="18"/>
               </w:rPr>
-              <w:t xml:space="preserve">Result rows</w:t>
-            </w:r>
-          </w:p>
-        </w:tc>
-        <w:tc>
-          <w:tcPr>
-            <w:tcW w:w="2300" w:type="dxa"/>
+              <w:t xml:space="preserve">Only when the backend rules find no suitable chart: the question, the number of rows, and for each column its kind (numeric, temporal, category), whether it is sorted, its number of distinct values and whether it is complete</w:t>
+            </w:r>
+          </w:p>
+        </w:tc>
+        <w:tc>
+          <w:tcPr>
+            <w:tcW w:w="1700" w:type="dxa"/>
           </w:tcPr>
           <w:p>
             <w:pPr>
@@ -6654,13 +6838,13 @@
               <w:rPr>
                 <w:sz w:val="18"/>
               </w:rPr>
-              <w:t xml:space="preserve">-</w:t>
-            </w:r>
-          </w:p>
-        </w:tc>
-        <w:tc>
-          <w:tcPr>
-            <w:tcW w:w="2250" w:type="dxa"/>
+              <w:t xml:space="preserve">Values in the result</w:t>
+            </w:r>
+          </w:p>
+        </w:tc>
+        <w:tc>
+          <w:tcPr>
+            <w:tcW w:w="1948" w:type="dxa"/>
           </w:tcPr>
           <w:p>
             <w:pPr>
@@ -6670,7 +6854,7 @@
               <w:rPr>
                 <w:sz w:val="18"/>
               </w:rPr>
-              <w:t xml:space="preserve">SEND_RESULTS_TO_LLM and EXTERNAL_RESULTS_ENABLED, off by default</w:t>
+              <w:t xml:space="preserve">EXTERNAL_METADATA_ENABLED; without it results are shown as a table</w:t>
             </w:r>
           </w:p>
         </w:tc>
@@ -6691,13 +6875,13 @@
               <w:rPr>
                 <w:sz w:val="18"/>
               </w:rPr>
-              <w:t xml:space="preserve">Speech-to-text</w:t>
-            </w:r>
-          </w:p>
-        </w:tc>
-        <w:tc>
-          <w:tcPr>
-            <w:tcW w:w="3900" w:type="dxa"/>
+              <w:t xml:space="preserve">AI summary</w:t>
+            </w:r>
+          </w:p>
+        </w:tc>
+        <w:tc>
+          <w:tcPr>
+            <w:tcW w:w="4300" w:type="dxa"/>
           </w:tcPr>
           <w:p>
             <w:pPr>
@@ -6707,13 +6891,13 @@
               <w:rPr>
                 <w:sz w:val="18"/>
               </w:rPr>
-              <w:t xml:space="preserve">The audio recording when the user records a question</w:t>
-            </w:r>
-          </w:p>
-        </w:tc>
-        <w:tc>
-          <w:tcPr>
-            <w:tcW w:w="2300" w:type="dxa"/>
+              <w:t xml:space="preserve">The question and the result rows</w:t>
+            </w:r>
+          </w:p>
+        </w:tc>
+        <w:tc>
+          <w:tcPr>
+            <w:tcW w:w="1700" w:type="dxa"/>
           </w:tcPr>
           <w:p>
             <w:pPr>
@@ -6729,7 +6913,7 @@
         </w:tc>
         <w:tc>
           <w:tcPr>
-            <w:tcW w:w="2250" w:type="dxa"/>
+            <w:tcW w:w="1948" w:type="dxa"/>
           </w:tcPr>
           <w:p>
             <w:pPr>
@@ -6739,17 +6923,81 @@
               <w:rPr>
                 <w:sz w:val="18"/>
               </w:rPr>
+              <w:t xml:space="preserve">SEND_RESULTS_TO_LLM and EXTERNAL_RESULTS_ENABLED, both off by default</w:t>
+            </w:r>
+          </w:p>
+        </w:tc>
+      </w:tr>
+      <w:tr>
+        <w:trPr>
+          <w:jc w:val="center"/>
+        </w:trPr>
+        <w:tc>
+          <w:tcPr>
+            <w:tcW w:w="1700" w:type="dxa"/>
+          </w:tcPr>
+          <w:p>
+            <w:pPr>
+              <w:spacing w:after="0"/>
+            </w:pPr>
+            <w:r>
+              <w:rPr>
+                <w:sz w:val="18"/>
+              </w:rPr>
+              <w:t xml:space="preserve">Speech-to-text</w:t>
+            </w:r>
+          </w:p>
+        </w:tc>
+        <w:tc>
+          <w:tcPr>
+            <w:tcW w:w="4300" w:type="dxa"/>
+          </w:tcPr>
+          <w:p>
+            <w:pPr>
+              <w:spacing w:after="0"/>
+            </w:pPr>
+            <w:r>
+              <w:rPr>
+                <w:sz w:val="18"/>
+              </w:rPr>
+              <w:t xml:space="preserve">The audio recording when the user records a question</w:t>
+            </w:r>
+          </w:p>
+        </w:tc>
+        <w:tc>
+          <w:tcPr>
+            <w:tcW w:w="1700" w:type="dxa"/>
+          </w:tcPr>
+          <w:p>
+            <w:pPr>
+              <w:spacing w:after="0"/>
+            </w:pPr>
+            <w:r>
+              <w:rPr>
+                <w:sz w:val="18"/>
+              </w:rPr>
+              <w:t xml:space="preserve">-</w:t>
+            </w:r>
+          </w:p>
+        </w:tc>
+        <w:tc>
+          <w:tcPr>
+            <w:tcW w:w="1948" w:type="dxa"/>
+          </w:tcPr>
+          <w:p>
+            <w:pPr>
+              <w:spacing w:after="0"/>
+            </w:pPr>
+            <w:r>
+              <w:rPr>
+                <w:sz w:val="18"/>
+              </w:rPr>
               <w:t xml:space="preserve">Requires a speech-service key</w:t>
             </w:r>
           </w:p>
         </w:tc>
       </w:tr>
     </w:tbl>
-    <w:p>
-      <w:r>
-        <w:t xml:space="preserve">Before real company data is used: review each provider's retention and training terms, classify data by sensitivity, mask additional sensitive fields, and run an independent penetration test.</w:t>
-      </w:r>
-    </w:p>
     <w:p/>
     <w:p>
       <w:pPr>
@@ -8247,7 +8495,7 @@
         </w:numPr>
       </w:pPr>
       <w:r>
-        <w:t>Interpret question: External AI Service converts the question into a structured request.</w:t>
+        <w:t xml:space="preserve">Interpret question: External AI Service converts the question into a structured request; the backend reads plain questions by rules when that option is enabled, or when the AI service is unavailable.</w:t>
       </w:r>
     </w:p>
     <w:p>
@@ -8306,42 +8554,30 @@
         <w:t>Save and respond: Result and traceability records are saved; the answer is returned to the user.</w:t>
       </w:r>
     </w:p>
+    <w:p/>
+    <w:p>
+      <w:pPr>
+        <w:pStyle w:val="Heading2"/>
+      </w:pPr>
+      <w:bookmarkStart w:id="21" w:name="_Toc240609482"/>
+      <w:r>
+        <w:t xml:space="preserve">6.2 </w:t>
+      </w:r>
+      <w:r>
+        <w:t>Unauthorized Data Request</w:t>
+      </w:r>
+      <w:bookmarkEnd w:id="21"/>
+    </w:p>
     <w:p>
       <w:r>
         <w:rPr>
           <w:b/>
           <w:bCs/>
         </w:rPr>
-        <w:t xml:space="preserve">Note on step 4:</w:t>
-      </w:r>
-      <w:r>
-        <w:t xml:space="preserve">The standard path resolves clear questions with the business dictionary (metrics, dimensions, periods, factories) and calls the AI service only when the dictionary cannot resolve the question. Both routes produce the same structured request and pass through the same permission check.</w:t>
-      </w:r>
-    </w:p>
-    <w:p/>
-    <w:p>
-      <w:pPr>
-        <w:pStyle w:val="Heading2"/>
-      </w:pPr>
-      <w:bookmarkStart w:id="21" w:name="_Toc240609482"/>
-      <w:r>
-        <w:t xml:space="preserve">6.2 </w:t>
-      </w:r>
-      <w:r>
-        <w:t>Unauthorized Data Request</w:t>
-      </w:r>
-      <w:bookmarkEnd w:id="21"/>
-    </w:p>
-    <w:p>
-      <w:r>
-        <w:rPr>
-          <w:b/>
-          <w:bCs/>
-        </w:rPr>
-        <w:t>Prerequisite:</w:t>
-      </w:r>
-      <w:r>
-        <w:t xml:space="preserve"> The user is authenticated but requests data outside their assigned access scope. This concerns the permission check performed after interpretation — the External AI Service itself never has visibility into the user's specific access rights, only non-sensitive context.</w:t>
+        <w:t xml:space="preserve">Prerequisite:</w:t>
+      </w:r>
+      <w:r>
+        <w:t xml:space="preserve"> The user is authenticated but requests data outside their assigned access scope. The permission check is performed by the backend: the External AI Service never has visibility into the user's specific access rights, only non-sensitive context. The IT Administrator role has no access to business data and is refused right after authentication, before the AI service is called and before any query is built.</w:t>
       </w:r>
     </w:p>
     <w:p/>
@@ -8471,7 +8707,7 @@
         </w:numPr>
       </w:pPr>
       <w:r>
-        <w:t>Verify identity and access scope: Backend authenticates the user.</w:t>
+        <w:t xml:space="preserve">Verify identity and access scope: Backend authenticates the user. An IT Administrator is refused at this point, so the interpretation step does not take place for this role.</w:t>
       </w:r>
     </w:p>
     <w:p>
@@ -8522,18 +8758,6 @@
         <w:t>Respond: User receives an explanation; no SQL is built and no data warehouse query is executed.</w:t>
       </w:r>
     </w:p>
-    <w:p>
-      <w:r>
-        <w:rPr>
-          <w:b/>
-          <w:bCs/>
-        </w:rPr>
-        <w:t xml:space="preserve">Note:</w:t>
-      </w:r>
-      <w:r>
-        <w:t xml:space="preserve">The IT Administrator role is refused at the start of processing, before the AI service is called and before the warehouse is touched; no question from this role reaches interpretation. For other roles the denial happens in the permission check as shown above.</w:t>
-      </w:r>
-    </w:p>
     <w:p/>
     <w:p/>
     <w:p/>
@@ -8548,7 +8772,7 @@
       <w:bookmarkStart w:id="22" w:name="_Toc240609483"/>
       <w:r>
         <w:lastRenderedPageBreak/>
-        <w:t>No Data Found</w:t>
+        <w:t>6.3 No Data Found</w:t>
       </w:r>
       <w:bookmarkEnd w:id="22"/>
     </w:p>
@@ -9340,74 +9564,22 @@
     </w:p>
     <w:p>
       <w:r>
-        <w:t>SQL produced by either the standard query builder or RAG Text-to-SQL passes through a shared validation process. The backend parses the SQL to check permitted operations, tables, columns, and functions, and enforces the user's access scope. User-supplied filter values are passed as query parameters. Approved queries are executed using read-only credentials, with execution time and result-size limits.</w:t>
+        <w:t xml:space="preserve">SQL produced by either the standard query builder or RAG Text-to-SQL passes through a shared validation process. The backend parses the SQL to check permitted operations, tables, columns, and functions, and enforces the user's access scope. User-supplied filter values are passed as query parameters. Approved queries are executed using read-only credentials, with execution time and result-size limits. By default a query is stopped after 15 seconds or the remaining request time, whichever is shorter, and returns at most 100 rows (250 for stacked charts, 400 when grouped by day, week or month); when a result reaches the limit and the user did not ask for a top N, the answer says that only the first rows are shown.</w:t>
       </w:r>
     </w:p>
     <w:p>
       <w:r>
-        <w:t>For example, if a generated query references a restricted table or attempts to modify business data, the backend rejects it before execution. Correctable SQL errors may trigger a limited number of revision attempts, and every revised query must pass validation again. Authorization failures are denied rather than retried through another query path.</w:t>
+        <w:t xml:space="preserve">For example, if a generated query references a restricted table or attempts to modify business data, the backend rejects it before execution. Only a departure from the approved query shape (for example literal dates instead of the bound period, an extra filter or join, or a table outside the metric's approved mapping) or a syntax error is returned to the AI service for correction, at most twice, and every revised query must pass validation again. Security violations (writes, tables or functions outside the role's allowlist, scope violations) are denied and never retried, and authorization failures are not retried through another query path.</w:t>
       </w:r>
     </w:p>
     <w:p>
       <w:r>
-        <w:t>User questions and retrieved content cannot override these controls. SQL validation reduces execution risks but does not guarantee business correctness; queries must also follow the approved definitions described in Section 8.2. Validation of AI-proposed visualization configurations is described in Section 8.5.</w:t>
+        <w:t xml:space="preserve">For generated SQL the backend also wraps each source table in a subquery limited to the user's period and permissions, so the query can only see rows the user may see. The date condition therefore appears in both the scope subquery and the outer query, and both are bound to the resolved period (for growth metrics the scope covers both compared periods). Queries from the standard builder must match the predefined statement exactly and do not need the wrapper.</w:t>
       </w:r>
     </w:p>
     <w:p>
       <w:r>
-        <w:rPr>
-          <w:b/>
-          <w:bCs/>
-        </w:rPr>
-        <w:t xml:space="preserve">Additional behavior of the validation layer:</w:t>
-      </w:r>
-    </w:p>
-    <w:p>
-      <w:pPr>
-        <w:pStyle w:val="ListParagraph"/>
-        <w:numPr>
-          <w:ilvl w:val="0"/>
-          <w:numId w:val="10"/>
-        </w:numPr>
-      </w:pPr>
-      <w:r>
-        <w:t xml:space="preserve">Both query paths share one SQL validation layer and one permission layer. The standard path must also match the exact predefined statement.</w:t>
-      </w:r>
-    </w:p>
-    <w:p>
-      <w:pPr>
-        <w:pStyle w:val="ListParagraph"/>
-        <w:numPr>
-          <w:ilvl w:val="0"/>
-          <w:numId w:val="10"/>
-        </w:numPr>
-      </w:pPr>
-      <w:r>
-        <w:t xml:space="preserve">AI-proposed SQL that departs from the approved shape (literal dates instead of parameters, an extra filter, a table or join that is not permitted) is returned to the AI service for correction, at most 2 times. Security errors (writes, tables or functions outside the allowlist, scope violations) are never retried.</w:t>
-      </w:r>
-    </w:p>
-    <w:p>
-      <w:pPr>
-        <w:pStyle w:val="ListParagraph"/>
-        <w:numPr>
-          <w:ilvl w:val="0"/>
-          <w:numId w:val="10"/>
-        </w:numPr>
-      </w:pPr>
-      <w:r>
-        <w:t xml:space="preserve">The scope layer wraps the source table in a subquery restricted to the user's period and permissions. In the RAG path the date condition therefore appears in both the subquery and the outer query, bound to the same parameters.</w:t>
-      </w:r>
-    </w:p>
-    <w:p>
-      <w:pPr>
-        <w:pStyle w:val="ListParagraph"/>
-        <w:numPr>
-          <w:ilvl w:val="0"/>
-          <w:numId w:val="10"/>
-        </w:numPr>
-      </w:pPr>
-      <w:r>
-        <w:t xml:space="preserve">Row limits: 100 for ordinary lists, 250 for stacked charts, 400 for grouping by day, week or month. When a result reaches the limit and the user did not ask for a top N, the answer states that only the first rows are shown.</w:t>
+        <w:t>User questions and retrieved content cannot override these controls. SQL validation reduces execution risks but does not guarantee business correctness; queries must also follow the approved definitions described in Section 8.2. Validation of AI-proposed visualization configurations is described in Section 8.5.</w:t>
       </w:r>
     </w:p>
     <w:p>
@@ -9540,71 +9712,22 @@
     </w:p>
     <w:p>
       <w:r>
-        <w:rPr>
-          <w:b/>
-          <w:bCs/>
-        </w:rPr>
-        <w:t xml:space="preserve">Additional behavior of conversation handling:</w:t>
+        <w:t xml:space="preserve">Only the six most recent turns are kept as conversational context. Before they are sent to the AI service, formatted amounts and decimal ratios in earlier answers are replaced by a placeholder, so the service can resolve references such as “the top territory” from names and dates without receiving earlier figures.</w:t>
       </w:r>
     </w:p>
     <w:p>
-      <w:pPr>
-        <w:pStyle w:val="ListParagraph"/>
-        <w:numPr>
-          <w:ilvl w:val="0"/>
-          <w:numId w:val="10"/>
-        </w:numPr>
-      </w:pPr>
-      <w:r>
-        <w:t xml:space="preserve">The context sent to the AI service holds at most 6 recent turns. Amounts and ratios of earlier answers are replaced by [number]; names and dates are kept so phrases such as "the top territory" can be resolved.</w:t>
+      <w:r>
+        <w:t xml:space="preserve">The backend checks the reporting period chosen by the AI service against the question. A question that names exactly one year, quarter or month uses that period; a question with no time wording and no earlier period to inherit leads to a clarification request instead of an assumed period. A factory named by the user is always applied as a filter.</w:t>
       </w:r>
     </w:p>
     <w:p>
-      <w:pPr>
-        <w:pStyle w:val="ListParagraph"/>
-        <w:numPr>
-          <w:ilvl w:val="0"/>
-          <w:numId w:val="10"/>
-        </w:numPr>
-      </w:pPr>
-      <w:r>
-        <w:t xml:space="preserve">A period chosen by the AI service is checked against the question: a question that names exactly one year, quarter or month uses it; a question with no time wording and no earlier period to inherit makes the system ask instead of guessing.</w:t>
+      <w:r>
+        <w:t xml:space="preserve">Comparisons of one metric across up to four periods of the same kind are handled by a dedicated component. Each period runs as an ordinary validated query under the same permission checks, and the differences are computed by the backend from the returned rows, not by the AI service. A comparison of named factories is an ordinary grouped query limited to those factories, and the answer states which factories were left out.</w:t>
       </w:r>
     </w:p>
     <w:p>
-      <w:pPr>
-        <w:pStyle w:val="ListParagraph"/>
-        <w:numPr>
-          <w:ilvl w:val="0"/>
-          <w:numId w:val="10"/>
-        </w:numPr>
-      </w:pPr>
-      <w:r>
-        <w:t xml:space="preserve">A factory named by the user is always a filter. Comparing two factories shows only those two and states what was left out.</w:t>
-      </w:r>
-    </w:p>
-    <w:p>
-      <w:pPr>
-        <w:pStyle w:val="ListParagraph"/>
-        <w:numPr>
-          <w:ilvl w:val="0"/>
-          <w:numId w:val="10"/>
-        </w:numPr>
-      </w:pPr>
-      <w:r>
-        <w:t xml:space="preserve">Comparisons (period with period, factory with factory) have their own handler: each side uses the same metric definition and the same permission layer, and differences are computed in code, not by the AI service.</w:t>
-      </w:r>
-    </w:p>
-    <w:p>
-      <w:pPr>
-        <w:pStyle w:val="ListParagraph"/>
-        <w:numPr>
-          <w:ilvl w:val="0"/>
-          <w:numId w:val="10"/>
-        </w:numPr>
-      </w:pPr>
-      <w:r>
-        <w:t xml:space="preserve">A message with several requests is split (by rules, or marked by the AI service), up to 5 requests. Each request runs a full processing pass with its own permission check and is shown as a numbered block. A refused request or one that needs a detail stops only its own block; requests beyond the limit are listed as not performed.</w:t>
+      <w:r>
+        <w:t xml:space="preserve">A message containing several requests is split into separate requests, by backend rules or as marked by the AI service, up to five per message. Each request runs through the full processing flow, including its own permission check, and appears as a numbered block in the answer. A refused request, or one that needs more detail, affects only its own block; requests beyond the limit are listed as not performed.</w:t>
       </w:r>
     </w:p>
     <w:p>
@@ -9619,7 +9742,7 @@
     </w:p>
     <w:p>
       <w:r>
-        <w:t>Both Structured Intent and RAG Text-to-SQL use the same presentation process. After query execution, the backend prepares the results and approved metadata, including column names, data types, units, and reporting periods. The AI proposes a visualization configuration based on this information and the user's question. Supported outputs include bar, line, pie/donut, stacked bar, and scatter charts, as well as tables and KPI cards.</w:t>
+        <w:t xml:space="preserve">Both Structured Intent and RAG Text-to-SQL use the same presentation process. After query execution, the backend prepares the results and approved metadata, including column names, data types, units, and reporting periods. The backend first applies deterministic rules to the shape of the result: a single value becomes a KPI card, a date axis a line chart, two groupings stacked bars, and a small whole a pie or donut chart; other results use bars. Only when no rule fits does the AI propose a visualization configuration based on this information and the user’s question. Supported outputs include bar, line, pie/donut, stacked bar, and scatter charts, as well as tables and KPI cards.</w:t>
       </w:r>
     </w:p>
     <w:p>
@@ -9942,7 +10065,7 @@
     <w:p/>
     <w:p>
       <w:r>
-        <w:t>External AI calls use server-side credentials and include only information permitted by company policy. Each call has a timeout, and temporary failures may be retried with a delay. Both retries and SQL-correction attempts are constrained by an overall request budget to prevent indefinite processing.</w:t>
+        <w:t xml:space="preserve">External AI calls use server-side credentials and include only information permitted by company policy. Each call has a timeout, and temporary failures may be retried with a delay. Both retries and SQL-correction attempts are constrained by an overall request budget to prevent indefinite processing; by default the budget is 30 seconds and four AI calls. When a provider reports that a rate limit has been reached (HTTP 429, or 403 mentioning a limit) or that it is overloaded (5xx), the user is told that the AI service is busy and should retry later, and no partial or guessed answer is returned. While the AI service is unavailable, plain questions and short follow-ups that backend rules can read are still answered.</w:t>
       </w:r>
     </w:p>
     <w:p>
@@ -9951,11 +10074,6 @@
       </w:r>
       <w:r>
         <w:t>.</w:t>
-      </w:r>
-    </w:p>
-    <w:p>
-      <w:r>
-        <w:t xml:space="preserve">When a provider returns a rate-limit code (429, or 403 mentioning a limit) or is overloaded (5xx), the user is told that the AI service is busy and to retry later; a wrong or partial result is never returned. Questions the business dictionary resolves do not depend on the AI quota.</w:t>
       </w:r>
     </w:p>
     <w:p>
@@ -10057,10 +10175,10 @@
           <w:b/>
           <w:bCs/>
         </w:rPr>
-        <w:t>Decision:</w:t>
-      </w:r>
-      <w:r>
-        <w:t xml:space="preserve"> Use a pretrained LLM through an external API. Only company-approved information is transmitted, and API credentials remain on the server. This reduces model-hosting responsibilities but introduces provider dependency, network requirements, and usage costs.</w:t>
+        <w:t xml:space="preserve">Decision:</w:t>
+      </w:r>
+      <w:r>
+        <w:t xml:space="preserve"> Use a pretrained LLM through an external API. Only company-approved information is transmitted, and API credentials remain on the server. This reduces model-hosting responsibilities but introduces provider dependency, network requirements, and usage costs. The AI calls sit behind one interface in the AI Integration module: providers whose API follows the OpenAI chat-completions format need only configuration, other providers may need an adapter. Production is intended to use one paid provider; hosting a model offline on a dedicated server remains the alternative, and Appendix B compares the cost of both. During the demonstration period several free providers and keys are rotated to avoid cost; this is a temporary arrangement that is removed when a paid plan is adopted.</w:t>
       </w:r>
     </w:p>
     <w:p>
@@ -10076,18 +10194,6 @@
       </w:r>
     </w:p>
     <w:p>
-      <w:r>
-        <w:rPr>
-          <w:b/>
-          <w:bCs/>
-        </w:rPr>
-        <w:t xml:space="preserve">Note (v1.1):</w:t>
-      </w:r>
-      <w:r>
-        <w:t xml:space="preserve">Provider operation: in production, ACBI uses one paid AI provider (for example the Claude API) or a model hosted offline on a dedicated server, chosen with the estimate in Appendix B. The AI calls sit behind one interface, so changing provider is a configuration change. Rotating several free providers and keys is only a temporary arrangement for the demonstration period, to avoid cost; it is not part of the long-term design and is removed when a paid plan is adopted.</w:t>
-      </w:r>
-    </w:p>
-    <w:p>
       <w:pPr>
         <w:pStyle w:val="Heading2"/>
       </w:pPr>
@@ -10174,10 +10280,10 @@
           <w:b/>
           <w:bCs/>
         </w:rPr>
-        <w:t>Decision:</w:t>
-      </w:r>
-      <w:r>
-        <w:t xml:space="preserve"> Let the AI propose the visualization type and column mappings. The backend validates the configuration, and the frontend renders it using actual query results. Invalid proposals may be corrected within a limited number of attempts; otherwise, results are displayed as a table.</w:t>
+        <w:t xml:space="preserve">Decision:</w:t>
+      </w:r>
+      <w:r>
+        <w:t xml:space="preserve"> Choose the visualization by backend rules for common result shapes, and let the AI propose the visualization type and column mappings when no rule fits. The backend validates the configuration, and the frontend renders it using actual query results. Invalid proposals may be corrected within a limited number of attempts; otherwise, results are displayed as a table.</w:t>
       </w:r>
     </w:p>
     <w:p>
@@ -10186,10 +10292,10 @@
           <w:b/>
           <w:bCs/>
         </w:rPr>
-        <w:t>Alternatives:</w:t>
-      </w:r>
-      <w:r>
-        <w:t xml:space="preserve"> Select all visualizations through backend rules, or require users to choose a chart type. Backend rules are more predictable, while manual selection requires additional user interaction.</w:t>
+        <w:t xml:space="preserve">Alternatives:</w:t>
+      </w:r>
+      <w:r>
+        <w:t xml:space="preserve"> Select all visualizations through backend rules only, or require users to choose a chart type. Backend rules are more predictable, while manual selection requires additional user interaction.</w:t>
       </w:r>
     </w:p>
     <w:p>
@@ -10988,22 +11094,10 @@
           <w:b/>
           <w:bCs/>
         </w:rPr>
-        <w:t>Mitigation:</w:t>
-      </w:r>
-      <w:r>
-        <w:t xml:space="preserve"> Enforce access scope in the backend and use restricted, read-only database credentials. Check current permissions when accessing stored results and limit external AI requests to company-approved content. Test unauthorized-access scenarios across both query paths.</w:t>
-      </w:r>
-    </w:p>
-    <w:p>
-      <w:r>
-        <w:rPr>
-          <w:b/>
-          <w:bCs/>
-        </w:rPr>
-        <w:t xml:space="preserve">Additional mitigation:</w:t>
-      </w:r>
-      <w:r>
-        <w:t xml:space="preserve">Send only the question and metric descriptions, replace amounts in conversation context, and keep the table in Section 3.2 up to date. Before real data is used, review provider retention terms, classify data and run an independent penetration test.</w:t>
+        <w:t xml:space="preserve">Mitigation:</w:t>
+      </w:r>
+      <w:r>
+        <w:t xml:space="preserve"> Enforce access scope in the backend and use restricted, read-only database credentials. Check current permissions when accessing stored results and limit external AI requests to company-approved content. Test unauthorized-access scenarios across both query paths. The content of each external call is listed in Section 3.2 and must be kept up to date. Before real company data is used, each provider’s retention and training terms are reviewed, data is classified by sensitivity, and an independent penetration test is performed.</w:t>
       </w:r>
     </w:p>
     <w:p>
@@ -11037,22 +11131,10 @@
           <w:b/>
           <w:bCs/>
         </w:rPr>
-        <w:t>Mitigation:</w:t>
-      </w:r>
-      <w:r>
-        <w:t xml:space="preserve"> Apply timeouts, bounded retries, and an overall request deadline. Monitor latency and usage, limit transmitted context, and return a clear failure message when processing cannot complete. If only chart generation or optional summarization fails, present the validated query results as a table.</w:t>
-      </w:r>
-    </w:p>
-    <w:p>
-      <w:r>
-        <w:rPr>
-          <w:b/>
-          <w:bCs/>
-        </w:rPr>
-        <w:t xml:space="preserve">Additional mitigation:</w:t>
-      </w:r>
-      <w:r>
-        <w:t xml:space="preserve">Free-tier quotas limit concurrent use; use a paid plan or an offline model in production and keep the clear "AI busy" response.</w:t>
+        <w:t xml:space="preserve">Mitigation:</w:t>
+      </w:r>
+      <w:r>
+        <w:t xml:space="preserve"> Apply timeouts, bounded retries, and an overall request deadline. Monitor latency and usage, limit transmitted context, and return a clear failure message when processing cannot complete. If only chart generation or optional summarization fails, present the validated query results as a table. Free-tier quotas limit concurrent use, so production relies on a paid plan or an offline model (Section 9.2).</w:t>
       </w:r>
     </w:p>
     <w:p>
@@ -12201,25 +12283,25 @@
           <w:b/>
           <w:bCs/>
         </w:rPr>
-        <w:t xml:space="preserve">Indicative AI Cost (October 2026 prices)</w:t>
+        <w:t xml:space="preserve">Indicative AI Cost</w:t>
       </w:r>
     </w:p>
     <w:p>
       <w:r>
-        <w:t xml:space="preserve">Estimate for the AI service only. Worst case: every question calls the AI service. Prices and token counts must be confirmed before a decision.</w:t>
+        <w:t xml:space="preserve">An indicative estimate for the AI service alone, at October 2026 prices. It assumes the worst case, in which every question calls the AI service for interpretation, SQL proposal and chart selection; it leaves out SQL correction attempts, summaries and replies about the data. Prices and token counts must be confirmed before a decision, and the Claude options have not yet been run against the project test set.</w:t>
       </w:r>
     </w:p>
     <w:tbl>
       <w:tblPr>
         <w:tblStyle w:val="TableGrid"/>
-        <w:tblW w:w="10150" w:type="dxa"/>
+        <w:tblW w:w="9648" w:type="dxa"/>
         <w:jc w:val="center"/>
         <w:tblLook w:val="04A0" w:firstRow="1" w:lastRow="0" w:firstColumn="1" w:lastColumn="0" w:noHBand="0" w:noVBand="1"/>
       </w:tblPr>
       <w:tblGrid>
         <w:gridCol w:w="2600"/>
         <w:gridCol w:w="3900"/>
-        <w:gridCol w:w="3650"/>
+        <w:gridCol w:w="3148"/>
       </w:tblGrid>
       <w:tr>
         <w:trPr>
@@ -12266,7 +12348,7 @@
         </w:tc>
         <w:tc>
           <w:tcPr>
-            <w:tcW w:w="3650" w:type="dxa"/>
+            <w:tcW w:w="3148" w:type="dxa"/>
             <w:shd w:val="clear" w:color="auto" w:fill="D9EAF7"/>
           </w:tcPr>
           <w:p>
@@ -12322,7 +12404,7 @@
         </w:tc>
         <w:tc>
           <w:tcPr>
-            <w:tcW w:w="3650" w:type="dxa"/>
+            <w:tcW w:w="3148" w:type="dxa"/>
           </w:tcPr>
           <w:p>
             <w:pPr>
@@ -12375,7 +12457,7 @@
         </w:tc>
         <w:tc>
           <w:tcPr>
-            <w:tcW w:w="3650" w:type="dxa"/>
+            <w:tcW w:w="3148" w:type="dxa"/>
           </w:tcPr>
           <w:p>
             <w:pPr>
@@ -12428,7 +12510,7 @@
         </w:tc>
         <w:tc>
           <w:tcPr>
-            <w:tcW w:w="3650" w:type="dxa"/>
+            <w:tcW w:w="3148" w:type="dxa"/>
           </w:tcPr>
           <w:p>
             <w:pPr>
@@ -12459,7 +12541,7 @@
               <w:rPr>
                 <w:sz w:val="18"/>
               </w:rPr>
-              <w:t xml:space="preserve">Break-even</w:t>
+              <w:t xml:space="preserve">Break-even between the API and the server</w:t>
             </w:r>
           </w:p>
         </w:tc>
@@ -12475,13 +12557,13 @@
               <w:rPr>
                 <w:sz w:val="18"/>
               </w:rPr>
-              <w:t xml:space="preserve">About 250,000 questions per month</w:t>
-            </w:r>
-          </w:p>
-        </w:tc>
-        <w:tc>
-          <w:tcPr>
-            <w:tcW w:w="3650" w:type="dxa"/>
+              <w:t xml:space="preserve">About 250,000 questions per month at USD 200, about 630,000 at USD 500</w:t>
+            </w:r>
+          </w:p>
+        </w:tc>
+        <w:tc>
+          <w:tcPr>
+            <w:tcW w:w="3148" w:type="dxa"/>
           </w:tcPr>
           <w:p>
             <w:pPr>
@@ -12499,7 +12581,7 @@
     </w:tbl>
     <w:p>
       <w:r>
-        <w:t xml:space="preserve">Operating staff cost: [not yet estimated, to be completed].</w:t>
+        <w:t xml:space="preserve">Operating staff cost is not yet estimated and is to be completed.</w:t>
       </w:r>
     </w:p>
     <w:sectPr>

</xml_diff>

<commit_message>
Split the v1.1 revision history into periods up to now
</commit_message>
<xml_diff>
--- a/docs/ACBI_Technical_Solution_Proposal_v1.1.docx
+++ b/docs/ACBI_Technical_Solution_Proposal_v1.1.docx
@@ -266,6 +266,11 @@
         <w:t xml:space="preserve">Revision History</w:t>
       </w:r>
     </w:p>
+    <w:p>
+      <w:r>
+        <w:t xml:space="preserve">Version 1.1 consolidates the changes made to the prototype and to this document since version 1.0, listed here by period.</w:t>
+      </w:r>
+    </w:p>
     <w:tbl>
       <w:tblPr>
         <w:tblStyle w:val="TableGrid"/>
@@ -274,9 +279,9 @@
         <w:tblLook w:val="04A0" w:firstRow="1" w:lastRow="0" w:firstColumn="1" w:lastColumn="0" w:noHBand="0" w:noVBand="1"/>
       </w:tblPr>
       <w:tblGrid>
-        <w:gridCol w:w="1100"/>
-        <w:gridCol w:w="1400"/>
-        <w:gridCol w:w="7148"/>
+        <w:gridCol w:w="900"/>
+        <w:gridCol w:w="1900"/>
+        <w:gridCol w:w="6848"/>
       </w:tblGrid>
       <w:tr>
         <w:trPr>
@@ -285,7 +290,7 @@
         </w:trPr>
         <w:tc>
           <w:tcPr>
-            <w:tcW w:w="1100" w:type="dxa"/>
+            <w:tcW w:w="900" w:type="dxa"/>
             <w:shd w:val="clear" w:color="auto" w:fill="D9EAF7"/>
           </w:tcPr>
           <w:p>
@@ -304,7 +309,7 @@
         </w:tc>
         <w:tc>
           <w:tcPr>
-            <w:tcW w:w="1400" w:type="dxa"/>
+            <w:tcW w:w="1900" w:type="dxa"/>
             <w:shd w:val="clear" w:color="auto" w:fill="D9EAF7"/>
           </w:tcPr>
           <w:p>
@@ -317,13 +322,13 @@
                 <w:bCs/>
                 <w:sz w:val="20"/>
               </w:rPr>
-              <w:t xml:space="preserve">Date</w:t>
-            </w:r>
-          </w:p>
-        </w:tc>
-        <w:tc>
-          <w:tcPr>
-            <w:tcW w:w="7148" w:type="dxa"/>
+              <w:t xml:space="preserve">Period</w:t>
+            </w:r>
+          </w:p>
+        </w:tc>
+        <w:tc>
+          <w:tcPr>
+            <w:tcW w:w="6848" w:type="dxa"/>
             <w:shd w:val="clear" w:color="auto" w:fill="D9EAF7"/>
           </w:tcPr>
           <w:p>
@@ -347,7 +352,7 @@
         </w:trPr>
         <w:tc>
           <w:tcPr>
-            <w:tcW w:w="1100" w:type="dxa"/>
+            <w:tcW w:w="900" w:type="dxa"/>
           </w:tcPr>
           <w:p>
             <w:pPr>
@@ -363,7 +368,7 @@
         </w:tc>
         <w:tc>
           <w:tcPr>
-            <w:tcW w:w="1400" w:type="dxa"/>
+            <w:tcW w:w="1900" w:type="dxa"/>
           </w:tcPr>
           <w:p>
             <w:pPr>
@@ -379,7 +384,7 @@
         </w:tc>
         <w:tc>
           <w:tcPr>
-            <w:tcW w:w="7148" w:type="dxa"/>
+            <w:tcW w:w="6848" w:type="dxa"/>
           </w:tcPr>
           <w:p>
             <w:pPr>
@@ -400,7 +405,7 @@
         </w:trPr>
         <w:tc>
           <w:tcPr>
-            <w:tcW w:w="1100" w:type="dxa"/>
+            <w:tcW w:w="900" w:type="dxa"/>
           </w:tcPr>
           <w:p>
             <w:pPr>
@@ -416,7 +421,7 @@
         </w:tc>
         <w:tc>
           <w:tcPr>
-            <w:tcW w:w="1400" w:type="dxa"/>
+            <w:tcW w:w="1900" w:type="dxa"/>
           </w:tcPr>
           <w:p>
             <w:pPr>
@@ -426,13 +431,13 @@
               <w:rPr>
                 <w:sz w:val="18"/>
               </w:rPr>
-              <w:t xml:space="preserve">14/10/2026</w:t>
-            </w:r>
-          </w:p>
-        </w:tc>
-        <w:tc>
-          <w:tcPr>
-            <w:tcW w:w="7148" w:type="dxa"/>
+              <w:t xml:space="preserve">20/9 to 21/9/2026</w:t>
+            </w:r>
+          </w:p>
+        </w:tc>
+        <w:tc>
+          <w:tcPr>
+            <w:tcW w:w="6848" w:type="dxa"/>
           </w:tcPr>
           <w:p>
             <w:pPr>
@@ -442,7 +447,219 @@
               <w:rPr>
                 <w:sz w:val="18"/>
               </w:rPr>
-              <w:t xml:space="preserve">Aligned with the implemented prototype: data sent to external services (3.2); processing order and refusal of the IT Administrator role (6.1, 6.2); SQL validation limits and correction (8.3); conversation handling, comparisons and multi-request messages (8.4); visualization selection (8.5, 9.4); AI availability and provider operation (8.6, 9.2); additional mitigations (11.2, 11.3); indicative AI cost (Appendix B). Spelling and heading corrections.</w:t>
+              <w:t xml:space="preserve">Prototype built to the module layout of Section 5.2: standard query builder and RAG Text-to-SQL paths with shared SQL validation, all eight chart types, vocabulary driven by the business dictionary, grounded answers about the data, additional AI providers with key failover, and optional local reading of plain questions (Sections 5.2, 8.2, 8.5, 9.2).</w:t>
+            </w:r>
+          </w:p>
+        </w:tc>
+      </w:tr>
+      <w:tr>
+        <w:trPr>
+          <w:jc w:val="center"/>
+        </w:trPr>
+        <w:tc>
+          <w:tcPr>
+            <w:tcW w:w="900" w:type="dxa"/>
+          </w:tcPr>
+          <w:p>
+            <w:pPr>
+              <w:spacing w:after="0"/>
+            </w:pPr>
+            <w:r>
+              <w:rPr>
+                <w:sz w:val="18"/>
+              </w:rPr>
+              <w:t xml:space="preserve">1.1</w:t>
+            </w:r>
+          </w:p>
+        </w:tc>
+        <w:tc>
+          <w:tcPr>
+            <w:tcW w:w="1900" w:type="dxa"/>
+          </w:tcPr>
+          <w:p>
+            <w:pPr>
+              <w:spacing w:after="0"/>
+            </w:pPr>
+            <w:r>
+              <w:rPr>
+                <w:sz w:val="18"/>
+              </w:rPr>
+              <w:t xml:space="preserve">23/9 to 28/9/2026</w:t>
+            </w:r>
+          </w:p>
+        </w:tc>
+        <w:tc>
+          <w:tcPr>
+            <w:tcW w:w="6848" w:type="dxa"/>
+          </w:tcPr>
+          <w:p>
+            <w:pPr>
+              <w:spacing w:after="0"/>
+            </w:pPr>
+            <w:r>
+              <w:rPr>
+                <w:sz w:val="18"/>
+              </w:rPr>
+              <w:t xml:space="preserve">Comparisons across named periods; several requests in one message; follow-up questions resolved from conversation context, also when the AI service is unavailable; hardening against vague, misleading or unsupported questions (Sections 6.4, 8.3, 8.4).</w:t>
+            </w:r>
+          </w:p>
+        </w:tc>
+      </w:tr>
+      <w:tr>
+        <w:trPr>
+          <w:jc w:val="center"/>
+        </w:trPr>
+        <w:tc>
+          <w:tcPr>
+            <w:tcW w:w="900" w:type="dxa"/>
+          </w:tcPr>
+          <w:p>
+            <w:pPr>
+              <w:spacing w:after="0"/>
+            </w:pPr>
+            <w:r>
+              <w:rPr>
+                <w:sz w:val="18"/>
+              </w:rPr>
+              <w:t xml:space="preserve">1.1</w:t>
+            </w:r>
+          </w:p>
+        </w:tc>
+        <w:tc>
+          <w:tcPr>
+            <w:tcW w:w="1900" w:type="dxa"/>
+          </w:tcPr>
+          <w:p>
+            <w:pPr>
+              <w:spacing w:after="0"/>
+            </w:pPr>
+            <w:r>
+              <w:rPr>
+                <w:sz w:val="18"/>
+              </w:rPr>
+              <w:t xml:space="preserve">1/10 to 10/10/2026</w:t>
+            </w:r>
+          </w:p>
+        </w:tc>
+        <w:tc>
+          <w:tcPr>
+            <w:tcW w:w="6848" w:type="dxa"/>
+          </w:tcPr>
+          <w:p>
+            <w:pPr>
+              <w:spacing w:after="0"/>
+            </w:pPr>
+            <w:r>
+              <w:rPr>
+                <w:sz w:val="18"/>
+              </w:rPr>
+              <w:t xml:space="preserve">AI provider limits reported as a busy service instead of a failure; correction of RAG SQL that departs from the approved shape; row limits with a notice when a list is cut; checks of the reporting period against the question; a named factory always applied as a filter; comparison of named factories (Sections 8.3, 8.4, 8.6).</w:t>
+            </w:r>
+          </w:p>
+        </w:tc>
+      </w:tr>
+      <w:tr>
+        <w:trPr>
+          <w:jc w:val="center"/>
+        </w:trPr>
+        <w:tc>
+          <w:tcPr>
+            <w:tcW w:w="900" w:type="dxa"/>
+          </w:tcPr>
+          <w:p>
+            <w:pPr>
+              <w:spacing w:after="0"/>
+            </w:pPr>
+            <w:r>
+              <w:rPr>
+                <w:sz w:val="18"/>
+              </w:rPr>
+              <w:t xml:space="preserve">1.1</w:t>
+            </w:r>
+          </w:p>
+        </w:tc>
+        <w:tc>
+          <w:tcPr>
+            <w:tcW w:w="1900" w:type="dxa"/>
+          </w:tcPr>
+          <w:p>
+            <w:pPr>
+              <w:spacing w:after="0"/>
+            </w:pPr>
+            <w:r>
+              <w:rPr>
+                <w:sz w:val="18"/>
+              </w:rPr>
+              <w:t xml:space="preserve">13/10/2026</w:t>
+            </w:r>
+          </w:p>
+        </w:tc>
+        <w:tc>
+          <w:tcPr>
+            <w:tcW w:w="6848" w:type="dxa"/>
+          </w:tcPr>
+          <w:p>
+            <w:pPr>
+              <w:spacing w:after="0"/>
+            </w:pPr>
+            <w:r>
+              <w:rPr>
+                <w:sz w:val="18"/>
+              </w:rPr>
+              <w:t xml:space="preserve">Amounts of earlier answers kept out of the context sent to the AI service; independent verification of every answered table against the warehouse; test report on the standard test-case template; data-sent table and cost estimate prepared (Sections 3.2, 11.2, Appendix B).</w:t>
+            </w:r>
+          </w:p>
+        </w:tc>
+      </w:tr>
+      <w:tr>
+        <w:trPr>
+          <w:jc w:val="center"/>
+        </w:trPr>
+        <w:tc>
+          <w:tcPr>
+            <w:tcW w:w="900" w:type="dxa"/>
+          </w:tcPr>
+          <w:p>
+            <w:pPr>
+              <w:spacing w:after="0"/>
+            </w:pPr>
+            <w:r>
+              <w:rPr>
+                <w:sz w:val="18"/>
+              </w:rPr>
+              <w:t xml:space="preserve">1.1</w:t>
+            </w:r>
+          </w:p>
+        </w:tc>
+        <w:tc>
+          <w:tcPr>
+            <w:tcW w:w="1900" w:type="dxa"/>
+          </w:tcPr>
+          <w:p>
+            <w:pPr>
+              <w:spacing w:after="0"/>
+            </w:pPr>
+            <w:r>
+              <w:rPr>
+                <w:sz w:val="18"/>
+              </w:rPr>
+              <w:t xml:space="preserve">14/10/2026</w:t>
+            </w:r>
+          </w:p>
+        </w:tc>
+        <w:tc>
+          <w:tcPr>
+            <w:tcW w:w="6848" w:type="dxa"/>
+          </w:tcPr>
+          <w:p>
+            <w:pPr>
+              <w:spacing w:after="0"/>
+            </w:pPr>
+            <w:r>
+              <w:rPr>
+                <w:sz w:val="18"/>
+              </w:rPr>
+              <w:t xml:space="preserve">This document revised against the implementation after an independent review: Sections 3.2, 6.1, 6.2, 8.3 to 8.6, 9.2, 9.4, 11.2, 11.3 and Appendix B; spelling and heading corrections.</w:t>
             </w:r>
           </w:p>
         </w:tc>

</xml_diff>

<commit_message>
Split the v1.1 revision history by day and by section
</commit_message>
<xml_diff>
--- a/docs/ACBI_Technical_Solution_Proposal_v1.1.docx
+++ b/docs/ACBI_Technical_Solution_Proposal_v1.1.docx
@@ -268,7 +268,7 @@
     </w:p>
     <w:p>
       <w:r>
-        <w:t xml:space="preserve">Version 1.1 consolidates the changes made to the prototype and to this document since version 1.0, listed here by period.</w:t>
+        <w:t xml:space="preserve">Version 1.1 describes the prototype as of 14/10/2026. The table lists, day by day, when each behavior now described in this document entered the prototype; the document itself was revised on 14/10/2026.</w:t>
       </w:r>
     </w:p>
     <w:tbl>
@@ -279,9 +279,10 @@
         <w:tblLook w:val="04A0" w:firstRow="1" w:lastRow="0" w:firstColumn="1" w:lastColumn="0" w:noHBand="0" w:noVBand="1"/>
       </w:tblPr>
       <w:tblGrid>
-        <w:gridCol w:w="900"/>
-        <w:gridCol w:w="1900"/>
-        <w:gridCol w:w="6848"/>
+        <w:gridCol w:w="800"/>
+        <w:gridCol w:w="1250"/>
+        <w:gridCol w:w="1700"/>
+        <w:gridCol w:w="5898"/>
       </w:tblGrid>
       <w:tr>
         <w:trPr>
@@ -290,7 +291,7 @@
         </w:trPr>
         <w:tc>
           <w:tcPr>
-            <w:tcW w:w="900" w:type="dxa"/>
+            <w:tcW w:w="800" w:type="dxa"/>
             <w:shd w:val="clear" w:color="auto" w:fill="D9EAF7"/>
           </w:tcPr>
           <w:p>
@@ -309,7 +310,7 @@
         </w:tc>
         <w:tc>
           <w:tcPr>
-            <w:tcW w:w="1900" w:type="dxa"/>
+            <w:tcW w:w="1250" w:type="dxa"/>
             <w:shd w:val="clear" w:color="auto" w:fill="D9EAF7"/>
           </w:tcPr>
           <w:p>
@@ -322,13 +323,13 @@
                 <w:bCs/>
                 <w:sz w:val="20"/>
               </w:rPr>
-              <w:t xml:space="preserve">Period</w:t>
-            </w:r>
-          </w:p>
-        </w:tc>
-        <w:tc>
-          <w:tcPr>
-            <w:tcW w:w="6848" w:type="dxa"/>
+              <w:t xml:space="preserve">Date</w:t>
+            </w:r>
+          </w:p>
+        </w:tc>
+        <w:tc>
+          <w:tcPr>
+            <w:tcW w:w="1700" w:type="dxa"/>
             <w:shd w:val="clear" w:color="auto" w:fill="D9EAF7"/>
           </w:tcPr>
           <w:p>
@@ -341,7 +342,26 @@
                 <w:bCs/>
                 <w:sz w:val="20"/>
               </w:rPr>
-              <w:t xml:space="preserve">Changes</w:t>
+              <w:t xml:space="preserve">Sections</w:t>
+            </w:r>
+          </w:p>
+        </w:tc>
+        <w:tc>
+          <w:tcPr>
+            <w:tcW w:w="5898" w:type="dxa"/>
+            <w:shd w:val="clear" w:color="auto" w:fill="D9EAF7"/>
+          </w:tcPr>
+          <w:p>
+            <w:pPr>
+              <w:spacing w:after="0"/>
+            </w:pPr>
+            <w:r>
+              <w:rPr>
+                <w:b/>
+                <w:bCs/>
+                <w:sz w:val="20"/>
+              </w:rPr>
+              <w:t xml:space="preserve">Change</w:t>
             </w:r>
           </w:p>
         </w:tc>
@@ -352,7 +372,7 @@
         </w:trPr>
         <w:tc>
           <w:tcPr>
-            <w:tcW w:w="900" w:type="dxa"/>
+            <w:tcW w:w="800" w:type="dxa"/>
           </w:tcPr>
           <w:p>
             <w:pPr>
@@ -368,7 +388,7 @@
         </w:tc>
         <w:tc>
           <w:tcPr>
-            <w:tcW w:w="1900" w:type="dxa"/>
+            <w:tcW w:w="1250" w:type="dxa"/>
           </w:tcPr>
           <w:p>
             <w:pPr>
@@ -384,7 +404,23 @@
         </w:tc>
         <w:tc>
           <w:tcPr>
-            <w:tcW w:w="6848" w:type="dxa"/>
+            <w:tcW w:w="1700" w:type="dxa"/>
+          </w:tcPr>
+          <w:p>
+            <w:pPr>
+              <w:spacing w:after="0"/>
+            </w:pPr>
+            <w:r>
+              <w:rPr>
+                <w:sz w:val="18"/>
+              </w:rPr>
+              <w:t xml:space="preserve">All</w:t>
+            </w:r>
+          </w:p>
+        </w:tc>
+        <w:tc>
+          <w:tcPr>
+            <w:tcW w:w="5898" w:type="dxa"/>
           </w:tcPr>
           <w:p>
             <w:pPr>
@@ -405,7 +441,7 @@
         </w:trPr>
         <w:tc>
           <w:tcPr>
-            <w:tcW w:w="900" w:type="dxa"/>
+            <w:tcW w:w="800" w:type="dxa"/>
           </w:tcPr>
           <w:p>
             <w:pPr>
@@ -421,7 +457,7 @@
         </w:tc>
         <w:tc>
           <w:tcPr>
-            <w:tcW w:w="1900" w:type="dxa"/>
+            <w:tcW w:w="1250" w:type="dxa"/>
           </w:tcPr>
           <w:p>
             <w:pPr>
@@ -431,13 +467,13 @@
               <w:rPr>
                 <w:sz w:val="18"/>
               </w:rPr>
-              <w:t xml:space="preserve">20/9 to 21/9/2026</w:t>
-            </w:r>
-          </w:p>
-        </w:tc>
-        <w:tc>
-          <w:tcPr>
-            <w:tcW w:w="6848" w:type="dxa"/>
+              <w:t xml:space="preserve">20/9/2026</w:t>
+            </w:r>
+          </w:p>
+        </w:tc>
+        <w:tc>
+          <w:tcPr>
+            <w:tcW w:w="1700" w:type="dxa"/>
           </w:tcPr>
           <w:p>
             <w:pPr>
@@ -447,7 +483,23 @@
               <w:rPr>
                 <w:sz w:val="18"/>
               </w:rPr>
-              <w:t xml:space="preserve">Prototype built to the module layout of Section 5.2: standard query builder and RAG Text-to-SQL paths with shared SQL validation, all eight chart types, vocabulary driven by the business dictionary, grounded answers about the data, additional AI providers with key failover, and optional local reading of plain questions (Sections 5.2, 8.2, 8.5, 9.2).</w:t>
+              <w:t xml:space="preserve">3.2, 6.2, 8.3</w:t>
+            </w:r>
+          </w:p>
+        </w:tc>
+        <w:tc>
+          <w:tcPr>
+            <w:tcW w:w="5898" w:type="dxa"/>
+          </w:tcPr>
+          <w:p>
+            <w:pPr>
+              <w:spacing w:after="0"/>
+            </w:pPr>
+            <w:r>
+              <w:rPr>
+                <w:sz w:val="18"/>
+              </w:rPr>
+              <w:t xml:space="preserve">Scope subquery around generated SQL and exact match of standard-path queries to the predefined statement (8.3); SQL proposals only when approved metadata may be sent, with the setting EXTERNAL_METADATA_ENABLED (3.2); IT Administrator role refused before the AI service is called (6.2).</w:t>
             </w:r>
           </w:p>
         </w:tc>
@@ -458,7 +510,7 @@
         </w:trPr>
         <w:tc>
           <w:tcPr>
-            <w:tcW w:w="900" w:type="dxa"/>
+            <w:tcW w:w="800" w:type="dxa"/>
           </w:tcPr>
           <w:p>
             <w:pPr>
@@ -474,7 +526,7 @@
         </w:tc>
         <w:tc>
           <w:tcPr>
-            <w:tcW w:w="1900" w:type="dxa"/>
+            <w:tcW w:w="1250" w:type="dxa"/>
           </w:tcPr>
           <w:p>
             <w:pPr>
@@ -484,13 +536,13 @@
               <w:rPr>
                 <w:sz w:val="18"/>
               </w:rPr>
-              <w:t xml:space="preserve">23/9 to 28/9/2026</w:t>
-            </w:r>
-          </w:p>
-        </w:tc>
-        <w:tc>
-          <w:tcPr>
-            <w:tcW w:w="6848" w:type="dxa"/>
+              <w:t xml:space="preserve">21/9/2026</w:t>
+            </w:r>
+          </w:p>
+        </w:tc>
+        <w:tc>
+          <w:tcPr>
+            <w:tcW w:w="1700" w:type="dxa"/>
           </w:tcPr>
           <w:p>
             <w:pPr>
@@ -500,7 +552,23 @@
               <w:rPr>
                 <w:sz w:val="18"/>
               </w:rPr>
-              <w:t xml:space="preserve">Comparisons across named periods; several requests in one message; follow-up questions resolved from conversation context, also when the AI service is unavailable; hardening against vague, misleading or unsupported questions (Sections 6.4, 8.3, 8.4).</w:t>
+              <w:t xml:space="preserve">3.2, 6.1, 8.3, 8.4, 8.5, 9.4</w:t>
+            </w:r>
+          </w:p>
+        </w:tc>
+        <w:tc>
+          <w:tcPr>
+            <w:tcW w:w="5898" w:type="dxa"/>
+          </w:tcPr>
+          <w:p>
+            <w:pPr>
+              <w:spacing w:after="0"/>
+            </w:pPr>
+            <w:r>
+              <w:rPr>
+                <w:sz w:val="18"/>
+              </w:rPr>
+              <w:t xml:space="preserve">Optional reading of plain questions by backend rules (3.2, 6.1); replies about the data and the previous answer (3.2); query time limit of 15 seconds (8.3); no assumed period when the question has no time wording (8.4); chart chosen by rules from the shape of the result, with the AI service as fallback (8.5, 9.4).</w:t>
             </w:r>
           </w:p>
         </w:tc>
@@ -511,7 +579,7 @@
         </w:trPr>
         <w:tc>
           <w:tcPr>
-            <w:tcW w:w="900" w:type="dxa"/>
+            <w:tcW w:w="800" w:type="dxa"/>
           </w:tcPr>
           <w:p>
             <w:pPr>
@@ -527,7 +595,7 @@
         </w:tc>
         <w:tc>
           <w:tcPr>
-            <w:tcW w:w="1900" w:type="dxa"/>
+            <w:tcW w:w="1250" w:type="dxa"/>
           </w:tcPr>
           <w:p>
             <w:pPr>
@@ -537,13 +605,13 @@
               <w:rPr>
                 <w:sz w:val="18"/>
               </w:rPr>
-              <w:t xml:space="preserve">1/10 to 10/10/2026</w:t>
-            </w:r>
-          </w:p>
-        </w:tc>
-        <w:tc>
-          <w:tcPr>
-            <w:tcW w:w="6848" w:type="dxa"/>
+              <w:t xml:space="preserve">24/9/2026</w:t>
+            </w:r>
+          </w:p>
+        </w:tc>
+        <w:tc>
+          <w:tcPr>
+            <w:tcW w:w="1700" w:type="dxa"/>
           </w:tcPr>
           <w:p>
             <w:pPr>
@@ -553,7 +621,23 @@
               <w:rPr>
                 <w:sz w:val="18"/>
               </w:rPr>
-              <w:t xml:space="preserve">AI provider limits reported as a busy service instead of a failure; correction of RAG SQL that departs from the approved shape; row limits with a notice when a list is cut; checks of the reporting period against the question; a named factory always applied as a filter; comparison of named factories (Sections 8.3, 8.4, 8.6).</w:t>
+              <w:t xml:space="preserve">6.1, 8.4, 8.6</w:t>
+            </w:r>
+          </w:p>
+        </w:tc>
+        <w:tc>
+          <w:tcPr>
+            <w:tcW w:w="5898" w:type="dxa"/>
+          </w:tcPr>
+          <w:p>
+            <w:pPr>
+              <w:spacing w:after="0"/>
+            </w:pPr>
+            <w:r>
+              <w:rPr>
+                <w:sz w:val="18"/>
+              </w:rPr>
+              <w:t xml:space="preserve">Several requests in one message, up to five (8.4); comparison across named periods (8.4); a period named in the question takes precedence over the one the AI service chose (8.4); plain questions and short follow-ups still answered when the AI service is unavailable (6.1, 8.6).</w:t>
             </w:r>
           </w:p>
         </w:tc>
@@ -564,7 +648,7 @@
         </w:trPr>
         <w:tc>
           <w:tcPr>
-            <w:tcW w:w="900" w:type="dxa"/>
+            <w:tcW w:w="800" w:type="dxa"/>
           </w:tcPr>
           <w:p>
             <w:pPr>
@@ -580,7 +664,7 @@
         </w:tc>
         <w:tc>
           <w:tcPr>
-            <w:tcW w:w="1900" w:type="dxa"/>
+            <w:tcW w:w="1250" w:type="dxa"/>
           </w:tcPr>
           <w:p>
             <w:pPr>
@@ -590,13 +674,13 @@
               <w:rPr>
                 <w:sz w:val="18"/>
               </w:rPr>
-              <w:t xml:space="preserve">13/10/2026</w:t>
-            </w:r>
-          </w:p>
-        </w:tc>
-        <w:tc>
-          <w:tcPr>
-            <w:tcW w:w="6848" w:type="dxa"/>
+              <w:t xml:space="preserve">10/10/2026</w:t>
+            </w:r>
+          </w:p>
+        </w:tc>
+        <w:tc>
+          <w:tcPr>
+            <w:tcW w:w="1700" w:type="dxa"/>
           </w:tcPr>
           <w:p>
             <w:pPr>
@@ -606,7 +690,23 @@
               <w:rPr>
                 <w:sz w:val="18"/>
               </w:rPr>
-              <w:t xml:space="preserve">Amounts of earlier answers kept out of the context sent to the AI service; independent verification of every answered table against the warehouse; test report on the standard test-case template; data-sent table and cost estimate prepared (Sections 3.2, 11.2, Appendix B).</w:t>
+              <w:t xml:space="preserve">8.3, 8.4, 8.6</w:t>
+            </w:r>
+          </w:p>
+        </w:tc>
+        <w:tc>
+          <w:tcPr>
+            <w:tcW w:w="5898" w:type="dxa"/>
+          </w:tcPr>
+          <w:p>
+            <w:pPr>
+              <w:spacing w:after="0"/>
+            </w:pPr>
+            <w:r>
+              <w:rPr>
+                <w:sz w:val="18"/>
+              </w:rPr>
+              <w:t xml:space="preserve">Correction of SQL that departs from the approved shape, at most twice (8.3); row limits of 100, 250 and 400 with a notice when a list is cut (8.3); provider limits reported as a busy service instead of a failure (8.6); a named factory always applied as a filter (8.4).</w:t>
             </w:r>
           </w:p>
         </w:tc>
@@ -617,7 +717,7 @@
         </w:trPr>
         <w:tc>
           <w:tcPr>
-            <w:tcW w:w="900" w:type="dxa"/>
+            <w:tcW w:w="800" w:type="dxa"/>
           </w:tcPr>
           <w:p>
             <w:pPr>
@@ -633,7 +733,7 @@
         </w:tc>
         <w:tc>
           <w:tcPr>
-            <w:tcW w:w="1900" w:type="dxa"/>
+            <w:tcW w:w="1250" w:type="dxa"/>
           </w:tcPr>
           <w:p>
             <w:pPr>
@@ -643,13 +743,13 @@
               <w:rPr>
                 <w:sz w:val="18"/>
               </w:rPr>
-              <w:t xml:space="preserve">14/10/2026</w:t>
-            </w:r>
-          </w:p>
-        </w:tc>
-        <w:tc>
-          <w:tcPr>
-            <w:tcW w:w="6848" w:type="dxa"/>
+              <w:t xml:space="preserve">13/10/2026</w:t>
+            </w:r>
+          </w:p>
+        </w:tc>
+        <w:tc>
+          <w:tcPr>
+            <w:tcW w:w="1700" w:type="dxa"/>
           </w:tcPr>
           <w:p>
             <w:pPr>
@@ -659,7 +759,92 @@
               <w:rPr>
                 <w:sz w:val="18"/>
               </w:rPr>
-              <w:t xml:space="preserve">This document revised against the implementation after an independent review: Sections 3.2, 6.1, 6.2, 8.3 to 8.6, 9.2, 9.4, 11.2, 11.3 and Appendix B; spelling and heading corrections.</w:t>
+              <w:t xml:space="preserve">3.2, 8.4</w:t>
+            </w:r>
+          </w:p>
+        </w:tc>
+        <w:tc>
+          <w:tcPr>
+            <w:tcW w:w="5898" w:type="dxa"/>
+          </w:tcPr>
+          <w:p>
+            <w:pPr>
+              <w:spacing w:after="0"/>
+            </w:pPr>
+            <w:r>
+              <w:rPr>
+                <w:sz w:val="18"/>
+              </w:rPr>
+              <w:t xml:space="preserve">Amounts and decimal ratios of earlier answers replaced by a placeholder in the context sent to the AI service (3.2, 8.4); a comparison of named factories shows only those factories and states what was left out (8.4).</w:t>
+            </w:r>
+          </w:p>
+        </w:tc>
+      </w:tr>
+      <w:tr>
+        <w:trPr>
+          <w:jc w:val="center"/>
+        </w:trPr>
+        <w:tc>
+          <w:tcPr>
+            <w:tcW w:w="800" w:type="dxa"/>
+          </w:tcPr>
+          <w:p>
+            <w:pPr>
+              <w:spacing w:after="0"/>
+            </w:pPr>
+            <w:r>
+              <w:rPr>
+                <w:sz w:val="18"/>
+              </w:rPr>
+              <w:t xml:space="preserve">1.1</w:t>
+            </w:r>
+          </w:p>
+        </w:tc>
+        <w:tc>
+          <w:tcPr>
+            <w:tcW w:w="1250" w:type="dxa"/>
+          </w:tcPr>
+          <w:p>
+            <w:pPr>
+              <w:spacing w:after="0"/>
+            </w:pPr>
+            <w:r>
+              <w:rPr>
+                <w:sz w:val="18"/>
+              </w:rPr>
+              <w:t xml:space="preserve">14/10/2026</w:t>
+            </w:r>
+          </w:p>
+        </w:tc>
+        <w:tc>
+          <w:tcPr>
+            <w:tcW w:w="1700" w:type="dxa"/>
+          </w:tcPr>
+          <w:p>
+            <w:pPr>
+              <w:spacing w:after="0"/>
+            </w:pPr>
+            <w:r>
+              <w:rPr>
+                <w:sz w:val="18"/>
+              </w:rPr>
+              <w:t xml:space="preserve">3.2, 6.1, 6.2, 8.3 to 8.6, 9.2, 9.4, 11.2, 11.3, Appendix B</w:t>
+            </w:r>
+          </w:p>
+        </w:tc>
+        <w:tc>
+          <w:tcPr>
+            <w:tcW w:w="5898" w:type="dxa"/>
+          </w:tcPr>
+          <w:p>
+            <w:pPr>
+              <w:spacing w:after="0"/>
+            </w:pPr>
+            <w:r>
+              <w:rPr>
+                <w:sz w:val="18"/>
+              </w:rPr>
+              <w:t xml:space="preserve">This document revised against the implementation after an independent review: data sent to external services, processing order, provider operation, additional mitigations, indicative AI cost, spelling and numbering corrections.</w:t>
             </w:r>
           </w:p>
         </w:tc>

</xml_diff>

<commit_message>
Itemize the 14/10 document revision by section
</commit_message>
<xml_diff>
--- a/docs/ACBI_Technical_Solution_Proposal_v1.1.docx
+++ b/docs/ACBI_Technical_Solution_Proposal_v1.1.docx
@@ -268,7 +268,7 @@
     </w:p>
     <w:p>
       <w:r>
-        <w:t xml:space="preserve">Version 1.1 describes the prototype as of 14/10/2026. The table lists, day by day, when each behavior now described in this document entered the prototype; the document itself was revised on 14/10/2026.</w:t>
+        <w:t xml:space="preserve">Version 1.1 describes the prototype as of 14/10/2026. The table lists, day by day, when each behavior now described in this document entered the prototype; the document itself was revised on 14/10/2026, as itemized in the last rows.</w:t>
       </w:r>
     </w:p>
     <w:tbl>
@@ -828,7 +828,7 @@
               <w:rPr>
                 <w:sz w:val="18"/>
               </w:rPr>
-              <w:t xml:space="preserve">3.2, 6.1, 6.2, 8.3 to 8.6, 9.2, 9.4, 11.2, 11.3, Appendix B</w:t>
+              <w:t xml:space="preserve">3.2</w:t>
             </w:r>
           </w:p>
         </w:tc>
@@ -844,7 +844,559 @@
               <w:rPr>
                 <w:sz w:val="18"/>
               </w:rPr>
-              <w:t xml:space="preserve">This document revised against the implementation after an independent review: data sent to external services, processing order, provider operation, additional mitigations, indicative AI cost, spelling and numbering corrections.</w:t>
+              <w:t xml:space="preserve">Added the section Data Sent to External Services: what each external AI call carries, what it never carries and which setting controls it.</w:t>
+            </w:r>
+          </w:p>
+        </w:tc>
+      </w:tr>
+      <w:tr>
+        <w:trPr>
+          <w:jc w:val="center"/>
+        </w:trPr>
+        <w:tc>
+          <w:tcPr>
+            <w:tcW w:w="800" w:type="dxa"/>
+          </w:tcPr>
+          <w:p>
+            <w:pPr>
+              <w:spacing w:after="0"/>
+            </w:pPr>
+            <w:r>
+              <w:rPr>
+                <w:sz w:val="18"/>
+              </w:rPr>
+              <w:t xml:space="preserve">1.1</w:t>
+            </w:r>
+          </w:p>
+        </w:tc>
+        <w:tc>
+          <w:tcPr>
+            <w:tcW w:w="1250" w:type="dxa"/>
+          </w:tcPr>
+          <w:p>
+            <w:pPr>
+              <w:spacing w:after="0"/>
+            </w:pPr>
+            <w:r>
+              <w:rPr>
+                <w:sz w:val="18"/>
+              </w:rPr>
+              <w:t xml:space="preserve">14/10/2026</w:t>
+            </w:r>
+          </w:p>
+        </w:tc>
+        <w:tc>
+          <w:tcPr>
+            <w:tcW w:w="1700" w:type="dxa"/>
+          </w:tcPr>
+          <w:p>
+            <w:pPr>
+              <w:spacing w:after="0"/>
+            </w:pPr>
+            <w:r>
+              <w:rPr>
+                <w:sz w:val="18"/>
+              </w:rPr>
+              <w:t xml:space="preserve">6.1, 6.2</w:t>
+            </w:r>
+          </w:p>
+        </w:tc>
+        <w:tc>
+          <w:tcPr>
+            <w:tcW w:w="5898" w:type="dxa"/>
+          </w:tcPr>
+          <w:p>
+            <w:pPr>
+              <w:spacing w:after="0"/>
+            </w:pPr>
+            <w:r>
+              <w:rPr>
+                <w:sz w:val="18"/>
+              </w:rPr>
+              <w:t xml:space="preserve">Interpretation step now reads plain questions by rules when enabled or when the AI service is unavailable; IT Administrator refusal described before the AI call.</w:t>
+            </w:r>
+          </w:p>
+        </w:tc>
+      </w:tr>
+      <w:tr>
+        <w:trPr>
+          <w:jc w:val="center"/>
+        </w:trPr>
+        <w:tc>
+          <w:tcPr>
+            <w:tcW w:w="800" w:type="dxa"/>
+          </w:tcPr>
+          <w:p>
+            <w:pPr>
+              <w:spacing w:after="0"/>
+            </w:pPr>
+            <w:r>
+              <w:rPr>
+                <w:sz w:val="18"/>
+              </w:rPr>
+              <w:t xml:space="preserve">1.1</w:t>
+            </w:r>
+          </w:p>
+        </w:tc>
+        <w:tc>
+          <w:tcPr>
+            <w:tcW w:w="1250" w:type="dxa"/>
+          </w:tcPr>
+          <w:p>
+            <w:pPr>
+              <w:spacing w:after="0"/>
+            </w:pPr>
+            <w:r>
+              <w:rPr>
+                <w:sz w:val="18"/>
+              </w:rPr>
+              <w:t xml:space="preserve">14/10/2026</w:t>
+            </w:r>
+          </w:p>
+        </w:tc>
+        <w:tc>
+          <w:tcPr>
+            <w:tcW w:w="1700" w:type="dxa"/>
+          </w:tcPr>
+          <w:p>
+            <w:pPr>
+              <w:spacing w:after="0"/>
+            </w:pPr>
+            <w:r>
+              <w:rPr>
+                <w:sz w:val="18"/>
+              </w:rPr>
+              <w:t xml:space="preserve">8.3</w:t>
+            </w:r>
+          </w:p>
+        </w:tc>
+        <w:tc>
+          <w:tcPr>
+            <w:tcW w:w="5898" w:type="dxa"/>
+          </w:tcPr>
+          <w:p>
+            <w:pPr>
+              <w:spacing w:after="0"/>
+            </w:pPr>
+            <w:r>
+              <w:rPr>
+                <w:sz w:val="18"/>
+              </w:rPr>
+              <w:t xml:space="preserve">Query limits (15 seconds, row limits), the correction rule for SQL that departs from the approved shape, and the scope subquery around generated SQL.</w:t>
+            </w:r>
+          </w:p>
+        </w:tc>
+      </w:tr>
+      <w:tr>
+        <w:trPr>
+          <w:jc w:val="center"/>
+        </w:trPr>
+        <w:tc>
+          <w:tcPr>
+            <w:tcW w:w="800" w:type="dxa"/>
+          </w:tcPr>
+          <w:p>
+            <w:pPr>
+              <w:spacing w:after="0"/>
+            </w:pPr>
+            <w:r>
+              <w:rPr>
+                <w:sz w:val="18"/>
+              </w:rPr>
+              <w:t xml:space="preserve">1.1</w:t>
+            </w:r>
+          </w:p>
+        </w:tc>
+        <w:tc>
+          <w:tcPr>
+            <w:tcW w:w="1250" w:type="dxa"/>
+          </w:tcPr>
+          <w:p>
+            <w:pPr>
+              <w:spacing w:after="0"/>
+            </w:pPr>
+            <w:r>
+              <w:rPr>
+                <w:sz w:val="18"/>
+              </w:rPr>
+              <w:t xml:space="preserve">14/10/2026</w:t>
+            </w:r>
+          </w:p>
+        </w:tc>
+        <w:tc>
+          <w:tcPr>
+            <w:tcW w:w="1700" w:type="dxa"/>
+          </w:tcPr>
+          <w:p>
+            <w:pPr>
+              <w:spacing w:after="0"/>
+            </w:pPr>
+            <w:r>
+              <w:rPr>
+                <w:sz w:val="18"/>
+              </w:rPr>
+              <w:t xml:space="preserve">8.4</w:t>
+            </w:r>
+          </w:p>
+        </w:tc>
+        <w:tc>
+          <w:tcPr>
+            <w:tcW w:w="5898" w:type="dxa"/>
+          </w:tcPr>
+          <w:p>
+            <w:pPr>
+              <w:spacing w:after="0"/>
+            </w:pPr>
+            <w:r>
+              <w:rPr>
+                <w:sz w:val="18"/>
+              </w:rPr>
+              <w:t xml:space="preserve">Conversation context limited to six turns with amounts masked; period check against the question; comparisons; several requests in one message.</w:t>
+            </w:r>
+          </w:p>
+        </w:tc>
+      </w:tr>
+      <w:tr>
+        <w:trPr>
+          <w:jc w:val="center"/>
+        </w:trPr>
+        <w:tc>
+          <w:tcPr>
+            <w:tcW w:w="800" w:type="dxa"/>
+          </w:tcPr>
+          <w:p>
+            <w:pPr>
+              <w:spacing w:after="0"/>
+            </w:pPr>
+            <w:r>
+              <w:rPr>
+                <w:sz w:val="18"/>
+              </w:rPr>
+              <w:t xml:space="preserve">1.1</w:t>
+            </w:r>
+          </w:p>
+        </w:tc>
+        <w:tc>
+          <w:tcPr>
+            <w:tcW w:w="1250" w:type="dxa"/>
+          </w:tcPr>
+          <w:p>
+            <w:pPr>
+              <w:spacing w:after="0"/>
+            </w:pPr>
+            <w:r>
+              <w:rPr>
+                <w:sz w:val="18"/>
+              </w:rPr>
+              <w:t xml:space="preserve">14/10/2026</w:t>
+            </w:r>
+          </w:p>
+        </w:tc>
+        <w:tc>
+          <w:tcPr>
+            <w:tcW w:w="1700" w:type="dxa"/>
+          </w:tcPr>
+          <w:p>
+            <w:pPr>
+              <w:spacing w:after="0"/>
+            </w:pPr>
+            <w:r>
+              <w:rPr>
+                <w:sz w:val="18"/>
+              </w:rPr>
+              <w:t xml:space="preserve">8.5, 9.4</w:t>
+            </w:r>
+          </w:p>
+        </w:tc>
+        <w:tc>
+          <w:tcPr>
+            <w:tcW w:w="5898" w:type="dxa"/>
+          </w:tcPr>
+          <w:p>
+            <w:pPr>
+              <w:spacing w:after="0"/>
+            </w:pPr>
+            <w:r>
+              <w:rPr>
+                <w:sz w:val="18"/>
+              </w:rPr>
+              <w:t xml:space="preserve">Visualization chosen by backend rules first, with the AI service as fallback.</w:t>
+            </w:r>
+          </w:p>
+        </w:tc>
+      </w:tr>
+      <w:tr>
+        <w:trPr>
+          <w:jc w:val="center"/>
+        </w:trPr>
+        <w:tc>
+          <w:tcPr>
+            <w:tcW w:w="800" w:type="dxa"/>
+          </w:tcPr>
+          <w:p>
+            <w:pPr>
+              <w:spacing w:after="0"/>
+            </w:pPr>
+            <w:r>
+              <w:rPr>
+                <w:sz w:val="18"/>
+              </w:rPr>
+              <w:t xml:space="preserve">1.1</w:t>
+            </w:r>
+          </w:p>
+        </w:tc>
+        <w:tc>
+          <w:tcPr>
+            <w:tcW w:w="1250" w:type="dxa"/>
+          </w:tcPr>
+          <w:p>
+            <w:pPr>
+              <w:spacing w:after="0"/>
+            </w:pPr>
+            <w:r>
+              <w:rPr>
+                <w:sz w:val="18"/>
+              </w:rPr>
+              <w:t xml:space="preserve">14/10/2026</w:t>
+            </w:r>
+          </w:p>
+        </w:tc>
+        <w:tc>
+          <w:tcPr>
+            <w:tcW w:w="1700" w:type="dxa"/>
+          </w:tcPr>
+          <w:p>
+            <w:pPr>
+              <w:spacing w:after="0"/>
+            </w:pPr>
+            <w:r>
+              <w:rPr>
+                <w:sz w:val="18"/>
+              </w:rPr>
+              <w:t xml:space="preserve">8.6, 9.2</w:t>
+            </w:r>
+          </w:p>
+        </w:tc>
+        <w:tc>
+          <w:tcPr>
+            <w:tcW w:w="5898" w:type="dxa"/>
+          </w:tcPr>
+          <w:p>
+            <w:pPr>
+              <w:spacing w:after="0"/>
+            </w:pPr>
+            <w:r>
+              <w:rPr>
+                <w:sz w:val="18"/>
+              </w:rPr>
+              <w:t xml:space="preserve">Busy-service handling for provider limits; provider operation for production and the temporary rotation of free providers during the demonstration period.</w:t>
+            </w:r>
+          </w:p>
+        </w:tc>
+      </w:tr>
+      <w:tr>
+        <w:trPr>
+          <w:jc w:val="center"/>
+        </w:trPr>
+        <w:tc>
+          <w:tcPr>
+            <w:tcW w:w="800" w:type="dxa"/>
+          </w:tcPr>
+          <w:p>
+            <w:pPr>
+              <w:spacing w:after="0"/>
+            </w:pPr>
+            <w:r>
+              <w:rPr>
+                <w:sz w:val="18"/>
+              </w:rPr>
+              <w:t xml:space="preserve">1.1</w:t>
+            </w:r>
+          </w:p>
+        </w:tc>
+        <w:tc>
+          <w:tcPr>
+            <w:tcW w:w="1250" w:type="dxa"/>
+          </w:tcPr>
+          <w:p>
+            <w:pPr>
+              <w:spacing w:after="0"/>
+            </w:pPr>
+            <w:r>
+              <w:rPr>
+                <w:sz w:val="18"/>
+              </w:rPr>
+              <w:t xml:space="preserve">14/10/2026</w:t>
+            </w:r>
+          </w:p>
+        </w:tc>
+        <w:tc>
+          <w:tcPr>
+            <w:tcW w:w="1700" w:type="dxa"/>
+          </w:tcPr>
+          <w:p>
+            <w:pPr>
+              <w:spacing w:after="0"/>
+            </w:pPr>
+            <w:r>
+              <w:rPr>
+                <w:sz w:val="18"/>
+              </w:rPr>
+              <w:t xml:space="preserve">11.2, 11.3</w:t>
+            </w:r>
+          </w:p>
+        </w:tc>
+        <w:tc>
+          <w:tcPr>
+            <w:tcW w:w="5898" w:type="dxa"/>
+          </w:tcPr>
+          <w:p>
+            <w:pPr>
+              <w:spacing w:after="0"/>
+            </w:pPr>
+            <w:r>
+              <w:rPr>
+                <w:sz w:val="18"/>
+              </w:rPr>
+              <w:t xml:space="preserve">Additional mitigations: provider terms review, data classification, independent penetration test, paid plan or offline model.</w:t>
+            </w:r>
+          </w:p>
+        </w:tc>
+      </w:tr>
+      <w:tr>
+        <w:trPr>
+          <w:jc w:val="center"/>
+        </w:trPr>
+        <w:tc>
+          <w:tcPr>
+            <w:tcW w:w="800" w:type="dxa"/>
+          </w:tcPr>
+          <w:p>
+            <w:pPr>
+              <w:spacing w:after="0"/>
+            </w:pPr>
+            <w:r>
+              <w:rPr>
+                <w:sz w:val="18"/>
+              </w:rPr>
+              <w:t xml:space="preserve">1.1</w:t>
+            </w:r>
+          </w:p>
+        </w:tc>
+        <w:tc>
+          <w:tcPr>
+            <w:tcW w:w="1250" w:type="dxa"/>
+          </w:tcPr>
+          <w:p>
+            <w:pPr>
+              <w:spacing w:after="0"/>
+            </w:pPr>
+            <w:r>
+              <w:rPr>
+                <w:sz w:val="18"/>
+              </w:rPr>
+              <w:t xml:space="preserve">14/10/2026</w:t>
+            </w:r>
+          </w:p>
+        </w:tc>
+        <w:tc>
+          <w:tcPr>
+            <w:tcW w:w="1700" w:type="dxa"/>
+          </w:tcPr>
+          <w:p>
+            <w:pPr>
+              <w:spacing w:after="0"/>
+            </w:pPr>
+            <w:r>
+              <w:rPr>
+                <w:sz w:val="18"/>
+              </w:rPr>
+              <w:t xml:space="preserve">Appendix B</w:t>
+            </w:r>
+          </w:p>
+        </w:tc>
+        <w:tc>
+          <w:tcPr>
+            <w:tcW w:w="5898" w:type="dxa"/>
+          </w:tcPr>
+          <w:p>
+            <w:pPr>
+              <w:spacing w:after="0"/>
+            </w:pPr>
+            <w:r>
+              <w:rPr>
+                <w:sz w:val="18"/>
+              </w:rPr>
+              <w:t xml:space="preserve">Indicative AI cost for the API and the offline server, with break-even range.</w:t>
+            </w:r>
+          </w:p>
+        </w:tc>
+      </w:tr>
+      <w:tr>
+        <w:trPr>
+          <w:jc w:val="center"/>
+        </w:trPr>
+        <w:tc>
+          <w:tcPr>
+            <w:tcW w:w="800" w:type="dxa"/>
+          </w:tcPr>
+          <w:p>
+            <w:pPr>
+              <w:spacing w:after="0"/>
+            </w:pPr>
+            <w:r>
+              <w:rPr>
+                <w:sz w:val="18"/>
+              </w:rPr>
+              <w:t xml:space="preserve">1.1</w:t>
+            </w:r>
+          </w:p>
+        </w:tc>
+        <w:tc>
+          <w:tcPr>
+            <w:tcW w:w="1250" w:type="dxa"/>
+          </w:tcPr>
+          <w:p>
+            <w:pPr>
+              <w:spacing w:after="0"/>
+            </w:pPr>
+            <w:r>
+              <w:rPr>
+                <w:sz w:val="18"/>
+              </w:rPr>
+              <w:t xml:space="preserve">14/10/2026</w:t>
+            </w:r>
+          </w:p>
+        </w:tc>
+        <w:tc>
+          <w:tcPr>
+            <w:tcW w:w="1700" w:type="dxa"/>
+          </w:tcPr>
+          <w:p>
+            <w:pPr>
+              <w:spacing w:after="0"/>
+            </w:pPr>
+            <w:r>
+              <w:rPr>
+                <w:sz w:val="18"/>
+              </w:rPr>
+              <w:t xml:space="preserve">Document</w:t>
+            </w:r>
+          </w:p>
+        </w:tc>
+        <w:tc>
+          <w:tcPr>
+            <w:tcW w:w="5898" w:type="dxa"/>
+          </w:tcPr>
+          <w:p>
+            <w:pPr>
+              <w:spacing w:after="0"/>
+            </w:pPr>
+            <w:r>
+              <w:rPr>
+                <w:sz w:val="18"/>
+              </w:rPr>
+              <w:t xml:space="preserve">Revision history, spelling corrections and section numbering.</w:t>
             </w:r>
           </w:p>
         </w:tc>

</xml_diff>

<commit_message>
Shorten the revision history change text
</commit_message>
<xml_diff>
--- a/docs/ACBI_Technical_Solution_Proposal_v1.1.docx
+++ b/docs/ACBI_Technical_Solution_Proposal_v1.1.docx
@@ -268,7 +268,7 @@
     </w:p>
     <w:p>
       <w:r>
-        <w:t xml:space="preserve">Version 1.1 describes the prototype as of 14/10/2026. The table lists, day by day, when each behavior now described in this document entered the prototype; the document itself was revised on 14/10/2026, as itemized in the last rows.</w:t>
+        <w:t xml:space="preserve">Version 1.1 describes the prototype as of 14/10/2026. Dates before 14/10 show when each behavior entered the prototype; the document was revised on 14/10/2026.</w:t>
       </w:r>
     </w:p>
     <w:tbl>
@@ -281,8 +281,8 @@
       <w:tblGrid>
         <w:gridCol w:w="800"/>
         <w:gridCol w:w="1250"/>
-        <w:gridCol w:w="1700"/>
-        <w:gridCol w:w="5898"/>
+        <w:gridCol w:w="1900"/>
+        <w:gridCol w:w="5698"/>
       </w:tblGrid>
       <w:tr>
         <w:trPr>
@@ -329,7 +329,7 @@
         </w:tc>
         <w:tc>
           <w:tcPr>
-            <w:tcW w:w="1700" w:type="dxa"/>
+            <w:tcW w:w="1900" w:type="dxa"/>
             <w:shd w:val="clear" w:color="auto" w:fill="D9EAF7"/>
           </w:tcPr>
           <w:p>
@@ -348,7 +348,7 @@
         </w:tc>
         <w:tc>
           <w:tcPr>
-            <w:tcW w:w="5898" w:type="dxa"/>
+            <w:tcW w:w="5698" w:type="dxa"/>
             <w:shd w:val="clear" w:color="auto" w:fill="D9EAF7"/>
           </w:tcPr>
           <w:p>
@@ -404,7 +404,7 @@
         </w:tc>
         <w:tc>
           <w:tcPr>
-            <w:tcW w:w="1700" w:type="dxa"/>
+            <w:tcW w:w="1900" w:type="dxa"/>
           </w:tcPr>
           <w:p>
             <w:pPr>
@@ -420,7 +420,7 @@
         </w:tc>
         <w:tc>
           <w:tcPr>
-            <w:tcW w:w="5898" w:type="dxa"/>
+            <w:tcW w:w="5698" w:type="dxa"/>
           </w:tcPr>
           <w:p>
             <w:pPr>
@@ -430,7 +430,7 @@
               <w:rPr>
                 <w:sz w:val="18"/>
               </w:rPr>
-              <w:t xml:space="preserve">Initial proposal.</w:t>
+              <w:t xml:space="preserve">Initial proposal</w:t>
             </w:r>
           </w:p>
         </w:tc>
@@ -473,7 +473,7 @@
         </w:tc>
         <w:tc>
           <w:tcPr>
-            <w:tcW w:w="1700" w:type="dxa"/>
+            <w:tcW w:w="1900" w:type="dxa"/>
           </w:tcPr>
           <w:p>
             <w:pPr>
@@ -489,7 +489,7 @@
         </w:tc>
         <w:tc>
           <w:tcPr>
-            <w:tcW w:w="5898" w:type="dxa"/>
+            <w:tcW w:w="5698" w:type="dxa"/>
           </w:tcPr>
           <w:p>
             <w:pPr>
@@ -499,7 +499,7 @@
               <w:rPr>
                 <w:sz w:val="18"/>
               </w:rPr>
-              <w:t xml:space="preserve">Scope subquery around generated SQL and exact match of standard-path queries to the predefined statement (8.3); SQL proposals only when approved metadata may be sent, with the setting EXTERNAL_METADATA_ENABLED (3.2); IT Administrator role refused before the AI service is called (6.2).</w:t>
+              <w:t xml:space="preserve">Scope subquery for generated SQL; exact match for standard queries; early IT Administrator refusal</w:t>
             </w:r>
           </w:p>
         </w:tc>
@@ -542,7 +542,7 @@
         </w:tc>
         <w:tc>
           <w:tcPr>
-            <w:tcW w:w="1700" w:type="dxa"/>
+            <w:tcW w:w="1900" w:type="dxa"/>
           </w:tcPr>
           <w:p>
             <w:pPr>
@@ -552,13 +552,13 @@
               <w:rPr>
                 <w:sz w:val="18"/>
               </w:rPr>
-              <w:t xml:space="preserve">3.2, 6.1, 8.3, 8.4, 8.5, 9.4</w:t>
-            </w:r>
-          </w:p>
-        </w:tc>
-        <w:tc>
-          <w:tcPr>
-            <w:tcW w:w="5898" w:type="dxa"/>
+              <w:t xml:space="preserve">3.2, 6.1, 8.3 to 8.5, 9.4</w:t>
+            </w:r>
+          </w:p>
+        </w:tc>
+        <w:tc>
+          <w:tcPr>
+            <w:tcW w:w="5698" w:type="dxa"/>
           </w:tcPr>
           <w:p>
             <w:pPr>
@@ -568,7 +568,7 @@
               <w:rPr>
                 <w:sz w:val="18"/>
               </w:rPr>
-              <w:t xml:space="preserve">Optional reading of plain questions by backend rules (3.2, 6.1); replies about the data and the previous answer (3.2); query time limit of 15 seconds (8.3); no assumed period when the question has no time wording (8.4); chart chosen by rules from the shape of the result, with the AI service as fallback (8.5, 9.4).</w:t>
+              <w:t xml:space="preserve">Optional rule-based reading; replies about data; 15-second limit; period check; rule-based chart choice</w:t>
             </w:r>
           </w:p>
         </w:tc>
@@ -611,7 +611,7 @@
         </w:tc>
         <w:tc>
           <w:tcPr>
-            <w:tcW w:w="1700" w:type="dxa"/>
+            <w:tcW w:w="1900" w:type="dxa"/>
           </w:tcPr>
           <w:p>
             <w:pPr>
@@ -627,7 +627,7 @@
         </w:tc>
         <w:tc>
           <w:tcPr>
-            <w:tcW w:w="5898" w:type="dxa"/>
+            <w:tcW w:w="5698" w:type="dxa"/>
           </w:tcPr>
           <w:p>
             <w:pPr>
@@ -637,7 +637,7 @@
               <w:rPr>
                 <w:sz w:val="18"/>
               </w:rPr>
-              <w:t xml:space="preserve">Several requests in one message, up to five (8.4); comparison across named periods (8.4); a period named in the question takes precedence over the one the AI service chose (8.4); plain questions and short follow-ups still answered when the AI service is unavailable (6.1, 8.6).</w:t>
+              <w:t xml:space="preserve">Multi-request messages; period comparisons; fallback when AI is unavailable</w:t>
             </w:r>
           </w:p>
         </w:tc>
@@ -680,7 +680,7 @@
         </w:tc>
         <w:tc>
           <w:tcPr>
-            <w:tcW w:w="1700" w:type="dxa"/>
+            <w:tcW w:w="1900" w:type="dxa"/>
           </w:tcPr>
           <w:p>
             <w:pPr>
@@ -696,7 +696,7 @@
         </w:tc>
         <w:tc>
           <w:tcPr>
-            <w:tcW w:w="5898" w:type="dxa"/>
+            <w:tcW w:w="5698" w:type="dxa"/>
           </w:tcPr>
           <w:p>
             <w:pPr>
@@ -706,7 +706,7 @@
               <w:rPr>
                 <w:sz w:val="18"/>
               </w:rPr>
-              <w:t xml:space="preserve">Correction of SQL that departs from the approved shape, at most twice (8.3); row limits of 100, 250 and 400 with a notice when a list is cut (8.3); provider limits reported as a busy service instead of a failure (8.6); a named factory always applied as a filter (8.4).</w:t>
+              <w:t xml:space="preserve">SQL correction; row limits; busy-service message; named factory as filter</w:t>
             </w:r>
           </w:p>
         </w:tc>
@@ -749,7 +749,7 @@
         </w:tc>
         <w:tc>
           <w:tcPr>
-            <w:tcW w:w="1700" w:type="dxa"/>
+            <w:tcW w:w="1900" w:type="dxa"/>
           </w:tcPr>
           <w:p>
             <w:pPr>
@@ -765,7 +765,7 @@
         </w:tc>
         <w:tc>
           <w:tcPr>
-            <w:tcW w:w="5898" w:type="dxa"/>
+            <w:tcW w:w="5698" w:type="dxa"/>
           </w:tcPr>
           <w:p>
             <w:pPr>
@@ -775,7 +775,7 @@
               <w:rPr>
                 <w:sz w:val="18"/>
               </w:rPr>
-              <w:t xml:space="preserve">Amounts and decimal ratios of earlier answers replaced by a placeholder in the context sent to the AI service (3.2, 8.4); a comparison of named factories shows only those factories and states what was left out (8.4).</w:t>
+              <w:t xml:space="preserve">Amount masking; named-factory comparison</w:t>
             </w:r>
           </w:p>
         </w:tc>
@@ -818,7 +818,7 @@
         </w:tc>
         <w:tc>
           <w:tcPr>
-            <w:tcW w:w="1700" w:type="dxa"/>
+            <w:tcW w:w="1900" w:type="dxa"/>
           </w:tcPr>
           <w:p>
             <w:pPr>
@@ -834,7 +834,7 @@
         </w:tc>
         <w:tc>
           <w:tcPr>
-            <w:tcW w:w="5898" w:type="dxa"/>
+            <w:tcW w:w="5698" w:type="dxa"/>
           </w:tcPr>
           <w:p>
             <w:pPr>
@@ -844,7 +844,7 @@
               <w:rPr>
                 <w:sz w:val="18"/>
               </w:rPr>
-              <w:t xml:space="preserve">Added the section Data Sent to External Services: what each external AI call carries, what it never carries and which setting controls it.</w:t>
+              <w:t xml:space="preserve">Data sent to external services</w:t>
             </w:r>
           </w:p>
         </w:tc>
@@ -887,7 +887,7 @@
         </w:tc>
         <w:tc>
           <w:tcPr>
-            <w:tcW w:w="1700" w:type="dxa"/>
+            <w:tcW w:w="1900" w:type="dxa"/>
           </w:tcPr>
           <w:p>
             <w:pPr>
@@ -903,7 +903,7 @@
         </w:tc>
         <w:tc>
           <w:tcPr>
-            <w:tcW w:w="5898" w:type="dxa"/>
+            <w:tcW w:w="5698" w:type="dxa"/>
           </w:tcPr>
           <w:p>
             <w:pPr>
@@ -913,7 +913,7 @@
               <w:rPr>
                 <w:sz w:val="18"/>
               </w:rPr>
-              <w:t xml:space="preserve">Interpretation step now reads plain questions by rules when enabled or when the AI service is unavailable; IT Administrator refusal described before the AI call.</w:t>
+              <w:t xml:space="preserve">Processing order; IT Administrator refusal</w:t>
             </w:r>
           </w:p>
         </w:tc>
@@ -956,7 +956,7 @@
         </w:tc>
         <w:tc>
           <w:tcPr>
-            <w:tcW w:w="1700" w:type="dxa"/>
+            <w:tcW w:w="1900" w:type="dxa"/>
           </w:tcPr>
           <w:p>
             <w:pPr>
@@ -972,7 +972,7 @@
         </w:tc>
         <w:tc>
           <w:tcPr>
-            <w:tcW w:w="5898" w:type="dxa"/>
+            <w:tcW w:w="5698" w:type="dxa"/>
           </w:tcPr>
           <w:p>
             <w:pPr>
@@ -982,7 +982,7 @@
               <w:rPr>
                 <w:sz w:val="18"/>
               </w:rPr>
-              <w:t xml:space="preserve">Query limits (15 seconds, row limits), the correction rule for SQL that departs from the approved shape, and the scope subquery around generated SQL.</w:t>
+              <w:t xml:space="preserve">Query limits; SQL correction; scope subquery</w:t>
             </w:r>
           </w:p>
         </w:tc>
@@ -1025,7 +1025,7 @@
         </w:tc>
         <w:tc>
           <w:tcPr>
-            <w:tcW w:w="1700" w:type="dxa"/>
+            <w:tcW w:w="1900" w:type="dxa"/>
           </w:tcPr>
           <w:p>
             <w:pPr>
@@ -1041,7 +1041,7 @@
         </w:tc>
         <w:tc>
           <w:tcPr>
-            <w:tcW w:w="5898" w:type="dxa"/>
+            <w:tcW w:w="5698" w:type="dxa"/>
           </w:tcPr>
           <w:p>
             <w:pPr>
@@ -1051,7 +1051,7 @@
               <w:rPr>
                 <w:sz w:val="18"/>
               </w:rPr>
-              <w:t xml:space="preserve">Conversation context limited to six turns with amounts masked; period check against the question; comparisons; several requests in one message.</w:t>
+              <w:t xml:space="preserve">Context; period check; comparisons; multi-request</w:t>
             </w:r>
           </w:p>
         </w:tc>
@@ -1094,7 +1094,7 @@
         </w:tc>
         <w:tc>
           <w:tcPr>
-            <w:tcW w:w="1700" w:type="dxa"/>
+            <w:tcW w:w="1900" w:type="dxa"/>
           </w:tcPr>
           <w:p>
             <w:pPr>
@@ -1110,7 +1110,7 @@
         </w:tc>
         <w:tc>
           <w:tcPr>
-            <w:tcW w:w="5898" w:type="dxa"/>
+            <w:tcW w:w="5698" w:type="dxa"/>
           </w:tcPr>
           <w:p>
             <w:pPr>
@@ -1120,7 +1120,7 @@
               <w:rPr>
                 <w:sz w:val="18"/>
               </w:rPr>
-              <w:t xml:space="preserve">Visualization chosen by backend rules first, with the AI service as fallback.</w:t>
+              <w:t xml:space="preserve">Rule-based chart choice</w:t>
             </w:r>
           </w:p>
         </w:tc>
@@ -1163,7 +1163,7 @@
         </w:tc>
         <w:tc>
           <w:tcPr>
-            <w:tcW w:w="1700" w:type="dxa"/>
+            <w:tcW w:w="1900" w:type="dxa"/>
           </w:tcPr>
           <w:p>
             <w:pPr>
@@ -1179,7 +1179,7 @@
         </w:tc>
         <w:tc>
           <w:tcPr>
-            <w:tcW w:w="5898" w:type="dxa"/>
+            <w:tcW w:w="5698" w:type="dxa"/>
           </w:tcPr>
           <w:p>
             <w:pPr>
@@ -1189,7 +1189,7 @@
               <w:rPr>
                 <w:sz w:val="18"/>
               </w:rPr>
-              <w:t xml:space="preserve">Busy-service handling for provider limits; provider operation for production and the temporary rotation of free providers during the demonstration period.</w:t>
+              <w:t xml:space="preserve">Busy handling; provider operation</w:t>
             </w:r>
           </w:p>
         </w:tc>
@@ -1232,7 +1232,7 @@
         </w:tc>
         <w:tc>
           <w:tcPr>
-            <w:tcW w:w="1700" w:type="dxa"/>
+            <w:tcW w:w="1900" w:type="dxa"/>
           </w:tcPr>
           <w:p>
             <w:pPr>
@@ -1248,7 +1248,7 @@
         </w:tc>
         <w:tc>
           <w:tcPr>
-            <w:tcW w:w="5898" w:type="dxa"/>
+            <w:tcW w:w="5698" w:type="dxa"/>
           </w:tcPr>
           <w:p>
             <w:pPr>
@@ -1258,7 +1258,7 @@
               <w:rPr>
                 <w:sz w:val="18"/>
               </w:rPr>
-              <w:t xml:space="preserve">Additional mitigations: provider terms review, data classification, independent penetration test, paid plan or offline model.</w:t>
+              <w:t xml:space="preserve">Additional mitigations</w:t>
             </w:r>
           </w:p>
         </w:tc>
@@ -1301,7 +1301,7 @@
         </w:tc>
         <w:tc>
           <w:tcPr>
-            <w:tcW w:w="1700" w:type="dxa"/>
+            <w:tcW w:w="1900" w:type="dxa"/>
           </w:tcPr>
           <w:p>
             <w:pPr>
@@ -1317,7 +1317,7 @@
         </w:tc>
         <w:tc>
           <w:tcPr>
-            <w:tcW w:w="5898" w:type="dxa"/>
+            <w:tcW w:w="5698" w:type="dxa"/>
           </w:tcPr>
           <w:p>
             <w:pPr>
@@ -1327,7 +1327,7 @@
               <w:rPr>
                 <w:sz w:val="18"/>
               </w:rPr>
-              <w:t xml:space="preserve">Indicative AI cost for the API and the offline server, with break-even range.</w:t>
+              <w:t xml:space="preserve">Indicative AI cost</w:t>
             </w:r>
           </w:p>
         </w:tc>
@@ -1370,7 +1370,7 @@
         </w:tc>
         <w:tc>
           <w:tcPr>
-            <w:tcW w:w="1700" w:type="dxa"/>
+            <w:tcW w:w="1900" w:type="dxa"/>
           </w:tcPr>
           <w:p>
             <w:pPr>
@@ -1386,7 +1386,7 @@
         </w:tc>
         <w:tc>
           <w:tcPr>
-            <w:tcW w:w="5898" w:type="dxa"/>
+            <w:tcW w:w="5698" w:type="dxa"/>
           </w:tcPr>
           <w:p>
             <w:pPr>
@@ -1396,7 +1396,7 @@
               <w:rPr>
                 <w:sz w:val="18"/>
               </w:rPr>
-              <w:t xml:space="preserve">Revision history, spelling corrections and section numbering.</w:t>
+              <w:t xml:space="preserve">Revision history; spelling; numbering</w:t>
             </w:r>
           </w:p>
         </w:tc>

</xml_diff>

<commit_message>
Revert "Shorten the revision history change text"
This reverts commit 0023207176473eb3f54b5a8391d4e57f54462063.
</commit_message>
<xml_diff>
--- a/docs/ACBI_Technical_Solution_Proposal_v1.1.docx
+++ b/docs/ACBI_Technical_Solution_Proposal_v1.1.docx
@@ -268,7 +268,7 @@
     </w:p>
     <w:p>
       <w:r>
-        <w:t xml:space="preserve">Version 1.1 describes the prototype as of 14/10/2026. Dates before 14/10 show when each behavior entered the prototype; the document was revised on 14/10/2026.</w:t>
+        <w:t xml:space="preserve">Version 1.1 describes the prototype as of 14/10/2026. The table lists, day by day, when each behavior now described in this document entered the prototype; the document itself was revised on 14/10/2026, as itemized in the last rows.</w:t>
       </w:r>
     </w:p>
     <w:tbl>
@@ -281,8 +281,8 @@
       <w:tblGrid>
         <w:gridCol w:w="800"/>
         <w:gridCol w:w="1250"/>
-        <w:gridCol w:w="1900"/>
-        <w:gridCol w:w="5698"/>
+        <w:gridCol w:w="1700"/>
+        <w:gridCol w:w="5898"/>
       </w:tblGrid>
       <w:tr>
         <w:trPr>
@@ -329,7 +329,7 @@
         </w:tc>
         <w:tc>
           <w:tcPr>
-            <w:tcW w:w="1900" w:type="dxa"/>
+            <w:tcW w:w="1700" w:type="dxa"/>
             <w:shd w:val="clear" w:color="auto" w:fill="D9EAF7"/>
           </w:tcPr>
           <w:p>
@@ -348,7 +348,7 @@
         </w:tc>
         <w:tc>
           <w:tcPr>
-            <w:tcW w:w="5698" w:type="dxa"/>
+            <w:tcW w:w="5898" w:type="dxa"/>
             <w:shd w:val="clear" w:color="auto" w:fill="D9EAF7"/>
           </w:tcPr>
           <w:p>
@@ -404,7 +404,7 @@
         </w:tc>
         <w:tc>
           <w:tcPr>
-            <w:tcW w:w="1900" w:type="dxa"/>
+            <w:tcW w:w="1700" w:type="dxa"/>
           </w:tcPr>
           <w:p>
             <w:pPr>
@@ -420,7 +420,7 @@
         </w:tc>
         <w:tc>
           <w:tcPr>
-            <w:tcW w:w="5698" w:type="dxa"/>
+            <w:tcW w:w="5898" w:type="dxa"/>
           </w:tcPr>
           <w:p>
             <w:pPr>
@@ -430,7 +430,7 @@
               <w:rPr>
                 <w:sz w:val="18"/>
               </w:rPr>
-              <w:t xml:space="preserve">Initial proposal</w:t>
+              <w:t xml:space="preserve">Initial proposal.</w:t>
             </w:r>
           </w:p>
         </w:tc>
@@ -473,7 +473,7 @@
         </w:tc>
         <w:tc>
           <w:tcPr>
-            <w:tcW w:w="1900" w:type="dxa"/>
+            <w:tcW w:w="1700" w:type="dxa"/>
           </w:tcPr>
           <w:p>
             <w:pPr>
@@ -489,7 +489,7 @@
         </w:tc>
         <w:tc>
           <w:tcPr>
-            <w:tcW w:w="5698" w:type="dxa"/>
+            <w:tcW w:w="5898" w:type="dxa"/>
           </w:tcPr>
           <w:p>
             <w:pPr>
@@ -499,7 +499,7 @@
               <w:rPr>
                 <w:sz w:val="18"/>
               </w:rPr>
-              <w:t xml:space="preserve">Scope subquery for generated SQL; exact match for standard queries; early IT Administrator refusal</w:t>
+              <w:t xml:space="preserve">Scope subquery around generated SQL and exact match of standard-path queries to the predefined statement (8.3); SQL proposals only when approved metadata may be sent, with the setting EXTERNAL_METADATA_ENABLED (3.2); IT Administrator role refused before the AI service is called (6.2).</w:t>
             </w:r>
           </w:p>
         </w:tc>
@@ -542,7 +542,7 @@
         </w:tc>
         <w:tc>
           <w:tcPr>
-            <w:tcW w:w="1900" w:type="dxa"/>
+            <w:tcW w:w="1700" w:type="dxa"/>
           </w:tcPr>
           <w:p>
             <w:pPr>
@@ -552,13 +552,13 @@
               <w:rPr>
                 <w:sz w:val="18"/>
               </w:rPr>
-              <w:t xml:space="preserve">3.2, 6.1, 8.3 to 8.5, 9.4</w:t>
-            </w:r>
-          </w:p>
-        </w:tc>
-        <w:tc>
-          <w:tcPr>
-            <w:tcW w:w="5698" w:type="dxa"/>
+              <w:t xml:space="preserve">3.2, 6.1, 8.3, 8.4, 8.5, 9.4</w:t>
+            </w:r>
+          </w:p>
+        </w:tc>
+        <w:tc>
+          <w:tcPr>
+            <w:tcW w:w="5898" w:type="dxa"/>
           </w:tcPr>
           <w:p>
             <w:pPr>
@@ -568,7 +568,7 @@
               <w:rPr>
                 <w:sz w:val="18"/>
               </w:rPr>
-              <w:t xml:space="preserve">Optional rule-based reading; replies about data; 15-second limit; period check; rule-based chart choice</w:t>
+              <w:t xml:space="preserve">Optional reading of plain questions by backend rules (3.2, 6.1); replies about the data and the previous answer (3.2); query time limit of 15 seconds (8.3); no assumed period when the question has no time wording (8.4); chart chosen by rules from the shape of the result, with the AI service as fallback (8.5, 9.4).</w:t>
             </w:r>
           </w:p>
         </w:tc>
@@ -611,7 +611,7 @@
         </w:tc>
         <w:tc>
           <w:tcPr>
-            <w:tcW w:w="1900" w:type="dxa"/>
+            <w:tcW w:w="1700" w:type="dxa"/>
           </w:tcPr>
           <w:p>
             <w:pPr>
@@ -627,7 +627,7 @@
         </w:tc>
         <w:tc>
           <w:tcPr>
-            <w:tcW w:w="5698" w:type="dxa"/>
+            <w:tcW w:w="5898" w:type="dxa"/>
           </w:tcPr>
           <w:p>
             <w:pPr>
@@ -637,7 +637,7 @@
               <w:rPr>
                 <w:sz w:val="18"/>
               </w:rPr>
-              <w:t xml:space="preserve">Multi-request messages; period comparisons; fallback when AI is unavailable</w:t>
+              <w:t xml:space="preserve">Several requests in one message, up to five (8.4); comparison across named periods (8.4); a period named in the question takes precedence over the one the AI service chose (8.4); plain questions and short follow-ups still answered when the AI service is unavailable (6.1, 8.6).</w:t>
             </w:r>
           </w:p>
         </w:tc>
@@ -680,7 +680,7 @@
         </w:tc>
         <w:tc>
           <w:tcPr>
-            <w:tcW w:w="1900" w:type="dxa"/>
+            <w:tcW w:w="1700" w:type="dxa"/>
           </w:tcPr>
           <w:p>
             <w:pPr>
@@ -696,7 +696,7 @@
         </w:tc>
         <w:tc>
           <w:tcPr>
-            <w:tcW w:w="5698" w:type="dxa"/>
+            <w:tcW w:w="5898" w:type="dxa"/>
           </w:tcPr>
           <w:p>
             <w:pPr>
@@ -706,7 +706,7 @@
               <w:rPr>
                 <w:sz w:val="18"/>
               </w:rPr>
-              <w:t xml:space="preserve">SQL correction; row limits; busy-service message; named factory as filter</w:t>
+              <w:t xml:space="preserve">Correction of SQL that departs from the approved shape, at most twice (8.3); row limits of 100, 250 and 400 with a notice when a list is cut (8.3); provider limits reported as a busy service instead of a failure (8.6); a named factory always applied as a filter (8.4).</w:t>
             </w:r>
           </w:p>
         </w:tc>
@@ -749,7 +749,7 @@
         </w:tc>
         <w:tc>
           <w:tcPr>
-            <w:tcW w:w="1900" w:type="dxa"/>
+            <w:tcW w:w="1700" w:type="dxa"/>
           </w:tcPr>
           <w:p>
             <w:pPr>
@@ -765,7 +765,7 @@
         </w:tc>
         <w:tc>
           <w:tcPr>
-            <w:tcW w:w="5698" w:type="dxa"/>
+            <w:tcW w:w="5898" w:type="dxa"/>
           </w:tcPr>
           <w:p>
             <w:pPr>
@@ -775,7 +775,7 @@
               <w:rPr>
                 <w:sz w:val="18"/>
               </w:rPr>
-              <w:t xml:space="preserve">Amount masking; named-factory comparison</w:t>
+              <w:t xml:space="preserve">Amounts and decimal ratios of earlier answers replaced by a placeholder in the context sent to the AI service (3.2, 8.4); a comparison of named factories shows only those factories and states what was left out (8.4).</w:t>
             </w:r>
           </w:p>
         </w:tc>
@@ -818,7 +818,7 @@
         </w:tc>
         <w:tc>
           <w:tcPr>
-            <w:tcW w:w="1900" w:type="dxa"/>
+            <w:tcW w:w="1700" w:type="dxa"/>
           </w:tcPr>
           <w:p>
             <w:pPr>
@@ -834,7 +834,7 @@
         </w:tc>
         <w:tc>
           <w:tcPr>
-            <w:tcW w:w="5698" w:type="dxa"/>
+            <w:tcW w:w="5898" w:type="dxa"/>
           </w:tcPr>
           <w:p>
             <w:pPr>
@@ -844,7 +844,7 @@
               <w:rPr>
                 <w:sz w:val="18"/>
               </w:rPr>
-              <w:t xml:space="preserve">Data sent to external services</w:t>
+              <w:t xml:space="preserve">Added the section Data Sent to External Services: what each external AI call carries, what it never carries and which setting controls it.</w:t>
             </w:r>
           </w:p>
         </w:tc>
@@ -887,7 +887,7 @@
         </w:tc>
         <w:tc>
           <w:tcPr>
-            <w:tcW w:w="1900" w:type="dxa"/>
+            <w:tcW w:w="1700" w:type="dxa"/>
           </w:tcPr>
           <w:p>
             <w:pPr>
@@ -903,7 +903,7 @@
         </w:tc>
         <w:tc>
           <w:tcPr>
-            <w:tcW w:w="5698" w:type="dxa"/>
+            <w:tcW w:w="5898" w:type="dxa"/>
           </w:tcPr>
           <w:p>
             <w:pPr>
@@ -913,7 +913,7 @@
               <w:rPr>
                 <w:sz w:val="18"/>
               </w:rPr>
-              <w:t xml:space="preserve">Processing order; IT Administrator refusal</w:t>
+              <w:t xml:space="preserve">Interpretation step now reads plain questions by rules when enabled or when the AI service is unavailable; IT Administrator refusal described before the AI call.</w:t>
             </w:r>
           </w:p>
         </w:tc>
@@ -956,7 +956,7 @@
         </w:tc>
         <w:tc>
           <w:tcPr>
-            <w:tcW w:w="1900" w:type="dxa"/>
+            <w:tcW w:w="1700" w:type="dxa"/>
           </w:tcPr>
           <w:p>
             <w:pPr>
@@ -972,7 +972,7 @@
         </w:tc>
         <w:tc>
           <w:tcPr>
-            <w:tcW w:w="5698" w:type="dxa"/>
+            <w:tcW w:w="5898" w:type="dxa"/>
           </w:tcPr>
           <w:p>
             <w:pPr>
@@ -982,7 +982,7 @@
               <w:rPr>
                 <w:sz w:val="18"/>
               </w:rPr>
-              <w:t xml:space="preserve">Query limits; SQL correction; scope subquery</w:t>
+              <w:t xml:space="preserve">Query limits (15 seconds, row limits), the correction rule for SQL that departs from the approved shape, and the scope subquery around generated SQL.</w:t>
             </w:r>
           </w:p>
         </w:tc>
@@ -1025,7 +1025,7 @@
         </w:tc>
         <w:tc>
           <w:tcPr>
-            <w:tcW w:w="1900" w:type="dxa"/>
+            <w:tcW w:w="1700" w:type="dxa"/>
           </w:tcPr>
           <w:p>
             <w:pPr>
@@ -1041,7 +1041,7 @@
         </w:tc>
         <w:tc>
           <w:tcPr>
-            <w:tcW w:w="5698" w:type="dxa"/>
+            <w:tcW w:w="5898" w:type="dxa"/>
           </w:tcPr>
           <w:p>
             <w:pPr>
@@ -1051,7 +1051,7 @@
               <w:rPr>
                 <w:sz w:val="18"/>
               </w:rPr>
-              <w:t xml:space="preserve">Context; period check; comparisons; multi-request</w:t>
+              <w:t xml:space="preserve">Conversation context limited to six turns with amounts masked; period check against the question; comparisons; several requests in one message.</w:t>
             </w:r>
           </w:p>
         </w:tc>
@@ -1094,7 +1094,7 @@
         </w:tc>
         <w:tc>
           <w:tcPr>
-            <w:tcW w:w="1900" w:type="dxa"/>
+            <w:tcW w:w="1700" w:type="dxa"/>
           </w:tcPr>
           <w:p>
             <w:pPr>
@@ -1110,7 +1110,7 @@
         </w:tc>
         <w:tc>
           <w:tcPr>
-            <w:tcW w:w="5698" w:type="dxa"/>
+            <w:tcW w:w="5898" w:type="dxa"/>
           </w:tcPr>
           <w:p>
             <w:pPr>
@@ -1120,7 +1120,7 @@
               <w:rPr>
                 <w:sz w:val="18"/>
               </w:rPr>
-              <w:t xml:space="preserve">Rule-based chart choice</w:t>
+              <w:t xml:space="preserve">Visualization chosen by backend rules first, with the AI service as fallback.</w:t>
             </w:r>
           </w:p>
         </w:tc>
@@ -1163,7 +1163,7 @@
         </w:tc>
         <w:tc>
           <w:tcPr>
-            <w:tcW w:w="1900" w:type="dxa"/>
+            <w:tcW w:w="1700" w:type="dxa"/>
           </w:tcPr>
           <w:p>
             <w:pPr>
@@ -1179,7 +1179,7 @@
         </w:tc>
         <w:tc>
           <w:tcPr>
-            <w:tcW w:w="5698" w:type="dxa"/>
+            <w:tcW w:w="5898" w:type="dxa"/>
           </w:tcPr>
           <w:p>
             <w:pPr>
@@ -1189,7 +1189,7 @@
               <w:rPr>
                 <w:sz w:val="18"/>
               </w:rPr>
-              <w:t xml:space="preserve">Busy handling; provider operation</w:t>
+              <w:t xml:space="preserve">Busy-service handling for provider limits; provider operation for production and the temporary rotation of free providers during the demonstration period.</w:t>
             </w:r>
           </w:p>
         </w:tc>
@@ -1232,7 +1232,7 @@
         </w:tc>
         <w:tc>
           <w:tcPr>
-            <w:tcW w:w="1900" w:type="dxa"/>
+            <w:tcW w:w="1700" w:type="dxa"/>
           </w:tcPr>
           <w:p>
             <w:pPr>
@@ -1248,7 +1248,7 @@
         </w:tc>
         <w:tc>
           <w:tcPr>
-            <w:tcW w:w="5698" w:type="dxa"/>
+            <w:tcW w:w="5898" w:type="dxa"/>
           </w:tcPr>
           <w:p>
             <w:pPr>
@@ -1258,7 +1258,7 @@
               <w:rPr>
                 <w:sz w:val="18"/>
               </w:rPr>
-              <w:t xml:space="preserve">Additional mitigations</w:t>
+              <w:t xml:space="preserve">Additional mitigations: provider terms review, data classification, independent penetration test, paid plan or offline model.</w:t>
             </w:r>
           </w:p>
         </w:tc>
@@ -1301,7 +1301,7 @@
         </w:tc>
         <w:tc>
           <w:tcPr>
-            <w:tcW w:w="1900" w:type="dxa"/>
+            <w:tcW w:w="1700" w:type="dxa"/>
           </w:tcPr>
           <w:p>
             <w:pPr>
@@ -1317,7 +1317,7 @@
         </w:tc>
         <w:tc>
           <w:tcPr>
-            <w:tcW w:w="5698" w:type="dxa"/>
+            <w:tcW w:w="5898" w:type="dxa"/>
           </w:tcPr>
           <w:p>
             <w:pPr>
@@ -1327,7 +1327,7 @@
               <w:rPr>
                 <w:sz w:val="18"/>
               </w:rPr>
-              <w:t xml:space="preserve">Indicative AI cost</w:t>
+              <w:t xml:space="preserve">Indicative AI cost for the API and the offline server, with break-even range.</w:t>
             </w:r>
           </w:p>
         </w:tc>
@@ -1370,7 +1370,7 @@
         </w:tc>
         <w:tc>
           <w:tcPr>
-            <w:tcW w:w="1900" w:type="dxa"/>
+            <w:tcW w:w="1700" w:type="dxa"/>
           </w:tcPr>
           <w:p>
             <w:pPr>
@@ -1386,7 +1386,7 @@
         </w:tc>
         <w:tc>
           <w:tcPr>
-            <w:tcW w:w="5698" w:type="dxa"/>
+            <w:tcW w:w="5898" w:type="dxa"/>
           </w:tcPr>
           <w:p>
             <w:pPr>
@@ -1396,7 +1396,7 @@
               <w:rPr>
                 <w:sz w:val="18"/>
               </w:rPr>
-              <w:t xml:space="preserve">Revision history; spelling; numbering</w:t>
+              <w:t xml:space="preserve">Revision history, spelling corrections and section numbering.</w:t>
             </w:r>
           </w:p>
         </w:tc>

</xml_diff>

<commit_message>
Restore the single-day revision history of v1.1
</commit_message>
<xml_diff>
--- a/docs/ACBI_Technical_Solution_Proposal_v1.1.docx
+++ b/docs/ACBI_Technical_Solution_Proposal_v1.1.docx
@@ -266,11 +266,6 @@
         <w:t xml:space="preserve">Revision History</w:t>
       </w:r>
     </w:p>
-    <w:p>
-      <w:r>
-        <w:t xml:space="preserve">Version 1.1 describes the prototype as of 14/10/2026. The table lists, day by day, when each behavior now described in this document entered the prototype; the document itself was revised on 14/10/2026, as itemized in the last rows.</w:t>
-      </w:r>
-    </w:p>
     <w:tbl>
       <w:tblPr>
         <w:tblStyle w:val="TableGrid"/>
@@ -279,10 +274,9 @@
         <w:tblLook w:val="04A0" w:firstRow="1" w:lastRow="0" w:firstColumn="1" w:lastColumn="0" w:noHBand="0" w:noVBand="1"/>
       </w:tblPr>
       <w:tblGrid>
-        <w:gridCol w:w="800"/>
-        <w:gridCol w:w="1250"/>
-        <w:gridCol w:w="1700"/>
-        <w:gridCol w:w="5898"/>
+        <w:gridCol w:w="1100"/>
+        <w:gridCol w:w="1400"/>
+        <w:gridCol w:w="7148"/>
       </w:tblGrid>
       <w:tr>
         <w:trPr>
@@ -291,7 +285,7 @@
         </w:trPr>
         <w:tc>
           <w:tcPr>
-            <w:tcW w:w="800" w:type="dxa"/>
+            <w:tcW w:w="1100" w:type="dxa"/>
             <w:shd w:val="clear" w:color="auto" w:fill="D9EAF7"/>
           </w:tcPr>
           <w:p>
@@ -310,7 +304,7 @@
         </w:tc>
         <w:tc>
           <w:tcPr>
-            <w:tcW w:w="1250" w:type="dxa"/>
+            <w:tcW w:w="1400" w:type="dxa"/>
             <w:shd w:val="clear" w:color="auto" w:fill="D9EAF7"/>
           </w:tcPr>
           <w:p>
@@ -329,7 +323,7 @@
         </w:tc>
         <w:tc>
           <w:tcPr>
-            <w:tcW w:w="1700" w:type="dxa"/>
+            <w:tcW w:w="7148" w:type="dxa"/>
             <w:shd w:val="clear" w:color="auto" w:fill="D9EAF7"/>
           </w:tcPr>
           <w:p>
@@ -342,26 +336,7 @@
                 <w:bCs/>
                 <w:sz w:val="20"/>
               </w:rPr>
-              <w:t xml:space="preserve">Sections</w:t>
-            </w:r>
-          </w:p>
-        </w:tc>
-        <w:tc>
-          <w:tcPr>
-            <w:tcW w:w="5898" w:type="dxa"/>
-            <w:shd w:val="clear" w:color="auto" w:fill="D9EAF7"/>
-          </w:tcPr>
-          <w:p>
-            <w:pPr>
-              <w:spacing w:after="0"/>
-            </w:pPr>
-            <w:r>
-              <w:rPr>
-                <w:b/>
-                <w:bCs/>
-                <w:sz w:val="20"/>
-              </w:rPr>
-              <w:t xml:space="preserve">Change</w:t>
+              <w:t xml:space="preserve">Changes</w:t>
             </w:r>
           </w:p>
         </w:tc>
@@ -372,7 +347,7 @@
         </w:trPr>
         <w:tc>
           <w:tcPr>
-            <w:tcW w:w="800" w:type="dxa"/>
+            <w:tcW w:w="1100" w:type="dxa"/>
           </w:tcPr>
           <w:p>
             <w:pPr>
@@ -388,7 +363,7 @@
         </w:tc>
         <w:tc>
           <w:tcPr>
-            <w:tcW w:w="1250" w:type="dxa"/>
+            <w:tcW w:w="1400" w:type="dxa"/>
           </w:tcPr>
           <w:p>
             <w:pPr>
@@ -404,23 +379,7 @@
         </w:tc>
         <w:tc>
           <w:tcPr>
-            <w:tcW w:w="1700" w:type="dxa"/>
-          </w:tcPr>
-          <w:p>
-            <w:pPr>
-              <w:spacing w:after="0"/>
-            </w:pPr>
-            <w:r>
-              <w:rPr>
-                <w:sz w:val="18"/>
-              </w:rPr>
-              <w:t xml:space="preserve">All</w:t>
-            </w:r>
-          </w:p>
-        </w:tc>
-        <w:tc>
-          <w:tcPr>
-            <w:tcW w:w="5898" w:type="dxa"/>
+            <w:tcW w:w="7148" w:type="dxa"/>
           </w:tcPr>
           <w:p>
             <w:pPr>
@@ -441,7 +400,7 @@
         </w:trPr>
         <w:tc>
           <w:tcPr>
-            <w:tcW w:w="800" w:type="dxa"/>
+            <w:tcW w:w="1100" w:type="dxa"/>
           </w:tcPr>
           <w:p>
             <w:pPr>
@@ -457,7 +416,7 @@
         </w:tc>
         <w:tc>
           <w:tcPr>
-            <w:tcW w:w="1250" w:type="dxa"/>
+            <w:tcW w:w="1400" w:type="dxa"/>
           </w:tcPr>
           <w:p>
             <w:pPr>
@@ -467,13 +426,13 @@
               <w:rPr>
                 <w:sz w:val="18"/>
               </w:rPr>
-              <w:t xml:space="preserve">20/9/2026</w:t>
-            </w:r>
-          </w:p>
-        </w:tc>
-        <w:tc>
-          <w:tcPr>
-            <w:tcW w:w="1700" w:type="dxa"/>
+              <w:t xml:space="preserve">14/10/2026</w:t>
+            </w:r>
+          </w:p>
+        </w:tc>
+        <w:tc>
+          <w:tcPr>
+            <w:tcW w:w="7148" w:type="dxa"/>
           </w:tcPr>
           <w:p>
             <w:pPr>
@@ -483,920 +442,7 @@
               <w:rPr>
                 <w:sz w:val="18"/>
               </w:rPr>
-              <w:t xml:space="preserve">3.2, 6.2, 8.3</w:t>
-            </w:r>
-          </w:p>
-        </w:tc>
-        <w:tc>
-          <w:tcPr>
-            <w:tcW w:w="5898" w:type="dxa"/>
-          </w:tcPr>
-          <w:p>
-            <w:pPr>
-              <w:spacing w:after="0"/>
-            </w:pPr>
-            <w:r>
-              <w:rPr>
-                <w:sz w:val="18"/>
-              </w:rPr>
-              <w:t xml:space="preserve">Scope subquery around generated SQL and exact match of standard-path queries to the predefined statement (8.3); SQL proposals only when approved metadata may be sent, with the setting EXTERNAL_METADATA_ENABLED (3.2); IT Administrator role refused before the AI service is called (6.2).</w:t>
-            </w:r>
-          </w:p>
-        </w:tc>
-      </w:tr>
-      <w:tr>
-        <w:trPr>
-          <w:jc w:val="center"/>
-        </w:trPr>
-        <w:tc>
-          <w:tcPr>
-            <w:tcW w:w="800" w:type="dxa"/>
-          </w:tcPr>
-          <w:p>
-            <w:pPr>
-              <w:spacing w:after="0"/>
-            </w:pPr>
-            <w:r>
-              <w:rPr>
-                <w:sz w:val="18"/>
-              </w:rPr>
-              <w:t xml:space="preserve">1.1</w:t>
-            </w:r>
-          </w:p>
-        </w:tc>
-        <w:tc>
-          <w:tcPr>
-            <w:tcW w:w="1250" w:type="dxa"/>
-          </w:tcPr>
-          <w:p>
-            <w:pPr>
-              <w:spacing w:after="0"/>
-            </w:pPr>
-            <w:r>
-              <w:rPr>
-                <w:sz w:val="18"/>
-              </w:rPr>
-              <w:t xml:space="preserve">21/9/2026</w:t>
-            </w:r>
-          </w:p>
-        </w:tc>
-        <w:tc>
-          <w:tcPr>
-            <w:tcW w:w="1700" w:type="dxa"/>
-          </w:tcPr>
-          <w:p>
-            <w:pPr>
-              <w:spacing w:after="0"/>
-            </w:pPr>
-            <w:r>
-              <w:rPr>
-                <w:sz w:val="18"/>
-              </w:rPr>
-              <w:t xml:space="preserve">3.2, 6.1, 8.3, 8.4, 8.5, 9.4</w:t>
-            </w:r>
-          </w:p>
-        </w:tc>
-        <w:tc>
-          <w:tcPr>
-            <w:tcW w:w="5898" w:type="dxa"/>
-          </w:tcPr>
-          <w:p>
-            <w:pPr>
-              <w:spacing w:after="0"/>
-            </w:pPr>
-            <w:r>
-              <w:rPr>
-                <w:sz w:val="18"/>
-              </w:rPr>
-              <w:t xml:space="preserve">Optional reading of plain questions by backend rules (3.2, 6.1); replies about the data and the previous answer (3.2); query time limit of 15 seconds (8.3); no assumed period when the question has no time wording (8.4); chart chosen by rules from the shape of the result, with the AI service as fallback (8.5, 9.4).</w:t>
-            </w:r>
-          </w:p>
-        </w:tc>
-      </w:tr>
-      <w:tr>
-        <w:trPr>
-          <w:jc w:val="center"/>
-        </w:trPr>
-        <w:tc>
-          <w:tcPr>
-            <w:tcW w:w="800" w:type="dxa"/>
-          </w:tcPr>
-          <w:p>
-            <w:pPr>
-              <w:spacing w:after="0"/>
-            </w:pPr>
-            <w:r>
-              <w:rPr>
-                <w:sz w:val="18"/>
-              </w:rPr>
-              <w:t xml:space="preserve">1.1</w:t>
-            </w:r>
-          </w:p>
-        </w:tc>
-        <w:tc>
-          <w:tcPr>
-            <w:tcW w:w="1250" w:type="dxa"/>
-          </w:tcPr>
-          <w:p>
-            <w:pPr>
-              <w:spacing w:after="0"/>
-            </w:pPr>
-            <w:r>
-              <w:rPr>
-                <w:sz w:val="18"/>
-              </w:rPr>
-              <w:t xml:space="preserve">24/9/2026</w:t>
-            </w:r>
-          </w:p>
-        </w:tc>
-        <w:tc>
-          <w:tcPr>
-            <w:tcW w:w="1700" w:type="dxa"/>
-          </w:tcPr>
-          <w:p>
-            <w:pPr>
-              <w:spacing w:after="0"/>
-            </w:pPr>
-            <w:r>
-              <w:rPr>
-                <w:sz w:val="18"/>
-              </w:rPr>
-              <w:t xml:space="preserve">6.1, 8.4, 8.6</w:t>
-            </w:r>
-          </w:p>
-        </w:tc>
-        <w:tc>
-          <w:tcPr>
-            <w:tcW w:w="5898" w:type="dxa"/>
-          </w:tcPr>
-          <w:p>
-            <w:pPr>
-              <w:spacing w:after="0"/>
-            </w:pPr>
-            <w:r>
-              <w:rPr>
-                <w:sz w:val="18"/>
-              </w:rPr>
-              <w:t xml:space="preserve">Several requests in one message, up to five (8.4); comparison across named periods (8.4); a period named in the question takes precedence over the one the AI service chose (8.4); plain questions and short follow-ups still answered when the AI service is unavailable (6.1, 8.6).</w:t>
-            </w:r>
-          </w:p>
-        </w:tc>
-      </w:tr>
-      <w:tr>
-        <w:trPr>
-          <w:jc w:val="center"/>
-        </w:trPr>
-        <w:tc>
-          <w:tcPr>
-            <w:tcW w:w="800" w:type="dxa"/>
-          </w:tcPr>
-          <w:p>
-            <w:pPr>
-              <w:spacing w:after="0"/>
-            </w:pPr>
-            <w:r>
-              <w:rPr>
-                <w:sz w:val="18"/>
-              </w:rPr>
-              <w:t xml:space="preserve">1.1</w:t>
-            </w:r>
-          </w:p>
-        </w:tc>
-        <w:tc>
-          <w:tcPr>
-            <w:tcW w:w="1250" w:type="dxa"/>
-          </w:tcPr>
-          <w:p>
-            <w:pPr>
-              <w:spacing w:after="0"/>
-            </w:pPr>
-            <w:r>
-              <w:rPr>
-                <w:sz w:val="18"/>
-              </w:rPr>
-              <w:t xml:space="preserve">10/10/2026</w:t>
-            </w:r>
-          </w:p>
-        </w:tc>
-        <w:tc>
-          <w:tcPr>
-            <w:tcW w:w="1700" w:type="dxa"/>
-          </w:tcPr>
-          <w:p>
-            <w:pPr>
-              <w:spacing w:after="0"/>
-            </w:pPr>
-            <w:r>
-              <w:rPr>
-                <w:sz w:val="18"/>
-              </w:rPr>
-              <w:t xml:space="preserve">8.3, 8.4, 8.6</w:t>
-            </w:r>
-          </w:p>
-        </w:tc>
-        <w:tc>
-          <w:tcPr>
-            <w:tcW w:w="5898" w:type="dxa"/>
-          </w:tcPr>
-          <w:p>
-            <w:pPr>
-              <w:spacing w:after="0"/>
-            </w:pPr>
-            <w:r>
-              <w:rPr>
-                <w:sz w:val="18"/>
-              </w:rPr>
-              <w:t xml:space="preserve">Correction of SQL that departs from the approved shape, at most twice (8.3); row limits of 100, 250 and 400 with a notice when a list is cut (8.3); provider limits reported as a busy service instead of a failure (8.6); a named factory always applied as a filter (8.4).</w:t>
-            </w:r>
-          </w:p>
-        </w:tc>
-      </w:tr>
-      <w:tr>
-        <w:trPr>
-          <w:jc w:val="center"/>
-        </w:trPr>
-        <w:tc>
-          <w:tcPr>
-            <w:tcW w:w="800" w:type="dxa"/>
-          </w:tcPr>
-          <w:p>
-            <w:pPr>
-              <w:spacing w:after="0"/>
-            </w:pPr>
-            <w:r>
-              <w:rPr>
-                <w:sz w:val="18"/>
-              </w:rPr>
-              <w:t xml:space="preserve">1.1</w:t>
-            </w:r>
-          </w:p>
-        </w:tc>
-        <w:tc>
-          <w:tcPr>
-            <w:tcW w:w="1250" w:type="dxa"/>
-          </w:tcPr>
-          <w:p>
-            <w:pPr>
-              <w:spacing w:after="0"/>
-            </w:pPr>
-            <w:r>
-              <w:rPr>
-                <w:sz w:val="18"/>
-              </w:rPr>
-              <w:t xml:space="preserve">13/10/2026</w:t>
-            </w:r>
-          </w:p>
-        </w:tc>
-        <w:tc>
-          <w:tcPr>
-            <w:tcW w:w="1700" w:type="dxa"/>
-          </w:tcPr>
-          <w:p>
-            <w:pPr>
-              <w:spacing w:after="0"/>
-            </w:pPr>
-            <w:r>
-              <w:rPr>
-                <w:sz w:val="18"/>
-              </w:rPr>
-              <w:t xml:space="preserve">3.2, 8.4</w:t>
-            </w:r>
-          </w:p>
-        </w:tc>
-        <w:tc>
-          <w:tcPr>
-            <w:tcW w:w="5898" w:type="dxa"/>
-          </w:tcPr>
-          <w:p>
-            <w:pPr>
-              <w:spacing w:after="0"/>
-            </w:pPr>
-            <w:r>
-              <w:rPr>
-                <w:sz w:val="18"/>
-              </w:rPr>
-              <w:t xml:space="preserve">Amounts and decimal ratios of earlier answers replaced by a placeholder in the context sent to the AI service (3.2, 8.4); a comparison of named factories shows only those factories and states what was left out (8.4).</w:t>
-            </w:r>
-          </w:p>
-        </w:tc>
-      </w:tr>
-      <w:tr>
-        <w:trPr>
-          <w:jc w:val="center"/>
-        </w:trPr>
-        <w:tc>
-          <w:tcPr>
-            <w:tcW w:w="800" w:type="dxa"/>
-          </w:tcPr>
-          <w:p>
-            <w:pPr>
-              <w:spacing w:after="0"/>
-            </w:pPr>
-            <w:r>
-              <w:rPr>
-                <w:sz w:val="18"/>
-              </w:rPr>
-              <w:t xml:space="preserve">1.1</w:t>
-            </w:r>
-          </w:p>
-        </w:tc>
-        <w:tc>
-          <w:tcPr>
-            <w:tcW w:w="1250" w:type="dxa"/>
-          </w:tcPr>
-          <w:p>
-            <w:pPr>
-              <w:spacing w:after="0"/>
-            </w:pPr>
-            <w:r>
-              <w:rPr>
-                <w:sz w:val="18"/>
-              </w:rPr>
-              <w:t xml:space="preserve">14/10/2026</w:t>
-            </w:r>
-          </w:p>
-        </w:tc>
-        <w:tc>
-          <w:tcPr>
-            <w:tcW w:w="1700" w:type="dxa"/>
-          </w:tcPr>
-          <w:p>
-            <w:pPr>
-              <w:spacing w:after="0"/>
-            </w:pPr>
-            <w:r>
-              <w:rPr>
-                <w:sz w:val="18"/>
-              </w:rPr>
-              <w:t xml:space="preserve">3.2</w:t>
-            </w:r>
-          </w:p>
-        </w:tc>
-        <w:tc>
-          <w:tcPr>
-            <w:tcW w:w="5898" w:type="dxa"/>
-          </w:tcPr>
-          <w:p>
-            <w:pPr>
-              <w:spacing w:after="0"/>
-            </w:pPr>
-            <w:r>
-              <w:rPr>
-                <w:sz w:val="18"/>
-              </w:rPr>
-              <w:t xml:space="preserve">Added the section Data Sent to External Services: what each external AI call carries, what it never carries and which setting controls it.</w:t>
-            </w:r>
-          </w:p>
-        </w:tc>
-      </w:tr>
-      <w:tr>
-        <w:trPr>
-          <w:jc w:val="center"/>
-        </w:trPr>
-        <w:tc>
-          <w:tcPr>
-            <w:tcW w:w="800" w:type="dxa"/>
-          </w:tcPr>
-          <w:p>
-            <w:pPr>
-              <w:spacing w:after="0"/>
-            </w:pPr>
-            <w:r>
-              <w:rPr>
-                <w:sz w:val="18"/>
-              </w:rPr>
-              <w:t xml:space="preserve">1.1</w:t>
-            </w:r>
-          </w:p>
-        </w:tc>
-        <w:tc>
-          <w:tcPr>
-            <w:tcW w:w="1250" w:type="dxa"/>
-          </w:tcPr>
-          <w:p>
-            <w:pPr>
-              <w:spacing w:after="0"/>
-            </w:pPr>
-            <w:r>
-              <w:rPr>
-                <w:sz w:val="18"/>
-              </w:rPr>
-              <w:t xml:space="preserve">14/10/2026</w:t>
-            </w:r>
-          </w:p>
-        </w:tc>
-        <w:tc>
-          <w:tcPr>
-            <w:tcW w:w="1700" w:type="dxa"/>
-          </w:tcPr>
-          <w:p>
-            <w:pPr>
-              <w:spacing w:after="0"/>
-            </w:pPr>
-            <w:r>
-              <w:rPr>
-                <w:sz w:val="18"/>
-              </w:rPr>
-              <w:t xml:space="preserve">6.1, 6.2</w:t>
-            </w:r>
-          </w:p>
-        </w:tc>
-        <w:tc>
-          <w:tcPr>
-            <w:tcW w:w="5898" w:type="dxa"/>
-          </w:tcPr>
-          <w:p>
-            <w:pPr>
-              <w:spacing w:after="0"/>
-            </w:pPr>
-            <w:r>
-              <w:rPr>
-                <w:sz w:val="18"/>
-              </w:rPr>
-              <w:t xml:space="preserve">Interpretation step now reads plain questions by rules when enabled or when the AI service is unavailable; IT Administrator refusal described before the AI call.</w:t>
-            </w:r>
-          </w:p>
-        </w:tc>
-      </w:tr>
-      <w:tr>
-        <w:trPr>
-          <w:jc w:val="center"/>
-        </w:trPr>
-        <w:tc>
-          <w:tcPr>
-            <w:tcW w:w="800" w:type="dxa"/>
-          </w:tcPr>
-          <w:p>
-            <w:pPr>
-              <w:spacing w:after="0"/>
-            </w:pPr>
-            <w:r>
-              <w:rPr>
-                <w:sz w:val="18"/>
-              </w:rPr>
-              <w:t xml:space="preserve">1.1</w:t>
-            </w:r>
-          </w:p>
-        </w:tc>
-        <w:tc>
-          <w:tcPr>
-            <w:tcW w:w="1250" w:type="dxa"/>
-          </w:tcPr>
-          <w:p>
-            <w:pPr>
-              <w:spacing w:after="0"/>
-            </w:pPr>
-            <w:r>
-              <w:rPr>
-                <w:sz w:val="18"/>
-              </w:rPr>
-              <w:t xml:space="preserve">14/10/2026</w:t>
-            </w:r>
-          </w:p>
-        </w:tc>
-        <w:tc>
-          <w:tcPr>
-            <w:tcW w:w="1700" w:type="dxa"/>
-          </w:tcPr>
-          <w:p>
-            <w:pPr>
-              <w:spacing w:after="0"/>
-            </w:pPr>
-            <w:r>
-              <w:rPr>
-                <w:sz w:val="18"/>
-              </w:rPr>
-              <w:t xml:space="preserve">8.3</w:t>
-            </w:r>
-          </w:p>
-        </w:tc>
-        <w:tc>
-          <w:tcPr>
-            <w:tcW w:w="5898" w:type="dxa"/>
-          </w:tcPr>
-          <w:p>
-            <w:pPr>
-              <w:spacing w:after="0"/>
-            </w:pPr>
-            <w:r>
-              <w:rPr>
-                <w:sz w:val="18"/>
-              </w:rPr>
-              <w:t xml:space="preserve">Query limits (15 seconds, row limits), the correction rule for SQL that departs from the approved shape, and the scope subquery around generated SQL.</w:t>
-            </w:r>
-          </w:p>
-        </w:tc>
-      </w:tr>
-      <w:tr>
-        <w:trPr>
-          <w:jc w:val="center"/>
-        </w:trPr>
-        <w:tc>
-          <w:tcPr>
-            <w:tcW w:w="800" w:type="dxa"/>
-          </w:tcPr>
-          <w:p>
-            <w:pPr>
-              <w:spacing w:after="0"/>
-            </w:pPr>
-            <w:r>
-              <w:rPr>
-                <w:sz w:val="18"/>
-              </w:rPr>
-              <w:t xml:space="preserve">1.1</w:t>
-            </w:r>
-          </w:p>
-        </w:tc>
-        <w:tc>
-          <w:tcPr>
-            <w:tcW w:w="1250" w:type="dxa"/>
-          </w:tcPr>
-          <w:p>
-            <w:pPr>
-              <w:spacing w:after="0"/>
-            </w:pPr>
-            <w:r>
-              <w:rPr>
-                <w:sz w:val="18"/>
-              </w:rPr>
-              <w:t xml:space="preserve">14/10/2026</w:t>
-            </w:r>
-          </w:p>
-        </w:tc>
-        <w:tc>
-          <w:tcPr>
-            <w:tcW w:w="1700" w:type="dxa"/>
-          </w:tcPr>
-          <w:p>
-            <w:pPr>
-              <w:spacing w:after="0"/>
-            </w:pPr>
-            <w:r>
-              <w:rPr>
-                <w:sz w:val="18"/>
-              </w:rPr>
-              <w:t xml:space="preserve">8.4</w:t>
-            </w:r>
-          </w:p>
-        </w:tc>
-        <w:tc>
-          <w:tcPr>
-            <w:tcW w:w="5898" w:type="dxa"/>
-          </w:tcPr>
-          <w:p>
-            <w:pPr>
-              <w:spacing w:after="0"/>
-            </w:pPr>
-            <w:r>
-              <w:rPr>
-                <w:sz w:val="18"/>
-              </w:rPr>
-              <w:t xml:space="preserve">Conversation context limited to six turns with amounts masked; period check against the question; comparisons; several requests in one message.</w:t>
-            </w:r>
-          </w:p>
-        </w:tc>
-      </w:tr>
-      <w:tr>
-        <w:trPr>
-          <w:jc w:val="center"/>
-        </w:trPr>
-        <w:tc>
-          <w:tcPr>
-            <w:tcW w:w="800" w:type="dxa"/>
-          </w:tcPr>
-          <w:p>
-            <w:pPr>
-              <w:spacing w:after="0"/>
-            </w:pPr>
-            <w:r>
-              <w:rPr>
-                <w:sz w:val="18"/>
-              </w:rPr>
-              <w:t xml:space="preserve">1.1</w:t>
-            </w:r>
-          </w:p>
-        </w:tc>
-        <w:tc>
-          <w:tcPr>
-            <w:tcW w:w="1250" w:type="dxa"/>
-          </w:tcPr>
-          <w:p>
-            <w:pPr>
-              <w:spacing w:after="0"/>
-            </w:pPr>
-            <w:r>
-              <w:rPr>
-                <w:sz w:val="18"/>
-              </w:rPr>
-              <w:t xml:space="preserve">14/10/2026</w:t>
-            </w:r>
-          </w:p>
-        </w:tc>
-        <w:tc>
-          <w:tcPr>
-            <w:tcW w:w="1700" w:type="dxa"/>
-          </w:tcPr>
-          <w:p>
-            <w:pPr>
-              <w:spacing w:after="0"/>
-            </w:pPr>
-            <w:r>
-              <w:rPr>
-                <w:sz w:val="18"/>
-              </w:rPr>
-              <w:t xml:space="preserve">8.5, 9.4</w:t>
-            </w:r>
-          </w:p>
-        </w:tc>
-        <w:tc>
-          <w:tcPr>
-            <w:tcW w:w="5898" w:type="dxa"/>
-          </w:tcPr>
-          <w:p>
-            <w:pPr>
-              <w:spacing w:after="0"/>
-            </w:pPr>
-            <w:r>
-              <w:rPr>
-                <w:sz w:val="18"/>
-              </w:rPr>
-              <w:t xml:space="preserve">Visualization chosen by backend rules first, with the AI service as fallback.</w:t>
-            </w:r>
-          </w:p>
-        </w:tc>
-      </w:tr>
-      <w:tr>
-        <w:trPr>
-          <w:jc w:val="center"/>
-        </w:trPr>
-        <w:tc>
-          <w:tcPr>
-            <w:tcW w:w="800" w:type="dxa"/>
-          </w:tcPr>
-          <w:p>
-            <w:pPr>
-              <w:spacing w:after="0"/>
-            </w:pPr>
-            <w:r>
-              <w:rPr>
-                <w:sz w:val="18"/>
-              </w:rPr>
-              <w:t xml:space="preserve">1.1</w:t>
-            </w:r>
-          </w:p>
-        </w:tc>
-        <w:tc>
-          <w:tcPr>
-            <w:tcW w:w="1250" w:type="dxa"/>
-          </w:tcPr>
-          <w:p>
-            <w:pPr>
-              <w:spacing w:after="0"/>
-            </w:pPr>
-            <w:r>
-              <w:rPr>
-                <w:sz w:val="18"/>
-              </w:rPr>
-              <w:t xml:space="preserve">14/10/2026</w:t>
-            </w:r>
-          </w:p>
-        </w:tc>
-        <w:tc>
-          <w:tcPr>
-            <w:tcW w:w="1700" w:type="dxa"/>
-          </w:tcPr>
-          <w:p>
-            <w:pPr>
-              <w:spacing w:after="0"/>
-            </w:pPr>
-            <w:r>
-              <w:rPr>
-                <w:sz w:val="18"/>
-              </w:rPr>
-              <w:t xml:space="preserve">8.6, 9.2</w:t>
-            </w:r>
-          </w:p>
-        </w:tc>
-        <w:tc>
-          <w:tcPr>
-            <w:tcW w:w="5898" w:type="dxa"/>
-          </w:tcPr>
-          <w:p>
-            <w:pPr>
-              <w:spacing w:after="0"/>
-            </w:pPr>
-            <w:r>
-              <w:rPr>
-                <w:sz w:val="18"/>
-              </w:rPr>
-              <w:t xml:space="preserve">Busy-service handling for provider limits; provider operation for production and the temporary rotation of free providers during the demonstration period.</w:t>
-            </w:r>
-          </w:p>
-        </w:tc>
-      </w:tr>
-      <w:tr>
-        <w:trPr>
-          <w:jc w:val="center"/>
-        </w:trPr>
-        <w:tc>
-          <w:tcPr>
-            <w:tcW w:w="800" w:type="dxa"/>
-          </w:tcPr>
-          <w:p>
-            <w:pPr>
-              <w:spacing w:after="0"/>
-            </w:pPr>
-            <w:r>
-              <w:rPr>
-                <w:sz w:val="18"/>
-              </w:rPr>
-              <w:t xml:space="preserve">1.1</w:t>
-            </w:r>
-          </w:p>
-        </w:tc>
-        <w:tc>
-          <w:tcPr>
-            <w:tcW w:w="1250" w:type="dxa"/>
-          </w:tcPr>
-          <w:p>
-            <w:pPr>
-              <w:spacing w:after="0"/>
-            </w:pPr>
-            <w:r>
-              <w:rPr>
-                <w:sz w:val="18"/>
-              </w:rPr>
-              <w:t xml:space="preserve">14/10/2026</w:t>
-            </w:r>
-          </w:p>
-        </w:tc>
-        <w:tc>
-          <w:tcPr>
-            <w:tcW w:w="1700" w:type="dxa"/>
-          </w:tcPr>
-          <w:p>
-            <w:pPr>
-              <w:spacing w:after="0"/>
-            </w:pPr>
-            <w:r>
-              <w:rPr>
-                <w:sz w:val="18"/>
-              </w:rPr>
-              <w:t xml:space="preserve">11.2, 11.3</w:t>
-            </w:r>
-          </w:p>
-        </w:tc>
-        <w:tc>
-          <w:tcPr>
-            <w:tcW w:w="5898" w:type="dxa"/>
-          </w:tcPr>
-          <w:p>
-            <w:pPr>
-              <w:spacing w:after="0"/>
-            </w:pPr>
-            <w:r>
-              <w:rPr>
-                <w:sz w:val="18"/>
-              </w:rPr>
-              <w:t xml:space="preserve">Additional mitigations: provider terms review, data classification, independent penetration test, paid plan or offline model.</w:t>
-            </w:r>
-          </w:p>
-        </w:tc>
-      </w:tr>
-      <w:tr>
-        <w:trPr>
-          <w:jc w:val="center"/>
-        </w:trPr>
-        <w:tc>
-          <w:tcPr>
-            <w:tcW w:w="800" w:type="dxa"/>
-          </w:tcPr>
-          <w:p>
-            <w:pPr>
-              <w:spacing w:after="0"/>
-            </w:pPr>
-            <w:r>
-              <w:rPr>
-                <w:sz w:val="18"/>
-              </w:rPr>
-              <w:t xml:space="preserve">1.1</w:t>
-            </w:r>
-          </w:p>
-        </w:tc>
-        <w:tc>
-          <w:tcPr>
-            <w:tcW w:w="1250" w:type="dxa"/>
-          </w:tcPr>
-          <w:p>
-            <w:pPr>
-              <w:spacing w:after="0"/>
-            </w:pPr>
-            <w:r>
-              <w:rPr>
-                <w:sz w:val="18"/>
-              </w:rPr>
-              <w:t xml:space="preserve">14/10/2026</w:t>
-            </w:r>
-          </w:p>
-        </w:tc>
-        <w:tc>
-          <w:tcPr>
-            <w:tcW w:w="1700" w:type="dxa"/>
-          </w:tcPr>
-          <w:p>
-            <w:pPr>
-              <w:spacing w:after="0"/>
-            </w:pPr>
-            <w:r>
-              <w:rPr>
-                <w:sz w:val="18"/>
-              </w:rPr>
-              <w:t xml:space="preserve">Appendix B</w:t>
-            </w:r>
-          </w:p>
-        </w:tc>
-        <w:tc>
-          <w:tcPr>
-            <w:tcW w:w="5898" w:type="dxa"/>
-          </w:tcPr>
-          <w:p>
-            <w:pPr>
-              <w:spacing w:after="0"/>
-            </w:pPr>
-            <w:r>
-              <w:rPr>
-                <w:sz w:val="18"/>
-              </w:rPr>
-              <w:t xml:space="preserve">Indicative AI cost for the API and the offline server, with break-even range.</w:t>
-            </w:r>
-          </w:p>
-        </w:tc>
-      </w:tr>
-      <w:tr>
-        <w:trPr>
-          <w:jc w:val="center"/>
-        </w:trPr>
-        <w:tc>
-          <w:tcPr>
-            <w:tcW w:w="800" w:type="dxa"/>
-          </w:tcPr>
-          <w:p>
-            <w:pPr>
-              <w:spacing w:after="0"/>
-            </w:pPr>
-            <w:r>
-              <w:rPr>
-                <w:sz w:val="18"/>
-              </w:rPr>
-              <w:t xml:space="preserve">1.1</w:t>
-            </w:r>
-          </w:p>
-        </w:tc>
-        <w:tc>
-          <w:tcPr>
-            <w:tcW w:w="1250" w:type="dxa"/>
-          </w:tcPr>
-          <w:p>
-            <w:pPr>
-              <w:spacing w:after="0"/>
-            </w:pPr>
-            <w:r>
-              <w:rPr>
-                <w:sz w:val="18"/>
-              </w:rPr>
-              <w:t xml:space="preserve">14/10/2026</w:t>
-            </w:r>
-          </w:p>
-        </w:tc>
-        <w:tc>
-          <w:tcPr>
-            <w:tcW w:w="1700" w:type="dxa"/>
-          </w:tcPr>
-          <w:p>
-            <w:pPr>
-              <w:spacing w:after="0"/>
-            </w:pPr>
-            <w:r>
-              <w:rPr>
-                <w:sz w:val="18"/>
-              </w:rPr>
-              <w:t xml:space="preserve">Document</w:t>
-            </w:r>
-          </w:p>
-        </w:tc>
-        <w:tc>
-          <w:tcPr>
-            <w:tcW w:w="5898" w:type="dxa"/>
-          </w:tcPr>
-          <w:p>
-            <w:pPr>
-              <w:spacing w:after="0"/>
-            </w:pPr>
-            <w:r>
-              <w:rPr>
-                <w:sz w:val="18"/>
-              </w:rPr>
-              <w:t xml:space="preserve">Revision history, spelling corrections and section numbering.</w:t>
+              <w:t xml:space="preserve">Aligned with the implemented prototype: data sent to external services (3.2); processing order and refusal of the IT Administrator role (6.1, 6.2); SQL validation limits and correction (8.3); conversation handling, comparisons and multi-request messages (8.4); visualization selection (8.5, 9.4); AI availability and provider operation (8.6, 9.2); additional mitigations (11.2, 11.3); indicative AI cost (Appendix B). Spelling and heading corrections.</w:t>
             </w:r>
           </w:p>
         </w:tc>

</xml_diff>

<commit_message>
Split the v1.1 revision text into five rows
</commit_message>
<xml_diff>
--- a/docs/ACBI_Technical_Solution_Proposal_v1.1.docx
+++ b/docs/ACBI_Technical_Solution_Proposal_v1.1.docx
@@ -442,7 +442,219 @@
               <w:rPr>
                 <w:sz w:val="18"/>
               </w:rPr>
-              <w:t xml:space="preserve">Aligned with the implemented prototype: data sent to external services (3.2); processing order and refusal of the IT Administrator role (6.1, 6.2); SQL validation limits and correction (8.3); conversation handling, comparisons and multi-request messages (8.4); visualization selection (8.5, 9.4); AI availability and provider operation (8.6, 9.2); additional mitigations (11.2, 11.3); indicative AI cost (Appendix B). Spelling and heading corrections.</w:t>
+              <w:t xml:space="preserve">Aligned with the implemented prototype: data sent to external services (3.2); processing order and refusal of the IT Administrator role (6.1, 6.2).</w:t>
+            </w:r>
+          </w:p>
+        </w:tc>
+      </w:tr>
+      <w:tr>
+        <w:trPr>
+          <w:jc w:val="center"/>
+        </w:trPr>
+        <w:tc>
+          <w:tcPr>
+            <w:tcW w:w="1100" w:type="dxa"/>
+          </w:tcPr>
+          <w:p>
+            <w:pPr>
+              <w:spacing w:after="0"/>
+            </w:pPr>
+            <w:r>
+              <w:rPr>
+                <w:sz w:val="18"/>
+              </w:rPr>
+              <w:t xml:space="preserve">1.1</w:t>
+            </w:r>
+          </w:p>
+        </w:tc>
+        <w:tc>
+          <w:tcPr>
+            <w:tcW w:w="1400" w:type="dxa"/>
+          </w:tcPr>
+          <w:p>
+            <w:pPr>
+              <w:spacing w:after="0"/>
+            </w:pPr>
+            <w:r>
+              <w:rPr>
+                <w:sz w:val="18"/>
+              </w:rPr>
+              <w:t xml:space="preserve">14/10/2026</w:t>
+            </w:r>
+          </w:p>
+        </w:tc>
+        <w:tc>
+          <w:tcPr>
+            <w:tcW w:w="7148" w:type="dxa"/>
+          </w:tcPr>
+          <w:p>
+            <w:pPr>
+              <w:spacing w:after="0"/>
+            </w:pPr>
+            <w:r>
+              <w:rPr>
+                <w:sz w:val="18"/>
+              </w:rPr>
+              <w:t xml:space="preserve">SQL validation limits and correction (8.3); conversation handling, comparisons and multi-request messages (8.4).</w:t>
+            </w:r>
+          </w:p>
+        </w:tc>
+      </w:tr>
+      <w:tr>
+        <w:trPr>
+          <w:jc w:val="center"/>
+        </w:trPr>
+        <w:tc>
+          <w:tcPr>
+            <w:tcW w:w="1100" w:type="dxa"/>
+          </w:tcPr>
+          <w:p>
+            <w:pPr>
+              <w:spacing w:after="0"/>
+            </w:pPr>
+            <w:r>
+              <w:rPr>
+                <w:sz w:val="18"/>
+              </w:rPr>
+              <w:t xml:space="preserve">1.1</w:t>
+            </w:r>
+          </w:p>
+        </w:tc>
+        <w:tc>
+          <w:tcPr>
+            <w:tcW w:w="1400" w:type="dxa"/>
+          </w:tcPr>
+          <w:p>
+            <w:pPr>
+              <w:spacing w:after="0"/>
+            </w:pPr>
+            <w:r>
+              <w:rPr>
+                <w:sz w:val="18"/>
+              </w:rPr>
+              <w:t xml:space="preserve">14/10/2026</w:t>
+            </w:r>
+          </w:p>
+        </w:tc>
+        <w:tc>
+          <w:tcPr>
+            <w:tcW w:w="7148" w:type="dxa"/>
+          </w:tcPr>
+          <w:p>
+            <w:pPr>
+              <w:spacing w:after="0"/>
+            </w:pPr>
+            <w:r>
+              <w:rPr>
+                <w:sz w:val="18"/>
+              </w:rPr>
+              <w:t xml:space="preserve">Visualization selection (8.5, 9.4); AI availability and provider operation (8.6, 9.2).</w:t>
+            </w:r>
+          </w:p>
+        </w:tc>
+      </w:tr>
+      <w:tr>
+        <w:trPr>
+          <w:jc w:val="center"/>
+        </w:trPr>
+        <w:tc>
+          <w:tcPr>
+            <w:tcW w:w="1100" w:type="dxa"/>
+          </w:tcPr>
+          <w:p>
+            <w:pPr>
+              <w:spacing w:after="0"/>
+            </w:pPr>
+            <w:r>
+              <w:rPr>
+                <w:sz w:val="18"/>
+              </w:rPr>
+              <w:t xml:space="preserve">1.1</w:t>
+            </w:r>
+          </w:p>
+        </w:tc>
+        <w:tc>
+          <w:tcPr>
+            <w:tcW w:w="1400" w:type="dxa"/>
+          </w:tcPr>
+          <w:p>
+            <w:pPr>
+              <w:spacing w:after="0"/>
+            </w:pPr>
+            <w:r>
+              <w:rPr>
+                <w:sz w:val="18"/>
+              </w:rPr>
+              <w:t xml:space="preserve">14/10/2026</w:t>
+            </w:r>
+          </w:p>
+        </w:tc>
+        <w:tc>
+          <w:tcPr>
+            <w:tcW w:w="7148" w:type="dxa"/>
+          </w:tcPr>
+          <w:p>
+            <w:pPr>
+              <w:spacing w:after="0"/>
+            </w:pPr>
+            <w:r>
+              <w:rPr>
+                <w:sz w:val="18"/>
+              </w:rPr>
+              <w:t xml:space="preserve">Additional mitigations (11.2, 11.3); indicative AI cost (Appendix B).</w:t>
+            </w:r>
+          </w:p>
+        </w:tc>
+      </w:tr>
+      <w:tr>
+        <w:trPr>
+          <w:jc w:val="center"/>
+        </w:trPr>
+        <w:tc>
+          <w:tcPr>
+            <w:tcW w:w="1100" w:type="dxa"/>
+          </w:tcPr>
+          <w:p>
+            <w:pPr>
+              <w:spacing w:after="0"/>
+            </w:pPr>
+            <w:r>
+              <w:rPr>
+                <w:sz w:val="18"/>
+              </w:rPr>
+              <w:t xml:space="preserve">1.1</w:t>
+            </w:r>
+          </w:p>
+        </w:tc>
+        <w:tc>
+          <w:tcPr>
+            <w:tcW w:w="1400" w:type="dxa"/>
+          </w:tcPr>
+          <w:p>
+            <w:pPr>
+              <w:spacing w:after="0"/>
+            </w:pPr>
+            <w:r>
+              <w:rPr>
+                <w:sz w:val="18"/>
+              </w:rPr>
+              <w:t xml:space="preserve">14/10/2026</w:t>
+            </w:r>
+          </w:p>
+        </w:tc>
+        <w:tc>
+          <w:tcPr>
+            <w:tcW w:w="7148" w:type="dxa"/>
+          </w:tcPr>
+          <w:p>
+            <w:pPr>
+              <w:spacing w:after="0"/>
+            </w:pPr>
+            <w:r>
+              <w:rPr>
+                <w:sz w:val="18"/>
+              </w:rPr>
+              <w:t xml:space="preserve">Spelling and heading corrections.</w:t>
             </w:r>
           </w:p>
         </w:tc>

</xml_diff>

<commit_message>
v1.1 data-sent table without factory wording; keep the author's revision dates
</commit_message>
<xml_diff>
--- a/docs/ACBI_Technical_Solution_Proposal_v1.1.docx
+++ b/docs/ACBI_Technical_Solution_Proposal_v1.1.docx
@@ -263,7 +263,7 @@
           <w:b/>
           <w:bCs/>
         </w:rPr>
-        <w:t xml:space="preserve">Revision History</w:t>
+        <w:t>Revision History</w:t>
       </w:r>
     </w:p>
     <w:tbl>
@@ -298,7 +298,7 @@
                 <w:bCs/>
                 <w:sz w:val="20"/>
               </w:rPr>
-              <w:t xml:space="preserve">Version</w:t>
+              <w:t>Version</w:t>
             </w:r>
           </w:p>
         </w:tc>
@@ -317,7 +317,7 @@
                 <w:bCs/>
                 <w:sz w:val="20"/>
               </w:rPr>
-              <w:t xml:space="preserve">Date</w:t>
+              <w:t>Date</w:t>
             </w:r>
           </w:p>
         </w:tc>
@@ -336,7 +336,7 @@
                 <w:bCs/>
                 <w:sz w:val="20"/>
               </w:rPr>
-              <w:t xml:space="preserve">Changes</w:t>
+              <w:t>Changes</w:t>
             </w:r>
           </w:p>
         </w:tc>
@@ -357,7 +357,7 @@
               <w:rPr>
                 <w:sz w:val="18"/>
               </w:rPr>
-              <w:t xml:space="preserve">1.0</w:t>
+              <w:t>1.0</w:t>
             </w:r>
           </w:p>
         </w:tc>
@@ -373,7 +373,7 @@
               <w:rPr>
                 <w:sz w:val="18"/>
               </w:rPr>
-              <w:t xml:space="preserve">17/9/2026</w:t>
+              <w:t>17/9/2026</w:t>
             </w:r>
           </w:p>
         </w:tc>
@@ -389,7 +389,7 @@
               <w:rPr>
                 <w:sz w:val="18"/>
               </w:rPr>
-              <w:t xml:space="preserve">Initial proposal.</w:t>
+              <w:t>Initial proposal.</w:t>
             </w:r>
           </w:p>
         </w:tc>
@@ -410,7 +410,7 @@
               <w:rPr>
                 <w:sz w:val="18"/>
               </w:rPr>
-              <w:t xml:space="preserve">1.1</w:t>
+              <w:t>1.1</w:t>
             </w:r>
           </w:p>
         </w:tc>
@@ -426,7 +426,13 @@
               <w:rPr>
                 <w:sz w:val="18"/>
               </w:rPr>
-              <w:t xml:space="preserve">14/10/2026</w:t>
+              <w:t>1</w:t>
+            </w:r>
+            <w:r>
+              <w:rPr>
+                <w:sz w:val="18"/>
+              </w:rPr>
+              <w:t>/10/2026</w:t>
             </w:r>
           </w:p>
         </w:tc>
@@ -442,7 +448,7 @@
               <w:rPr>
                 <w:sz w:val="18"/>
               </w:rPr>
-              <w:t xml:space="preserve">Aligned with the implemented prototype: data sent to external services (3.2); processing order and refusal of the IT Administrator role (6.1, 6.2).</w:t>
+              <w:t>Aligned with the implemented prototype: data sent to external services (3.2); processing order and refusal of the IT Administrator role (6.1, 6.2).</w:t>
             </w:r>
           </w:p>
         </w:tc>
@@ -463,7 +469,7 @@
               <w:rPr>
                 <w:sz w:val="18"/>
               </w:rPr>
-              <w:t xml:space="preserve">1.1</w:t>
+              <w:t>1.1</w:t>
             </w:r>
           </w:p>
         </w:tc>
@@ -479,7 +485,13 @@
               <w:rPr>
                 <w:sz w:val="18"/>
               </w:rPr>
-              <w:t xml:space="preserve">14/10/2026</w:t>
+              <w:t>4</w:t>
+            </w:r>
+            <w:r>
+              <w:rPr>
+                <w:sz w:val="18"/>
+              </w:rPr>
+              <w:t>/10/2026</w:t>
             </w:r>
           </w:p>
         </w:tc>
@@ -495,7 +507,7 @@
               <w:rPr>
                 <w:sz w:val="18"/>
               </w:rPr>
-              <w:t xml:space="preserve">SQL validation limits and correction (8.3); conversation handling, comparisons and multi-request messages (8.4).</w:t>
+              <w:t>SQL validation limits and correction (8.3); conversation handling, comparisons and multi-request messages (8.4).</w:t>
             </w:r>
           </w:p>
         </w:tc>
@@ -516,7 +528,7 @@
               <w:rPr>
                 <w:sz w:val="18"/>
               </w:rPr>
-              <w:t xml:space="preserve">1.1</w:t>
+              <w:t>1.1</w:t>
             </w:r>
           </w:p>
         </w:tc>
@@ -532,7 +544,13 @@
               <w:rPr>
                 <w:sz w:val="18"/>
               </w:rPr>
-              <w:t xml:space="preserve">14/10/2026</w:t>
+              <w:t>8</w:t>
+            </w:r>
+            <w:r>
+              <w:rPr>
+                <w:sz w:val="18"/>
+              </w:rPr>
+              <w:t>/10/2026</w:t>
             </w:r>
           </w:p>
         </w:tc>
@@ -548,7 +566,7 @@
               <w:rPr>
                 <w:sz w:val="18"/>
               </w:rPr>
-              <w:t xml:space="preserve">Visualization selection (8.5, 9.4); AI availability and provider operation (8.6, 9.2).</w:t>
+              <w:t>Visualization selection (8.5, 9.4); AI availability and provider operation (8.6, 9.2).</w:t>
             </w:r>
           </w:p>
         </w:tc>
@@ -569,7 +587,7 @@
               <w:rPr>
                 <w:sz w:val="18"/>
               </w:rPr>
-              <w:t xml:space="preserve">1.1</w:t>
+              <w:t>1.1</w:t>
             </w:r>
           </w:p>
         </w:tc>
@@ -585,7 +603,19 @@
               <w:rPr>
                 <w:sz w:val="18"/>
               </w:rPr>
-              <w:t xml:space="preserve">14/10/2026</w:t>
+              <w:t>1</w:t>
+            </w:r>
+            <w:r>
+              <w:rPr>
+                <w:sz w:val="18"/>
+              </w:rPr>
+              <w:t>1</w:t>
+            </w:r>
+            <w:r>
+              <w:rPr>
+                <w:sz w:val="18"/>
+              </w:rPr>
+              <w:t>/10/2026</w:t>
             </w:r>
           </w:p>
         </w:tc>
@@ -601,7 +631,7 @@
               <w:rPr>
                 <w:sz w:val="18"/>
               </w:rPr>
-              <w:t xml:space="preserve">Additional mitigations (11.2, 11.3); indicative AI cost (Appendix B).</w:t>
+              <w:t>Additional mitigations (11.2, 11.3); indicative AI cost (Appendix B).</w:t>
             </w:r>
           </w:p>
         </w:tc>
@@ -622,7 +652,7 @@
               <w:rPr>
                 <w:sz w:val="18"/>
               </w:rPr>
-              <w:t xml:space="preserve">1.1</w:t>
+              <w:t>1.1</w:t>
             </w:r>
           </w:p>
         </w:tc>
@@ -638,7 +668,7 @@
               <w:rPr>
                 <w:sz w:val="18"/>
               </w:rPr>
-              <w:t xml:space="preserve">14/10/2026</w:t>
+              <w:t>14/10/2026</w:t>
             </w:r>
           </w:p>
         </w:tc>
@@ -654,7 +684,7 @@
               <w:rPr>
                 <w:sz w:val="18"/>
               </w:rPr>
-              <w:t xml:space="preserve">Spelling and heading corrections.</w:t>
+              <w:t>Spelling and heading corrections.</w:t>
             </w:r>
           </w:p>
         </w:tc>
@@ -4648,16 +4678,11 @@
     </w:p>
     <w:p>
       <w:r>
-        <w:t xml:space="preserve">The system must not fabricate data or present unsupported conclusions. If the available data is insufficient to answer a </w:t>
-      </w:r>
-      <w:proofErr w:type="gramStart"/>
-      <w:r>
-        <w:t>question</w:t>
+        <w:t>The system must not fabricate data or present unsupported conclusions. If the available data is insufficient to answer a question</w:t>
       </w:r>
       <w:r>
         <w:t>s</w:t>
       </w:r>
-      <w:proofErr w:type="gramEnd"/>
       <w:r>
         <w:t xml:space="preserve">, it must clearly state this limitation </w:t>
       </w:r>
@@ -4673,15 +4698,7 @@
     </w:p>
     <w:p>
       <w:r>
-        <w:t xml:space="preserve">The system must ask follow-up question when a request is ambiguous, such as </w:t>
-      </w:r>
-      <w:proofErr w:type="gramStart"/>
-      <w:r>
-        <w:t>“ Are</w:t>
-      </w:r>
-      <w:proofErr w:type="gramEnd"/>
-      <w:r>
-        <w:t xml:space="preserve"> there any problem</w:t>
+        <w:t>The system must ask follow-up question when a request is ambiguous, such as “ Are there any problem</w:t>
       </w:r>
       <w:r>
         <w:t>s</w:t>
@@ -6012,11 +6029,11 @@
       <w:pPr>
         <w:pStyle w:val="Heading2"/>
       </w:pPr>
-      <w:bookmarkStart w:id="9" w:name="_Toc240609470"/>
+      <w:bookmarkStart w:id="8" w:name="_Toc240609470"/>
       <w:r>
         <w:t>2.3 Conventions</w:t>
       </w:r>
-      <w:bookmarkEnd w:id="9"/>
+      <w:bookmarkEnd w:id="8"/>
     </w:p>
     <w:tbl>
       <w:tblPr>
@@ -6207,22 +6224,22 @@
       <w:pPr>
         <w:pStyle w:val="Heading1"/>
       </w:pPr>
-      <w:bookmarkStart w:id="10" w:name="_Toc240609471"/>
+      <w:bookmarkStart w:id="9" w:name="_Toc240609471"/>
       <w:r>
         <w:lastRenderedPageBreak/>
         <w:t>3. Context and Scope</w:t>
       </w:r>
-      <w:bookmarkEnd w:id="10"/>
+      <w:bookmarkEnd w:id="9"/>
     </w:p>
     <w:p>
       <w:pPr>
         <w:pStyle w:val="Heading2"/>
       </w:pPr>
-      <w:bookmarkStart w:id="11" w:name="_Toc240609472"/>
+      <w:bookmarkStart w:id="10" w:name="_Toc240609472"/>
       <w:r>
         <w:t>3.1 Business Context</w:t>
       </w:r>
-      <w:bookmarkEnd w:id="11"/>
+      <w:bookmarkEnd w:id="10"/>
     </w:p>
     <w:p/>
     <w:p>
@@ -6395,15 +6412,7 @@
         <w:t>standardized</w:t>
       </w:r>
       <w:r>
-        <w:t xml:space="preserve"> business data, such as sales, production, </w:t>
-      </w:r>
-      <w:proofErr w:type="gramStart"/>
-      <w:r>
-        <w:t>quality,…</w:t>
-      </w:r>
-      <w:proofErr w:type="gramEnd"/>
-      <w:r>
-        <w:t xml:space="preserve"> It </w:t>
+        <w:t xml:space="preserve"> business data, such as sales, production, quality,… It </w:t>
       </w:r>
       <w:r>
         <w:t>supplies data requested by ACBI</w:t>
@@ -6466,11 +6475,11 @@
       <w:pPr>
         <w:pStyle w:val="Heading2"/>
       </w:pPr>
-      <w:bookmarkStart w:id="12" w:name="_Toc240609473"/>
+      <w:bookmarkStart w:id="11" w:name="_Toc240609473"/>
       <w:r>
         <w:t>3.2 Technical Context</w:t>
       </w:r>
-      <w:bookmarkEnd w:id="12"/>
+      <w:bookmarkEnd w:id="11"/>
     </w:p>
     <w:p/>
     <w:p>
@@ -6692,12 +6701,12 @@
           <w:b/>
           <w:bCs/>
         </w:rPr>
-        <w:t xml:space="preserve">Data Sent to External Services</w:t>
+        <w:t>Data Sent to External Services</w:t>
       </w:r>
     </w:p>
     <w:p>
       <w:r>
-        <w:t xml:space="preserve">The external AI service has no access path to the company data warehouse, but information still leaves the system. The table lists what each external call carries and the setting that controls it.</w:t>
+        <w:t>The external AI service has no access path to the company data warehouse, but information still leaves the system. The table lists what each external call carries and the setting that controls it.</w:t>
       </w:r>
     </w:p>
     <w:tbl>
@@ -6708,10 +6717,10 @@
         <w:tblLook w:val="04A0" w:firstRow="1" w:lastRow="0" w:firstColumn="1" w:lastColumn="0" w:noHBand="0" w:noVBand="1"/>
       </w:tblPr>
       <w:tblGrid>
-        <w:gridCol w:w="1700"/>
-        <w:gridCol w:w="4300"/>
-        <w:gridCol w:w="1700"/>
-        <w:gridCol w:w="1948"/>
+        <w:gridCol w:w="1565"/>
+        <w:gridCol w:w="3324"/>
+        <w:gridCol w:w="1522"/>
+        <w:gridCol w:w="3237"/>
       </w:tblGrid>
       <w:tr>
         <w:trPr>
@@ -6733,7 +6742,7 @@
                 <w:bCs/>
                 <w:sz w:val="20"/>
               </w:rPr>
-              <w:t xml:space="preserve">Call</w:t>
+              <w:t>Call</w:t>
             </w:r>
           </w:p>
         </w:tc>
@@ -6752,7 +6761,7 @@
                 <w:bCs/>
                 <w:sz w:val="20"/>
               </w:rPr>
-              <w:t xml:space="preserve">Content sent</w:t>
+              <w:t>Content sent</w:t>
             </w:r>
           </w:p>
         </w:tc>
@@ -6771,7 +6780,7 @@
                 <w:bCs/>
                 <w:sz w:val="20"/>
               </w:rPr>
-              <w:t xml:space="preserve">Not sent</w:t>
+              <w:t>Not sent</w:t>
             </w:r>
           </w:p>
         </w:tc>
@@ -6790,7 +6799,7 @@
                 <w:bCs/>
                 <w:sz w:val="20"/>
               </w:rPr>
-              <w:t xml:space="preserve">Control</w:t>
+              <w:t>Control</w:t>
             </w:r>
           </w:p>
         </w:tc>
@@ -6811,7 +6820,7 @@
               <w:rPr>
                 <w:sz w:val="18"/>
               </w:rPr>
-              <w:t xml:space="preserve">Question interpretation</w:t>
+              <w:t>Question interpretation</w:t>
             </w:r>
           </w:p>
         </w:tc>
@@ -6827,7 +6836,7 @@
               <w:rPr>
                 <w:sz w:val="18"/>
               </w:rPr>
-              <w:t xml:space="preserve">The question (up to 1,000 characters); the data date; the full approved catalogue of metrics, dimensions and their members (up to 40 per dimension, with factory identifiers), not filtered by role; the request slots and any pending clarification from the previous turn; up to 6 recent turns, in which formatted amounts and decimal ratios of earlier answers are replaced by a placeholder</w:t>
+              <w:t>The question (up to 1,000 characters); the data date; the full approved catalogue of metrics, dimensions and their members (up to 40 per dimension, with their identifiers), not filtered by role; the request slots and any pending clarification from the previous turn; up to 6 recent turns, in which formatted amounts and decimal ratios of earlier answers are replaced by a placeholder</w:t>
             </w:r>
           </w:p>
         </w:tc>
@@ -6843,7 +6852,7 @@
               <w:rPr>
                 <w:sz w:val="18"/>
               </w:rPr>
-              <w:t xml:space="preserve">Result rows; passwords, keys, roles and user identifiers</w:t>
+              <w:t>Result rows; passwords, keys, roles and user identifiers</w:t>
             </w:r>
           </w:p>
         </w:tc>
@@ -6859,7 +6868,7 @@
               <w:rPr>
                 <w:sz w:val="18"/>
               </w:rPr>
-              <w:t xml:space="preserve">Used for questions the backend rules cannot read. Reading plain questions by rules is an optional setting (LOCAL_INTENT_ENABLED, off by default) and is also the fallback when the AI service is unavailable</w:t>
+              <w:t>Used for questions the backend rules cannot read. Reading plain questions by rules is an optional setting (LOCAL_INTENT_ENABLED, off by default) and is also the fallback when the AI service is unavailable</w:t>
             </w:r>
           </w:p>
         </w:tc>
@@ -6880,7 +6889,7 @@
               <w:rPr>
                 <w:sz w:val="18"/>
               </w:rPr>
-              <w:t xml:space="preserve">Questions about the data or the previous answer</w:t>
+              <w:t>Questions about the data or the previous answer</w:t>
             </w:r>
           </w:p>
         </w:tc>
@@ -6896,7 +6905,7 @@
               <w:rPr>
                 <w:sz w:val="18"/>
               </w:rPr>
-              <w:t xml:space="preserve">The question; approved metadata visible to the user's role (metrics, dimensions and members, data coverage dates, permitted table and column names); a description of the previous answer, including its answer text with figures</w:t>
+              <w:t>The question; approved metadata visible to the user's role (metrics, dimensions and members, data coverage dates, permitted table and column names); a description of the previous answer, including its answer text with figures</w:t>
             </w:r>
           </w:p>
         </w:tc>
@@ -6912,7 +6921,7 @@
               <w:rPr>
                 <w:sz w:val="18"/>
               </w:rPr>
-              <w:t xml:space="preserve">Result tables</w:t>
+              <w:t>Result tables</w:t>
             </w:r>
           </w:p>
         </w:tc>
@@ -6928,7 +6937,7 @@
               <w:rPr>
                 <w:sz w:val="18"/>
               </w:rPr>
-              <w:t xml:space="preserve">Used when AI is enabled</w:t>
+              <w:t>Used when AI is enabled</w:t>
             </w:r>
           </w:p>
         </w:tc>
@@ -6949,7 +6958,8 @@
               <w:rPr>
                 <w:sz w:val="18"/>
               </w:rPr>
-              <w:t xml:space="preserve">SQL proposal (RAG Text-to-SQL)</w:t>
+              <w:lastRenderedPageBreak/>
+              <w:t>SQL proposal (RAG Text-to-SQL)</w:t>
             </w:r>
           </w:p>
         </w:tc>
@@ -6965,7 +6975,7 @@
               <w:rPr>
                 <w:sz w:val="18"/>
               </w:rPr>
-              <w:t xml:space="preserve">The question; the request slots without dates, factory or territory (growth metrics keep them); approved metric definitions and source mappings; table and column names permitted for the role; at most 2 approved example statements</w:t>
+              <w:t>The question; the request slots without dates and dimension filters (growth metrics keep them); approved metric definitions and source mappings; table and column names permitted for the role; at most 2 approved example statements</w:t>
             </w:r>
           </w:p>
         </w:tc>
@@ -6981,7 +6991,7 @@
               <w:rPr>
                 <w:sz w:val="18"/>
               </w:rPr>
-              <w:t xml:space="preserve">Result rows; the full schema</w:t>
+              <w:t>Result rows; the full schema</w:t>
             </w:r>
           </w:p>
         </w:tc>
@@ -6997,7 +7007,7 @@
               <w:rPr>
                 <w:sz w:val="18"/>
               </w:rPr>
-              <w:t xml:space="preserve">EXTERNAL_METADATA_ENABLED, off by default; without it only the standard query builder runs</w:t>
+              <w:t>EXTERNAL_METADATA_ENABLED, off by default; without it only the standard query builder runs</w:t>
             </w:r>
           </w:p>
         </w:tc>
@@ -7018,7 +7028,7 @@
               <w:rPr>
                 <w:sz w:val="18"/>
               </w:rPr>
-              <w:t xml:space="preserve">Visualization proposal</w:t>
+              <w:t>Visualization proposal</w:t>
             </w:r>
           </w:p>
         </w:tc>
@@ -7034,7 +7044,7 @@
               <w:rPr>
                 <w:sz w:val="18"/>
               </w:rPr>
-              <w:t xml:space="preserve">Only when the backend rules find no suitable chart: the question, the number of rows, and for each column its kind (numeric, temporal, category), whether it is sorted, its number of distinct values and whether it is complete</w:t>
+              <w:t>Only when the backend rules find no suitable chart: the question, the number of rows, and for each column its kind (numeric, temporal, category), whether it is sorted, its number of distinct values and whether it is complete</w:t>
             </w:r>
           </w:p>
         </w:tc>
@@ -7050,7 +7060,7 @@
               <w:rPr>
                 <w:sz w:val="18"/>
               </w:rPr>
-              <w:t xml:space="preserve">Values in the result</w:t>
+              <w:t>Values in the result</w:t>
             </w:r>
           </w:p>
         </w:tc>
@@ -7066,7 +7076,7 @@
               <w:rPr>
                 <w:sz w:val="18"/>
               </w:rPr>
-              <w:t xml:space="preserve">EXTERNAL_METADATA_ENABLED; without it results are shown as a table</w:t>
+              <w:t>EXTERNAL_METADATA_ENABLED; without it results are shown as a table</w:t>
             </w:r>
           </w:p>
         </w:tc>
@@ -7087,7 +7097,7 @@
               <w:rPr>
                 <w:sz w:val="18"/>
               </w:rPr>
-              <w:t xml:space="preserve">AI summary</w:t>
+              <w:t>AI summary</w:t>
             </w:r>
           </w:p>
         </w:tc>
@@ -7103,7 +7113,7 @@
               <w:rPr>
                 <w:sz w:val="18"/>
               </w:rPr>
-              <w:t xml:space="preserve">The question and the result rows</w:t>
+              <w:t>The question and the result rows</w:t>
             </w:r>
           </w:p>
         </w:tc>
@@ -7119,7 +7129,7 @@
               <w:rPr>
                 <w:sz w:val="18"/>
               </w:rPr>
-              <w:t xml:space="preserve">-</w:t>
+              <w:t>-</w:t>
             </w:r>
           </w:p>
         </w:tc>
@@ -7135,7 +7145,7 @@
               <w:rPr>
                 <w:sz w:val="18"/>
               </w:rPr>
-              <w:t xml:space="preserve">SEND_RESULTS_TO_LLM and EXTERNAL_RESULTS_ENABLED, both off by default</w:t>
+              <w:t>SEND_RESULTS_TO_LLM and EXTERNAL_RESULTS_ENABLED, both off by default</w:t>
             </w:r>
           </w:p>
         </w:tc>
@@ -7156,7 +7166,7 @@
               <w:rPr>
                 <w:sz w:val="18"/>
               </w:rPr>
-              <w:t xml:space="preserve">Speech-to-text</w:t>
+              <w:t>Speech-to-text</w:t>
             </w:r>
           </w:p>
         </w:tc>
@@ -7172,7 +7182,7 @@
               <w:rPr>
                 <w:sz w:val="18"/>
               </w:rPr>
-              <w:t xml:space="preserve">The audio recording when the user records a question</w:t>
+              <w:t>The audio recording when the user records a question</w:t>
             </w:r>
           </w:p>
         </w:tc>
@@ -7188,7 +7198,7 @@
               <w:rPr>
                 <w:sz w:val="18"/>
               </w:rPr>
-              <w:t xml:space="preserve">-</w:t>
+              <w:t>-</w:t>
             </w:r>
           </w:p>
         </w:tc>
@@ -7204,7 +7214,7 @@
               <w:rPr>
                 <w:sz w:val="18"/>
               </w:rPr>
-              <w:t xml:space="preserve">Requires a speech-service key</w:t>
+              <w:t>Requires a speech-service key</w:t>
             </w:r>
           </w:p>
         </w:tc>
@@ -7377,47 +7387,43 @@
       <w:pPr>
         <w:pStyle w:val="Heading1"/>
       </w:pPr>
-      <w:bookmarkStart w:id="13" w:name="_Toc240609474"/>
+      <w:bookmarkStart w:id="12" w:name="_Toc240609474"/>
       <w:r>
         <w:t>4. Solution Strategy</w:t>
+      </w:r>
+      <w:bookmarkEnd w:id="12"/>
+    </w:p>
+    <w:p>
+      <w:r>
+        <w:t>ACBI is developed as a web application that enables users to retrieve and compare business data through natural language, reducing manual navigation of dashboards and reports. Python/FastAPI is selected for the backend to support integration with AI libraries, document retrieval, and data processing. The system accesses a pretrained LLM through an external API, while data queries and numerical calculations are executed in the database.</w:t>
+      </w:r>
+    </w:p>
+    <w:p>
+      <w:pPr>
+        <w:pStyle w:val="Heading2"/>
+      </w:pPr>
+      <w:bookmarkStart w:id="13" w:name="_Toc240609475"/>
+      <w:r>
+        <w:t xml:space="preserve">4.1 </w:t>
+      </w:r>
+      <w:r>
+        <w:t>System Overview</w:t>
       </w:r>
       <w:bookmarkEnd w:id="13"/>
     </w:p>
     <w:p>
       <w:r>
-        <w:t>ACBI is developed as a web application that enables users to retrieve and compare business data through natural language, reducing manual navigation of dashboards and reports. Python/</w:t>
-      </w:r>
-      <w:proofErr w:type="spellStart"/>
-      <w:r>
-        <w:t>FastAPI</w:t>
-      </w:r>
-      <w:proofErr w:type="spellEnd"/>
-      <w:r>
-        <w:t xml:space="preserve"> is selected for the backend to support integration with AI libraries, document retrieval, and data processing. The system accesses a pretrained LLM through an external API, while data queries and numerical calculations are executed in the database.</w:t>
-      </w:r>
-    </w:p>
-    <w:p>
-      <w:pPr>
-        <w:pStyle w:val="Heading2"/>
-      </w:pPr>
-      <w:bookmarkStart w:id="14" w:name="_Toc240609475"/>
-      <w:r>
-        <w:t xml:space="preserve">4.1 </w:t>
-      </w:r>
-      <w:r>
-        <w:t>System Overview</w:t>
-      </w:r>
-      <w:bookmarkEnd w:id="14"/>
-    </w:p>
-    <w:p>
-      <w:r>
         <w:t xml:space="preserve">The frontend receives questions and displays results. The backend manages conversation context, </w:t>
       </w:r>
       <w:r>
         <w:t>routes requests through Structured Intent or RAG Text-to-SQL</w:t>
       </w:r>
       <w:r>
-        <w:t>, validates SQL, and enforces access permissions. Business data is accessed through read-only connections, while conversation history and traceability records are stored in application storage. The backend formats query results and validates chart configurations before presentation. A separate model is not required for structured output: the same LLM can support multiple tasks, while application code validates the output structure.</w:t>
+        <w:t xml:space="preserve">, validates SQL, and enforces </w:t>
+      </w:r>
+      <w:r>
+        <w:lastRenderedPageBreak/>
+        <w:t>access permissions. Business data is accessed through read-only connections, while conversation history and traceability records are stored in application storage. The backend formats query results and validates chart configurations before presentation. A separate model is not required for structured output: the same LLM can support multiple tasks, while application code validates the output structure.</w:t>
       </w:r>
     </w:p>
     <w:p>
@@ -7572,14 +7578,14 @@
       <w:pPr>
         <w:pStyle w:val="Heading2"/>
       </w:pPr>
-      <w:bookmarkStart w:id="15" w:name="_Toc240609476"/>
+      <w:bookmarkStart w:id="14" w:name="_Toc240609476"/>
       <w:r>
         <w:t xml:space="preserve">4.2 </w:t>
       </w:r>
       <w:r>
         <w:t>AI Processing Strategy</w:t>
       </w:r>
-      <w:bookmarkEnd w:id="15"/>
+      <w:bookmarkEnd w:id="14"/>
     </w:p>
     <w:p>
       <w:r>
@@ -7608,11 +7614,7 @@
         <w:t>Structured Intent</w:t>
       </w:r>
       <w:r>
-        <w:t xml:space="preserve"> is considered. The LLM converts questions into structured requests containing metrics, reporting periods, filters, and analytical operations. The backend validates these requests and generates SQL using predefined formulas and supported operations. </w:t>
-      </w:r>
-      <w:r>
-        <w:lastRenderedPageBreak/>
-        <w:t>Different phrasings can therefore share the same query logic, but this approach is limited to combinations supported by the backend.</w:t>
+        <w:t xml:space="preserve"> is considered. The LLM converts questions into structured requests containing metrics, reporting periods, filters, and analytical operations. The backend validates these requests and generates SQL using predefined formulas and supported operations. Different phrasings can therefore share the same query logic, but this approach is limited to combinations supported by the backend.</w:t>
       </w:r>
     </w:p>
     <w:p>
@@ -7653,6 +7655,7 @@
     </w:p>
     <w:p>
       <w:r>
+        <w:lastRenderedPageBreak/>
         <w:t xml:space="preserve">An alternative extension is </w:t>
       </w:r>
       <w:r>
@@ -7814,25 +7817,25 @@
       <w:pPr>
         <w:pStyle w:val="Heading1"/>
       </w:pPr>
-      <w:bookmarkStart w:id="16" w:name="_Toc240609477"/>
+      <w:bookmarkStart w:id="15" w:name="_Toc240609477"/>
       <w:r>
         <w:lastRenderedPageBreak/>
         <w:t>5. Building Block View</w:t>
       </w:r>
-      <w:bookmarkEnd w:id="16"/>
+      <w:bookmarkEnd w:id="15"/>
     </w:p>
     <w:p>
       <w:pPr>
         <w:pStyle w:val="Heading2"/>
       </w:pPr>
-      <w:bookmarkStart w:id="17" w:name="_Toc240609478"/>
+      <w:bookmarkStart w:id="16" w:name="_Toc240609478"/>
       <w:r>
         <w:t>5.1 Whitebox Overall System</w:t>
       </w:r>
       <w:r>
         <w:t xml:space="preserve"> – Level 1</w:t>
       </w:r>
-      <w:bookmarkEnd w:id="17"/>
+      <w:bookmarkEnd w:id="16"/>
     </w:p>
     <w:p>
       <w:r>
@@ -8149,11 +8152,11 @@
       <w:pPr>
         <w:pStyle w:val="Heading2"/>
       </w:pPr>
-      <w:bookmarkStart w:id="18" w:name="_Toc240609479"/>
+      <w:bookmarkStart w:id="17" w:name="_Toc240609479"/>
       <w:r>
         <w:t>5.2 Level 2</w:t>
       </w:r>
-      <w:bookmarkEnd w:id="18"/>
+      <w:bookmarkEnd w:id="17"/>
     </w:p>
     <w:p>
       <w:r>
@@ -8310,15 +8313,7 @@
           </w:tcPr>
           <w:p>
             <w:r>
-              <w:t xml:space="preserve">Coordinates request processing and </w:t>
-            </w:r>
-            <w:proofErr w:type="gramStart"/>
-            <w:r>
-              <w:t>selects</w:t>
-            </w:r>
-            <w:proofErr w:type="gramEnd"/>
-            <w:r>
-              <w:t xml:space="preserve"> Structured Intent or RAG Text-to-SQL based on whether the standard query builder fully supports the request.</w:t>
+              <w:t>Coordinates request processing and selects Structured Intent or RAG Text-to-SQL based on whether the standard query builder fully supports the request.</w:t>
             </w:r>
           </w:p>
         </w:tc>
@@ -8487,15 +8482,7 @@
           </w:tcPr>
           <w:p>
             <w:r>
-              <w:t xml:space="preserve">Formats query results and </w:t>
-            </w:r>
-            <w:proofErr w:type="gramStart"/>
-            <w:r>
-              <w:t>validates</w:t>
-            </w:r>
-            <w:proofErr w:type="gramEnd"/>
-            <w:r>
-              <w:t xml:space="preserve"> chart configurations. Uses AI Integration for optional summarization when permitted.</w:t>
+              <w:t>Formats query results and validates chart configurations. Uses AI Integration for optional summarization when permitted.</w:t>
             </w:r>
           </w:p>
         </w:tc>
@@ -8547,25 +8534,25 @@
       <w:pPr>
         <w:pStyle w:val="Heading1"/>
       </w:pPr>
-      <w:bookmarkStart w:id="19" w:name="_Toc240609480"/>
+      <w:bookmarkStart w:id="18" w:name="_Toc240609480"/>
       <w:r>
         <w:lastRenderedPageBreak/>
         <w:t>6. Runtime View</w:t>
       </w:r>
-      <w:bookmarkEnd w:id="19"/>
+      <w:bookmarkEnd w:id="18"/>
     </w:p>
     <w:p>
       <w:pPr>
         <w:pStyle w:val="Heading2"/>
       </w:pPr>
-      <w:bookmarkStart w:id="20" w:name="_Toc240609481"/>
+      <w:bookmarkStart w:id="19" w:name="_Toc240609481"/>
       <w:r>
         <w:t xml:space="preserve">6.1 </w:t>
       </w:r>
       <w:r>
         <w:t>Successful Data Request</w:t>
       </w:r>
-      <w:bookmarkEnd w:id="20"/>
+      <w:bookmarkEnd w:id="19"/>
     </w:p>
     <w:p>
       <w:r>
@@ -8707,7 +8694,7 @@
         </w:numPr>
       </w:pPr>
       <w:r>
-        <w:t xml:space="preserve">Interpret question: External AI Service converts the question into a structured request; the backend reads plain questions by rules when that option is enabled, or when the AI service is unavailable.</w:t>
+        <w:t>Interpret question: External AI Service converts the question into a structured request; the backend reads plain questions by rules when that option is enabled, or when the AI service is unavailable.</w:t>
       </w:r>
     </w:p>
     <w:p>
@@ -8740,6 +8727,7 @@
         </w:numPr>
       </w:pPr>
       <w:r>
+        <w:lastRenderedPageBreak/>
         <w:t>Validate SQL: Backend re-checks the generated query and enforces access scope.</w:t>
       </w:r>
     </w:p>
@@ -8762,7 +8750,6 @@
         </w:numPr>
       </w:pPr>
       <w:r>
-        <w:lastRenderedPageBreak/>
         <w:t>Save and respond: Result and traceability records are saved; the answer is returned to the user.</w:t>
       </w:r>
     </w:p>
@@ -8771,14 +8758,14 @@
       <w:pPr>
         <w:pStyle w:val="Heading2"/>
       </w:pPr>
-      <w:bookmarkStart w:id="21" w:name="_Toc240609482"/>
+      <w:bookmarkStart w:id="20" w:name="_Toc240609482"/>
       <w:r>
         <w:t xml:space="preserve">6.2 </w:t>
       </w:r>
       <w:r>
         <w:t>Unauthorized Data Request</w:t>
       </w:r>
-      <w:bookmarkEnd w:id="21"/>
+      <w:bookmarkEnd w:id="20"/>
     </w:p>
     <w:p>
       <w:r>
@@ -8786,7 +8773,7 @@
           <w:b/>
           <w:bCs/>
         </w:rPr>
-        <w:t xml:space="preserve">Prerequisite:</w:t>
+        <w:t>Prerequisite:</w:t>
       </w:r>
       <w:r>
         <w:t xml:space="preserve"> The user is authenticated but requests data outside their assigned access scope. The permission check is performed by the backend: the External AI Service never has visibility into the user's specific access rights, only non-sensitive context. The IT Administrator role has no access to business data and is refused right after authentication, before the AI service is called and before any query is built.</w:t>
@@ -8919,7 +8906,7 @@
         </w:numPr>
       </w:pPr>
       <w:r>
-        <w:t xml:space="preserve">Verify identity and access scope: Backend authenticates the user. An IT Administrator is refused at this point, so the interpretation step does not take place for this role.</w:t>
+        <w:t>Verify identity and access scope: Backend authenticates the user. An IT Administrator is refused at this point, so the interpretation step does not take place for this role.</w:t>
       </w:r>
     </w:p>
     <w:p>
@@ -8981,12 +8968,11 @@
           <w:numId w:val="13"/>
         </w:numPr>
       </w:pPr>
-      <w:bookmarkStart w:id="22" w:name="_Toc240609483"/>
-      <w:r>
-        <w:lastRenderedPageBreak/>
+      <w:bookmarkStart w:id="21" w:name="_Toc240609483"/>
+      <w:r>
         <w:t>6.3 No Data Found</w:t>
       </w:r>
-      <w:bookmarkEnd w:id="22"/>
+      <w:bookmarkEnd w:id="21"/>
     </w:p>
     <w:p>
       <w:pPr>
@@ -9188,14 +9174,14 @@
       <w:pPr>
         <w:pStyle w:val="Heading2"/>
       </w:pPr>
-      <w:bookmarkStart w:id="23" w:name="_Toc240609484"/>
+      <w:bookmarkStart w:id="22" w:name="_Toc240609484"/>
       <w:r>
         <w:t xml:space="preserve">6.4 </w:t>
       </w:r>
       <w:r>
         <w:t>Clarification Request</w:t>
       </w:r>
-      <w:bookmarkEnd w:id="23"/>
+      <w:bookmarkEnd w:id="22"/>
     </w:p>
     <w:p>
       <w:r>
@@ -9397,39 +9383,31 @@
       <w:pPr>
         <w:pStyle w:val="Heading1"/>
       </w:pPr>
-      <w:bookmarkStart w:id="24" w:name="_Toc240609485"/>
+      <w:bookmarkStart w:id="23" w:name="_Toc240609485"/>
       <w:r>
         <w:lastRenderedPageBreak/>
         <w:t>7. Deployment View</w:t>
+      </w:r>
+      <w:bookmarkEnd w:id="23"/>
+    </w:p>
+    <w:p>
+      <w:r>
+        <w:t>ACBI will be deployed on a server with Docker Engine and Docker Compose installed. The server must have network access to the Company Data Warehouse and the External AI Service.</w:t>
+      </w:r>
+    </w:p>
+    <w:p>
+      <w:pPr>
+        <w:pStyle w:val="Heading2"/>
+      </w:pPr>
+      <w:bookmarkStart w:id="24" w:name="_Toc240609486"/>
+      <w:r>
+        <w:t>7.1 Docker Deployment</w:t>
       </w:r>
       <w:bookmarkEnd w:id="24"/>
     </w:p>
     <w:p>
       <w:r>
-        <w:t>ACBI will be deployed on a server with Docker Engine and Docker Compose installed. The server must have network access to the Company Data Warehouse and the External AI Service.</w:t>
-      </w:r>
-    </w:p>
-    <w:p>
-      <w:pPr>
-        <w:pStyle w:val="Heading2"/>
-      </w:pPr>
-      <w:bookmarkStart w:id="25" w:name="_Toc240609486"/>
-      <w:r>
-        <w:t>7.1 Docker Deployment</w:t>
-      </w:r>
-      <w:bookmarkEnd w:id="25"/>
-    </w:p>
-    <w:p>
-      <w:r>
-        <w:t xml:space="preserve">Docker Compose will manage three containers: a web server serving the frontend, the </w:t>
-      </w:r>
-      <w:proofErr w:type="spellStart"/>
-      <w:r>
-        <w:t>FastAPI</w:t>
-      </w:r>
-      <w:proofErr w:type="spellEnd"/>
-      <w:r>
-        <w:t xml:space="preserve"> backend, and the application database. This approach provides a consistent deployment configuration across development and production environments.</w:t>
+        <w:t>Docker Compose will manage three containers: a web server serving the frontend, the FastAPI backend, and the application database. This approach provides a consistent deployment configuration across development and production environments.</w:t>
       </w:r>
     </w:p>
     <w:p>
@@ -9576,27 +9554,27 @@
       <w:pPr>
         <w:pStyle w:val="Heading1"/>
       </w:pPr>
-      <w:bookmarkStart w:id="26" w:name="_Toc240609487"/>
+      <w:bookmarkStart w:id="25" w:name="_Toc240609487"/>
       <w:r>
         <w:lastRenderedPageBreak/>
         <w:t>8. Cross-cutting Concepts</w:t>
+      </w:r>
+      <w:bookmarkEnd w:id="25"/>
+    </w:p>
+    <w:p>
+      <w:pPr>
+        <w:pStyle w:val="Heading2"/>
+      </w:pPr>
+      <w:bookmarkStart w:id="26" w:name="_Toc240609488"/>
+      <w:r>
+        <w:t xml:space="preserve">8.1 </w:t>
+      </w:r>
+      <w:r>
+        <w:t>Authentication and Authorization</w:t>
       </w:r>
       <w:bookmarkEnd w:id="26"/>
     </w:p>
     <w:p>
-      <w:pPr>
-        <w:pStyle w:val="Heading2"/>
-      </w:pPr>
-      <w:bookmarkStart w:id="27" w:name="_Toc240609488"/>
-      <w:r>
-        <w:t xml:space="preserve">8.1 </w:t>
-      </w:r>
-      <w:r>
-        <w:t>Authentication and Authorization</w:t>
-      </w:r>
-      <w:bookmarkEnd w:id="27"/>
-    </w:p>
-    <w:p>
       <w:r>
         <w:t>Authentication verifies the user's identity, while authorization determines which resources they can access. In ACBI, users are assigned roles and access scopes based on their business responsibilities. For example, the prototype may allow managers to access all approved business reporting data, while sales staff can access only sales and revenue information. These initial roles are used for testing and will be adjusted to match company-defined policies.</w:t>
       </w:r>
@@ -9611,11 +9589,11 @@
       <w:pPr>
         <w:pStyle w:val="Heading2"/>
       </w:pPr>
-      <w:bookmarkStart w:id="28" w:name="_Toc240609489"/>
+      <w:bookmarkStart w:id="27" w:name="_Toc240609489"/>
       <w:r>
         <w:t>8.2 Business Definitions and Metadata</w:t>
       </w:r>
-      <w:bookmarkEnd w:id="28"/>
+      <w:bookmarkEnd w:id="27"/>
     </w:p>
     <w:p>
       <w:r>
@@ -9754,39 +9732,31 @@
       <w:pPr>
         <w:pStyle w:val="Heading2"/>
       </w:pPr>
-      <w:bookmarkStart w:id="29" w:name="_Toc240609490"/>
+      <w:bookmarkStart w:id="28" w:name="_Toc240609490"/>
       <w:r>
         <w:lastRenderedPageBreak/>
         <w:t>8.3 AI Output and Query Validation</w:t>
       </w:r>
-      <w:bookmarkEnd w:id="29"/>
+      <w:bookmarkEnd w:id="28"/>
     </w:p>
     <w:p>
       <w:r>
-        <w:t xml:space="preserve">ACBI treats AI-generated output as a proposal that must be checked by the backend before use. For structured requests, the backend validates the output format, required fields, metric identifiers where applicable, time ranges, and filters against the available business definitions and metadata. Requests with missing or ambiguous business information </w:t>
-      </w:r>
-      <w:proofErr w:type="gramStart"/>
-      <w:r>
-        <w:t>lead</w:t>
-      </w:r>
-      <w:proofErr w:type="gramEnd"/>
-      <w:r>
-        <w:t xml:space="preserve"> to clarification rather than query execution. Malformed AI output is rejected and may be regenerated within a limited number of attempts.</w:t>
+        <w:t>ACBI treats AI-generated output as a proposal that must be checked by the backend before use. For structured requests, the backend validates the output format, required fields, metric identifiers where applicable, time ranges, and filters against the available business definitions and metadata. Requests with missing or ambiguous business information lead to clarification rather than query execution. Malformed AI output is rejected and may be regenerated within a limited number of attempts.</w:t>
       </w:r>
     </w:p>
     <w:p>
       <w:r>
-        <w:t xml:space="preserve">SQL produced by either the standard query builder or RAG Text-to-SQL passes through a shared validation process. The backend parses the SQL to check permitted operations, tables, columns, and functions, and enforces the user's access scope. User-supplied filter values are passed as query parameters. Approved queries are executed using read-only credentials, with execution time and result-size limits. By default a query is stopped after 15 seconds or the remaining request time, whichever is shorter, and returns at most 100 rows (250 for stacked charts, 400 when grouped by day, week or month); when a result reaches the limit and the user did not ask for a top N, the answer says that only the first rows are shown.</w:t>
+        <w:t>SQL produced by either the standard query builder or RAG Text-to-SQL passes through a shared validation process. The backend parses the SQL to check permitted operations, tables, columns, and functions, and enforces the user's access scope. User-supplied filter values are passed as query parameters. Approved queries are executed using read-only credentials, with execution time and result-size limits. By default a query is stopped after 15 seconds or the remaining request time, whichever is shorter, and returns at most 100 rows (250 for stacked charts, 400 when grouped by day, week or month); when a result reaches the limit and the user did not ask for a top N, the answer says that only the first rows are shown.</w:t>
       </w:r>
     </w:p>
     <w:p>
       <w:r>
-        <w:t xml:space="preserve">For example, if a generated query references a restricted table or attempts to modify business data, the backend rejects it before execution. Only a departure from the approved query shape (for example literal dates instead of the bound period, an extra filter or join, or a table outside the metric's approved mapping) or a syntax error is returned to the AI service for correction, at most twice, and every revised query must pass validation again. Security violations (writes, tables or functions outside the role's allowlist, scope violations) are denied and never retried, and authorization failures are not retried through another query path.</w:t>
+        <w:t>For example, if a generated query references a restricted table or attempts to modify business data, the backend rejects it before execution. Only a departure from the approved query shape (for example literal dates instead of the bound period, an extra filter or join, or a table outside the metric's approved mapping) or a syntax error is returned to the AI service for correction, at most twice, and every revised query must pass validation again. Security violations (writes, tables or functions outside the role's allowlist, scope violations) are denied and never retried, and authorization failures are not retried through another query path.</w:t>
       </w:r>
     </w:p>
     <w:p>
       <w:r>
-        <w:t xml:space="preserve">For generated SQL the backend also wraps each source table in a subquery limited to the user's period and permissions, so the query can only see rows the user may see. The date condition therefore appears in both the scope subquery and the outer query, and both are bound to the resolved period (for growth metrics the scope covers both compared periods). Queries from the standard builder must match the predefined statement exactly and do not need the wrapper.</w:t>
+        <w:t>For generated SQL the backend also wraps each source table in a subquery limited to the user's period and permissions, so the query can only see rows the user may see. The date condition therefore appears in both the scope subquery and the outer query, and both are bound to the resolved period (for growth metrics the scope covers both compared periods). Queries from the standard builder must match the predefined statement exactly and do not need the wrapper.</w:t>
       </w:r>
     </w:p>
     <w:p>
@@ -9900,87 +9870,91 @@
       <w:pPr>
         <w:pStyle w:val="Heading2"/>
       </w:pPr>
-      <w:bookmarkStart w:id="30" w:name="_Toc240609491"/>
+      <w:bookmarkStart w:id="29" w:name="_Toc240609491"/>
       <w:r>
         <w:t>8.4 Conversation Context and Clarification</w:t>
+      </w:r>
+      <w:bookmarkEnd w:id="29"/>
+    </w:p>
+    <w:p>
+      <w:r>
+        <w:t>ACBI stores conversation history and pending clarification requests in Application Storage. For each question, the backend retrieves relevant context belonging to the current user and conversation, subject to current access permissions. Context may include previously selected metrics, reporting periods, filters, and comparison criteria.</w:t>
+      </w:r>
+    </w:p>
+    <w:p>
+      <w:r>
+        <w:t>For example, after asking about this month's revenue for Factory A, the user may ask “What about last month?”. The system retains the metric and factory while updating the reporting period. Conversation context helps interpret the request but does not override approved business definitions or access permissions.</w:t>
+      </w:r>
+    </w:p>
+    <w:p>
+      <w:r>
+        <w:lastRenderedPageBreak/>
+        <w:t>When required information remains missing or ambiguous, the system asks a focused follow-up question and stores the unresolved request. The user's reply is combined with the relevant context and validated again before query processing continues. If clarification is still insufficient, the system asks again or explains the limitation rather than guessing.</w:t>
+      </w:r>
+    </w:p>
+    <w:p>
+      <w:r>
+        <w:t>Only the six most recent turns are kept as conversational context. Before they are sent to the AI service, formatted amounts and decimal ratios in earlier answers are replaced by a placeholder, so the service can resolve references such as “the top territory” from names and dates without receiving earlier figures.</w:t>
+      </w:r>
+    </w:p>
+    <w:p>
+      <w:r>
+        <w:t>The backend checks the reporting period chosen by the AI service against the question. A question that names exactly one year, quarter or month uses that period; a question with no time wording and no earlier period to inherit leads to a clarification request instead of an assumed period. A factory named by the user is always applied as a filter.</w:t>
+      </w:r>
+    </w:p>
+    <w:p>
+      <w:r>
+        <w:t>Comparisons of one metric across up to four periods of the same kind are handled by a dedicated component. Each period runs as an ordinary validated query under the same permission checks, and the differences are computed by the backend from the returned rows, not by the AI service. A comparison of named factories is an ordinary grouped query limited to those factories, and the answer states which factories were left out.</w:t>
+      </w:r>
+    </w:p>
+    <w:p>
+      <w:r>
+        <w:t>A message containing several requests is split into separate requests, by backend rules or as marked by the AI service, up to five per message. Each request runs through the full processing flow, including its own permission check, and appears as a numbered block in the answer. A refused request, or one that needs more detail, affects only its own block; requests beyond the limit are listed as not performed.</w:t>
+      </w:r>
+    </w:p>
+    <w:p>
+      <w:pPr>
+        <w:pStyle w:val="Heading2"/>
+      </w:pPr>
+      <w:bookmarkStart w:id="30" w:name="_Toc240609492"/>
+      <w:r>
+        <w:t>8.5 Result Presentation and Traceability</w:t>
       </w:r>
       <w:bookmarkEnd w:id="30"/>
     </w:p>
     <w:p>
       <w:r>
-        <w:t>ACBI stores conversation history and pending clarification requests in Application Storage. For each question, the backend retrieves relevant context belonging to the current user and conversation, subject to current access permissions. Context may include previously selected metrics, reporting periods, filters, and comparison criteria.</w:t>
+        <w:t>Both Structured Intent and RAG Text-to-SQL use the same presentation process. After query execution, the backend prepares the results and approved metadata, including column names, data types, units, and reporting periods. The backend first applies deterministic rules to the shape of the result: a single value becomes a KPI card, a date axis a line chart, two groupings stacked bars, and a small whole a pie or donut chart; other results use bars. Only when no rule fits does the AI propose a visualization configuration based on this information and the user’s question. Supported outputs include bar, line, pie/donut, stacked bar, and scatter charts, as well as tables and KPI cards.</w:t>
       </w:r>
     </w:p>
     <w:p>
       <w:r>
-        <w:t>For example, after asking about this month's revenue for Factory A, the user may ask “What about last month?”. The system retains the metric and factory while updating the reporting period. Conversation context helps interpret the request but does not override approved business definitions or access permissions.</w:t>
+        <w:t>The backend validates the proposed chart type and column mappings against the actual results and supported visualization rules. Invalid configurations may be returned to the AI for correction within a limited number of attempts. If no valid configuration is obtained, the system displays the results as a table. The frontend renders the validated configuration using the query results; the AI does not generate replacement data values.</w:t>
       </w:r>
     </w:p>
     <w:p>
       <w:r>
-        <w:lastRenderedPageBreak/>
-        <w:t>When required information remains missing or ambiguous, the system asks a focused follow-up question and stores the unresolved request. The user's reply is combined with the relevant context and validated again before query processing continues. If clarification is still insufficient, the system asks again or explains the limitation rather than guessing.</w:t>
+        <w:t>Optional AI-generated summaries use only results permitted for transmission to the external service. Numerical statements are checked against the query results, and summaries containing unsupported claims are withheld or replaced with a factual response. No matching records are distinguished from a measured value of zero.</w:t>
       </w:r>
     </w:p>
     <w:p>
       <w:r>
-        <w:t xml:space="preserve">Only the six most recent turns are kept as conversational context. Before they are sent to the AI service, formatted amounts and decimal ratios in earlier answers are replaced by a placeholder, so the service can resolve references such as “the top territory” from names and dates without receiving earlier figures.</w:t>
+        <w:t xml:space="preserve">The system saves the question, answer, underlying query results, visualization configuration, executed SQL, parameters, source references, retrieval timestamp, and applicable metric-definition </w:t>
+      </w:r>
+      <w:r>
+        <w:lastRenderedPageBreak/>
+        <w:t>versions. These records link each answer to the data and calculation used. Saved results show their original retrieval time and remain subject to current access permissions when reopened.</w:t>
       </w:r>
     </w:p>
     <w:p>
-      <w:r>
-        <w:t xml:space="preserve">The backend checks the reporting period chosen by the AI service against the question. A question that names exactly one year, quarter or month uses that period; a question with no time wording and no earlier period to inherit leads to a clarification request instead of an assumed period. A factory named by the user is always applied as a filter.</w:t>
-      </w:r>
-    </w:p>
-    <w:p>
-      <w:r>
-        <w:t xml:space="preserve">Comparisons of one metric across up to four periods of the same kind are handled by a dedicated component. Each period runs as an ordinary validated query under the same permission checks, and the differences are computed by the backend from the returned rows, not by the AI service. A comparison of named factories is an ordinary grouped query limited to those factories, and the answer states which factories were left out.</w:t>
-      </w:r>
-    </w:p>
-    <w:p>
-      <w:r>
-        <w:t xml:space="preserve">A message containing several requests is split into separate requests, by backend rules or as marked by the AI service, up to five per message. Each request runs through the full processing flow, including its own permission check, and appears as a numbered block in the answer. A refused request, or one that needs more detail, affects only its own block; requests beyond the limit are listed as not performed.</w:t>
-      </w:r>
-    </w:p>
-    <w:p>
       <w:pPr>
         <w:pStyle w:val="Heading2"/>
       </w:pPr>
-      <w:bookmarkStart w:id="31" w:name="_Toc240609492"/>
-      <w:r>
-        <w:t>8.5 Result Presentation and Traceability</w:t>
+      <w:bookmarkStart w:id="31" w:name="_Toc240609493"/>
+      <w:r>
+        <w:t>8.6 Error Handling and External Service Calls</w:t>
       </w:r>
       <w:bookmarkEnd w:id="31"/>
-    </w:p>
-    <w:p>
-      <w:r>
-        <w:t xml:space="preserve">Both Structured Intent and RAG Text-to-SQL use the same presentation process. After query execution, the backend prepares the results and approved metadata, including column names, data types, units, and reporting periods. The backend first applies deterministic rules to the shape of the result: a single value becomes a KPI card, a date axis a line chart, two groupings stacked bars, and a small whole a pie or donut chart; other results use bars. Only when no rule fits does the AI propose a visualization configuration based on this information and the user’s question. Supported outputs include bar, line, pie/donut, stacked bar, and scatter charts, as well as tables and KPI cards.</w:t>
-      </w:r>
-    </w:p>
-    <w:p>
-      <w:r>
-        <w:t>The backend validates the proposed chart type and column mappings against the actual results and supported visualization rules. Invalid configurations may be returned to the AI for correction within a limited number of attempts. If no valid configuration is obtained, the system displays the results as a table. The frontend renders the validated configuration using the query results; the AI does not generate replacement data values.</w:t>
-      </w:r>
-    </w:p>
-    <w:p>
-      <w:r>
-        <w:t>Optional AI-generated summaries use only results permitted for transmission to the external service. Numerical statements are checked against the query results, and summaries containing unsupported claims are withheld or replaced with a factual response. No matching records are distinguished from a measured value of zero.</w:t>
-      </w:r>
-    </w:p>
-    <w:p>
-      <w:r>
-        <w:t>The system saves the question, answer, underlying query results, visualization configuration, executed SQL, parameters, source references, retrieval timestamp, and applicable metric-definition versions. These records link each answer to the data and calculation used. Saved results show their original retrieval time and remain subject to current access permissions when reopened.</w:t>
-      </w:r>
-    </w:p>
-    <w:p>
-      <w:pPr>
-        <w:pStyle w:val="Heading2"/>
-      </w:pPr>
-      <w:bookmarkStart w:id="32" w:name="_Toc240609493"/>
-      <w:r>
-        <w:t>8.6 Error Handling and External Service Calls</w:t>
-      </w:r>
-      <w:bookmarkEnd w:id="32"/>
     </w:p>
     <w:p>
       <w:r>
@@ -10228,7 +10202,6 @@
           </w:tcPr>
           <w:p>
             <w:r>
-              <w:lastRenderedPageBreak/>
               <w:t>Invalid visualization or failed optional summary</w:t>
             </w:r>
           </w:p>
@@ -10277,7 +10250,7 @@
     <w:p/>
     <w:p>
       <w:r>
-        <w:t xml:space="preserve">External AI calls use server-side credentials and include only information permitted by company policy. Each call has a timeout, and temporary failures may be retried with a delay. Both retries and SQL-correction attempts are constrained by an overall request budget to prevent indefinite processing; by default the budget is 30 seconds and four AI calls. When a provider reports that a rate limit has been reached (HTTP 429, or 403 mentioning a limit) or that it is overloaded (5xx), the user is told that the AI service is busy and should retry later, and no partial or guessed answer is returned. While the AI service is unavailable, plain questions and short follow-ups that backend rules can read are still answered.</w:t>
+        <w:t>External AI calls use server-side credentials and include only information permitted by company policy. Each call has a timeout, and temporary failures may be retried with a delay. Both retries and SQL-correction attempts are constrained by an overall request budget to prevent indefinite processing; by default the budget is 30 seconds and four AI calls. When a provider reports that a rate limit has been reached (HTTP 429, or 403 mentioning a limit) or that it is overloaded (5xx), the user is told that the AI service is busy and should retry later, and no partial or guessed answer is returned. While the AI service is unavailable, plain questions and short follow-ups that backend rules can read are still answered.</w:t>
       </w:r>
     </w:p>
     <w:p>
@@ -10292,27 +10265,28 @@
       <w:pPr>
         <w:pStyle w:val="Heading1"/>
       </w:pPr>
-      <w:bookmarkStart w:id="33" w:name="_Toc240609494"/>
-      <w:r>
+      <w:bookmarkStart w:id="32" w:name="_Toc240609494"/>
+      <w:r>
+        <w:lastRenderedPageBreak/>
         <w:t>9. Architecture Decision</w:t>
       </w:r>
       <w:r>
         <w:t>s</w:t>
       </w:r>
-      <w:bookmarkEnd w:id="33"/>
+      <w:bookmarkEnd w:id="32"/>
     </w:p>
     <w:p>
       <w:pPr>
         <w:pStyle w:val="Heading2"/>
       </w:pPr>
-      <w:bookmarkStart w:id="34" w:name="_Toc240609495"/>
+      <w:bookmarkStart w:id="33" w:name="_Toc240609495"/>
       <w:r>
         <w:t>9.1</w:t>
       </w:r>
       <w:r>
         <w:t xml:space="preserve"> Hybrid Query Processing</w:t>
       </w:r>
-      <w:bookmarkEnd w:id="34"/>
+      <w:bookmarkEnd w:id="33"/>
     </w:p>
     <w:p>
       <w:r>
@@ -10357,7 +10331,7 @@
       <w:pPr>
         <w:pStyle w:val="Heading2"/>
       </w:pPr>
-      <w:bookmarkStart w:id="35" w:name="_Toc240609496"/>
+      <w:bookmarkStart w:id="34" w:name="_Toc240609496"/>
       <w:r>
         <w:t>9.2</w:t>
       </w:r>
@@ -10367,7 +10341,7 @@
       <w:r>
         <w:t>External LLM Service</w:t>
       </w:r>
-      <w:bookmarkEnd w:id="35"/>
+      <w:bookmarkEnd w:id="34"/>
     </w:p>
     <w:p>
       <w:r>
@@ -10387,7 +10361,7 @@
           <w:b/>
           <w:bCs/>
         </w:rPr>
-        <w:t xml:space="preserve">Decision:</w:t>
+        <w:t>Decision:</w:t>
       </w:r>
       <w:r>
         <w:t xml:space="preserve"> Use a pretrained LLM through an external API. Only company-approved information is transmitted, and API credentials remain on the server. This reduces model-hosting responsibilities but introduces provider dependency, network requirements, and usage costs. The AI calls sit behind one interface in the AI Integration module: providers whose API follows the OpenAI chat-completions format need only configuration, other providers may need an adapter. Production is intended to use one paid provider; hosting a model offline on a dedicated server remains the alternative, and Appendix B compares the cost of both. During the demonstration period several free providers and keys are rotated to avoid cost; this is a temporary arrangement that is removed when a paid plan is adopted.</w:t>
@@ -10409,9 +10383,8 @@
       <w:pPr>
         <w:pStyle w:val="Heading2"/>
       </w:pPr>
-      <w:bookmarkStart w:id="36" w:name="_Toc240609497"/>
-      <w:r>
-        <w:lastRenderedPageBreak/>
+      <w:bookmarkStart w:id="35" w:name="_Toc240609497"/>
+      <w:r>
         <w:t>9.3</w:t>
       </w:r>
       <w:r>
@@ -10420,7 +10393,7 @@
       <w:r>
         <w:t>Backend-Controlled Data Access</w:t>
       </w:r>
-      <w:bookmarkEnd w:id="36"/>
+      <w:bookmarkEnd w:id="35"/>
     </w:p>
     <w:p>
       <w:r>
@@ -10452,6 +10425,7 @@
           <w:b/>
           <w:bCs/>
         </w:rPr>
+        <w:lastRenderedPageBreak/>
         <w:t>Alternatives:</w:t>
       </w:r>
       <w:r>
@@ -10462,7 +10436,7 @@
       <w:pPr>
         <w:pStyle w:val="Heading2"/>
       </w:pPr>
-      <w:bookmarkStart w:id="37" w:name="_Toc240609498"/>
+      <w:bookmarkStart w:id="36" w:name="_Toc240609498"/>
       <w:r>
         <w:t>9.4</w:t>
       </w:r>
@@ -10472,7 +10446,7 @@
       <w:r>
         <w:t>AI-Proposed Visualizations</w:t>
       </w:r>
-      <w:bookmarkEnd w:id="37"/>
+      <w:bookmarkEnd w:id="36"/>
     </w:p>
     <w:p>
       <w:r>
@@ -10492,7 +10466,7 @@
           <w:b/>
           <w:bCs/>
         </w:rPr>
-        <w:t xml:space="preserve">Decision:</w:t>
+        <w:t>Decision:</w:t>
       </w:r>
       <w:r>
         <w:t xml:space="preserve"> Choose the visualization by backend rules for common result shapes, and let the AI propose the visualization type and column mappings when no rule fits. The backend validates the configuration, and the frontend renders it using actual query results. Invalid proposals may be corrected within a limited number of attempts; otherwise, results are displayed as a table.</w:t>
@@ -10504,7 +10478,7 @@
           <w:b/>
           <w:bCs/>
         </w:rPr>
-        <w:t xml:space="preserve">Alternatives:</w:t>
+        <w:t>Alternatives:</w:t>
       </w:r>
       <w:r>
         <w:t xml:space="preserve"> Select all visualizations through backend rules only, or require users to choose a chart type. Backend rules are more predictable, while manual selection requires additional user interaction.</w:t>
@@ -10514,7 +10488,7 @@
       <w:pPr>
         <w:pStyle w:val="Heading2"/>
       </w:pPr>
-      <w:bookmarkStart w:id="38" w:name="_Toc240609499"/>
+      <w:bookmarkStart w:id="37" w:name="_Toc240609499"/>
       <w:r>
         <w:t>9.5</w:t>
       </w:r>
@@ -10522,17 +10496,9 @@
         <w:t xml:space="preserve"> </w:t>
       </w:r>
       <w:r>
-        <w:t xml:space="preserve">Modular </w:t>
-      </w:r>
-      <w:proofErr w:type="spellStart"/>
-      <w:r>
-        <w:t>FastAPI</w:t>
-      </w:r>
-      <w:proofErr w:type="spellEnd"/>
-      <w:r>
-        <w:t xml:space="preserve"> Backend</w:t>
-      </w:r>
-      <w:bookmarkEnd w:id="38"/>
+        <w:t>Modular FastAPI Backend</w:t>
+      </w:r>
+      <w:bookmarkEnd w:id="37"/>
     </w:p>
     <w:p>
       <w:r>
@@ -10555,15 +10521,7 @@
         <w:t>Decision:</w:t>
       </w:r>
       <w:r>
-        <w:t xml:space="preserve"> Implement a single Python/</w:t>
-      </w:r>
-      <w:proofErr w:type="spellStart"/>
-      <w:r>
-        <w:t>FastAPI</w:t>
-      </w:r>
-      <w:proofErr w:type="spellEnd"/>
-      <w:r>
-        <w:t xml:space="preserve"> backend with separate modules for its main responsibilities. Python is selected for its readable syntax, extensive library ecosystem</w:t>
+        <w:t xml:space="preserve"> Implement a single Python/FastAPI backend with separate modules for its main responsibilities. Python is selected for its readable syntax, extensive library ecosystem</w:t>
       </w:r>
       <w:r>
         <w:t xml:space="preserve"> for AI</w:t>
@@ -10573,29 +10531,8 @@
       </w:r>
     </w:p>
     <w:p>
-      <w:proofErr w:type="spellStart"/>
-      <w:r>
-        <w:t>FastAPI</w:t>
-      </w:r>
-      <w:proofErr w:type="spellEnd"/>
-      <w:r>
-        <w:t xml:space="preserve"> provides API development features, including </w:t>
-      </w:r>
-      <w:proofErr w:type="spellStart"/>
-      <w:r>
-        <w:t>Pydantic</w:t>
-      </w:r>
-      <w:proofErr w:type="spellEnd"/>
-      <w:r>
-        <w:t xml:space="preserve">-based data validation and automatic </w:t>
-      </w:r>
-      <w:proofErr w:type="spellStart"/>
-      <w:r>
-        <w:t>OpenAPI</w:t>
-      </w:r>
-      <w:proofErr w:type="spellEnd"/>
-      <w:r>
-        <w:t xml:space="preserve"> documentation.</w:t>
+      <w:r>
+        <w:t>FastAPI provides API development features, including Pydantic-based data validation and automatic OpenAPI documentation.</w:t>
       </w:r>
     </w:p>
     <w:p>
@@ -10621,7 +10558,7 @@
       <w:pPr>
         <w:pStyle w:val="Heading2"/>
       </w:pPr>
-      <w:bookmarkStart w:id="39" w:name="_Toc240609500"/>
+      <w:bookmarkStart w:id="38" w:name="_Toc240609500"/>
       <w:r>
         <w:t>9.6</w:t>
       </w:r>
@@ -10631,7 +10568,7 @@
       <w:r>
         <w:t>Docker Compose Deployment</w:t>
       </w:r>
-      <w:bookmarkEnd w:id="39"/>
+      <w:bookmarkEnd w:id="38"/>
     </w:p>
     <w:p>
       <w:r>
@@ -10651,6 +10588,7 @@
           <w:b/>
           <w:bCs/>
         </w:rPr>
+        <w:lastRenderedPageBreak/>
         <w:t>Decision:</w:t>
       </w:r>
       <w:r>
@@ -10673,46 +10611,46 @@
       <w:pPr>
         <w:pStyle w:val="Heading1"/>
       </w:pPr>
-      <w:bookmarkStart w:id="40" w:name="_Toc240609501"/>
+      <w:bookmarkStart w:id="39" w:name="_Toc240609501"/>
       <w:r>
         <w:t>10. Quality Requirements</w:t>
+      </w:r>
+      <w:bookmarkEnd w:id="39"/>
+    </w:p>
+    <w:p>
+      <w:pPr>
+        <w:pStyle w:val="Heading2"/>
+      </w:pPr>
+      <w:bookmarkStart w:id="40" w:name="_Toc240609502"/>
+      <w:r>
+        <w:t>10.1 Quality Requirements Overview</w:t>
       </w:r>
       <w:bookmarkEnd w:id="40"/>
     </w:p>
     <w:p>
-      <w:pPr>
-        <w:pStyle w:val="Heading2"/>
-      </w:pPr>
-      <w:bookmarkStart w:id="41" w:name="_Toc240609502"/>
-      <w:r>
-        <w:t>10.1 Quality Requirements Overview</w:t>
-      </w:r>
-      <w:bookmarkEnd w:id="41"/>
+      <w:r>
+        <w:t>ACBI prioritizes accuracy, security, traceability, usability, and performance, as defined in Section 1.2. This section specifies scenarios and acceptance criteria for evaluating these goals.</w:t>
+      </w:r>
     </w:p>
     <w:p>
       <w:r>
-        <w:t>ACBI prioritizes accuracy, security, traceability, usability, and performance, as defined in Section 1.2. This section specifies scenarios and acceptance criteria for evaluating these goals.</w:t>
+        <w:t>Evaluation uses a controlled dataset, approved business definitions, test user accounts, and reference results verified independently of AI-generated SQL. The test set covers both query-processing paths, ambiguous questions, unauthorized requests, and empty results.</w:t>
       </w:r>
     </w:p>
     <w:p>
       <w:r>
-        <w:t>Evaluation uses a controlled dataset, approved business definitions, test user accounts, and reference results verified independently of AI-generated SQL. The test set covers both query-processing paths, ambiguous questions, unauthorized requests, and empty results.</w:t>
+        <w:t>The numerical targets below are provisional and will be reviewed after prototype testing.</w:t>
       </w:r>
     </w:p>
     <w:p>
-      <w:r>
-        <w:t>The numerical targets below are provisional and will be reviewed after prototype testing.</w:t>
-      </w:r>
-    </w:p>
-    <w:p>
       <w:pPr>
         <w:pStyle w:val="Heading2"/>
       </w:pPr>
-      <w:bookmarkStart w:id="42" w:name="_Toc240609503"/>
+      <w:bookmarkStart w:id="41" w:name="_Toc240609503"/>
       <w:r>
         <w:t>10.2 Quality Scenarios</w:t>
       </w:r>
-      <w:bookmarkEnd w:id="42"/>
+      <w:bookmarkEnd w:id="41"/>
     </w:p>
     <w:tbl>
       <w:tblPr>
@@ -10978,7 +10916,6 @@
           </w:tcPr>
           <w:p>
             <w:r>
-              <w:lastRenderedPageBreak/>
               <w:t>QS4</w:t>
             </w:r>
           </w:p>
@@ -11048,7 +10985,11 @@
           </w:tcPr>
           <w:p>
             <w:r>
-              <w:t>A user asks an ambiguous question and then provides the requested clarification. The system uses the reply and relevant conversation context to resolve the request.</w:t>
+              <w:t xml:space="preserve">A user asks an ambiguous question and then provides the requested clarification. The </w:t>
+            </w:r>
+            <w:r>
+              <w:lastRenderedPageBreak/>
+              <w:t>system uses the reply and relevant conversation context to resolve the request.</w:t>
             </w:r>
           </w:p>
         </w:tc>
@@ -11058,7 +10999,12 @@
           </w:tcPr>
           <w:p>
             <w:r>
-              <w:t>Each defined ambiguity test produces a relevant clarification before query execution. Follow-up tests preserve previously specified metrics and filters unless the user changes them.</w:t>
+              <w:lastRenderedPageBreak/>
+              <w:t xml:space="preserve">Each defined ambiguity test produces a relevant clarification before query execution. Follow-up tests preserve previously specified </w:t>
+            </w:r>
+            <w:r>
+              <w:lastRenderedPageBreak/>
+              <w:t>metrics and filters unless the user changes them.</w:t>
             </w:r>
           </w:p>
         </w:tc>
@@ -11075,6 +11021,7 @@
           </w:tcPr>
           <w:p>
             <w:r>
+              <w:lastRenderedPageBreak/>
               <w:t>QS6</w:t>
             </w:r>
           </w:p>
@@ -11218,11 +11165,11 @@
       <w:pPr>
         <w:pStyle w:val="Heading1"/>
       </w:pPr>
-      <w:bookmarkStart w:id="43" w:name="_Toc240609504"/>
+      <w:bookmarkStart w:id="42" w:name="_Toc240609504"/>
       <w:r>
         <w:t>11. Risks and Technical Debts</w:t>
       </w:r>
-      <w:bookmarkEnd w:id="43"/>
+      <w:bookmarkEnd w:id="42"/>
     </w:p>
     <w:p>
       <w:r>
@@ -11233,14 +11180,14 @@
       <w:pPr>
         <w:pStyle w:val="Heading2"/>
       </w:pPr>
-      <w:bookmarkStart w:id="44" w:name="_Toc240609505"/>
+      <w:bookmarkStart w:id="43" w:name="_Toc240609505"/>
       <w:r>
         <w:t xml:space="preserve">11.1 </w:t>
       </w:r>
       <w:r>
         <w:t>Incorrect Business Results</w:t>
       </w:r>
-      <w:bookmarkEnd w:id="44"/>
+      <w:bookmarkEnd w:id="43"/>
     </w:p>
     <w:p>
       <w:r>
@@ -11263,30 +11210,21 @@
         <w:t>Mitigation:</w:t>
       </w:r>
       <w:r>
-        <w:t xml:space="preserve"> Use approved KPI definitions and verified data mappings for both query paths. Ask for </w:t>
-      </w:r>
-      <w:proofErr w:type="gramStart"/>
-      <w:r>
-        <w:t>clarification</w:t>
-      </w:r>
-      <w:proofErr w:type="gramEnd"/>
-      <w:r>
-        <w:t xml:space="preserve"> when necessary, compare results against independently verified reference answers, and retain query and source information for investigation. Revalidate affected mappings and tests when definitions or schemas change.</w:t>
+        <w:t xml:space="preserve"> Use approved KPI definitions and verified data mappings for both query paths. Ask for clarification when necessary, compare results against independently verified reference answers, and retain query and source information for investigation. Revalidate affected mappings and tests when definitions or schemas change.</w:t>
       </w:r>
     </w:p>
     <w:p>
       <w:pPr>
         <w:pStyle w:val="Heading2"/>
       </w:pPr>
-      <w:bookmarkStart w:id="45" w:name="_Toc240609506"/>
-      <w:r>
-        <w:lastRenderedPageBreak/>
+      <w:bookmarkStart w:id="44" w:name="_Toc240609506"/>
+      <w:r>
         <w:t>11.2</w:t>
       </w:r>
       <w:r>
         <w:t xml:space="preserve"> Unauthorized Data Disclosure</w:t>
       </w:r>
-      <w:bookmarkEnd w:id="45"/>
+      <w:bookmarkEnd w:id="44"/>
     </w:p>
     <w:p>
       <w:r>
@@ -11306,7 +11244,8 @@
           <w:b/>
           <w:bCs/>
         </w:rPr>
-        <w:t xml:space="preserve">Mitigation:</w:t>
+        <w:lastRenderedPageBreak/>
+        <w:t>Mitigation:</w:t>
       </w:r>
       <w:r>
         <w:t xml:space="preserve"> Enforce access scope in the backend and use restricted, read-only database credentials. Check current permissions when accessing stored results and limit external AI requests to company-approved content. Test unauthorized-access scenarios across both query paths. The content of each external call is listed in Section 3.2 and must be kept up to date. Before real company data is used, each provider’s retention and training terms are reviewed, data is classified by sensitivity, and an independent penetration test is performed.</w:t>
@@ -11316,14 +11255,14 @@
       <w:pPr>
         <w:pStyle w:val="Heading2"/>
       </w:pPr>
-      <w:bookmarkStart w:id="46" w:name="_Toc240609507"/>
+      <w:bookmarkStart w:id="45" w:name="_Toc240609507"/>
       <w:r>
         <w:t>11.3</w:t>
       </w:r>
       <w:r>
         <w:t xml:space="preserve"> External AI Service Dependency</w:t>
       </w:r>
-      <w:bookmarkEnd w:id="46"/>
+      <w:bookmarkEnd w:id="45"/>
     </w:p>
     <w:p>
       <w:r>
@@ -11343,7 +11282,7 @@
           <w:b/>
           <w:bCs/>
         </w:rPr>
-        <w:t xml:space="preserve">Mitigation:</w:t>
+        <w:t>Mitigation:</w:t>
       </w:r>
       <w:r>
         <w:t xml:space="preserve"> Apply timeouts, bounded retries, and an overall request deadline. Monitor latency and usage, limit transmitted context, and return a clear failure message when processing cannot complete. If only chart generation or optional summarization fails, present the validated query results as a table. Free-tier quotas limit concurrent use, so production relies on a paid plan or an offline model (Section 9.2).</w:t>
@@ -11353,14 +11292,14 @@
       <w:pPr>
         <w:pStyle w:val="Heading2"/>
       </w:pPr>
-      <w:bookmarkStart w:id="47" w:name="_Toc240609508"/>
+      <w:bookmarkStart w:id="46" w:name="_Toc240609508"/>
       <w:r>
         <w:t>11.4</w:t>
       </w:r>
       <w:r>
         <w:t xml:space="preserve"> Limited Initial Validation Coverage</w:t>
       </w:r>
-      <w:bookmarkEnd w:id="47"/>
+      <w:bookmarkEnd w:id="46"/>
     </w:p>
     <w:p>
       <w:r>
@@ -11391,11 +11330,11 @@
       <w:pPr>
         <w:pStyle w:val="Heading1"/>
       </w:pPr>
-      <w:bookmarkStart w:id="48" w:name="_Toc240609509"/>
+      <w:bookmarkStart w:id="47" w:name="_Toc240609509"/>
       <w:r>
         <w:t>12. Glossary</w:t>
       </w:r>
-      <w:bookmarkEnd w:id="48"/>
+      <w:bookmarkEnd w:id="47"/>
     </w:p>
     <w:p/>
     <w:tbl>
@@ -11688,11 +11627,9 @@
             <w:tcW w:w="3325" w:type="dxa"/>
           </w:tcPr>
           <w:p>
-            <w:proofErr w:type="spellStart"/>
             <w:r>
               <w:t>FastAPI</w:t>
             </w:r>
-            <w:proofErr w:type="spellEnd"/>
           </w:p>
         </w:tc>
         <w:tc>
@@ -11701,14 +11638,12 @@
           </w:tcPr>
           <w:p>
             <w:hyperlink r:id="rId22" w:history="1">
-              <w:proofErr w:type="spellStart"/>
               <w:r>
                 <w:rPr>
                   <w:rStyle w:val="Hyperlink"/>
                 </w:rPr>
                 <w:t>FastAPI</w:t>
               </w:r>
-              <w:proofErr w:type="spellEnd"/>
             </w:hyperlink>
             <w:r>
               <w:t xml:space="preserve"> is a Python framework for building APIs using type annotations. It is used to implement the ACBI application backend.</w:t>
@@ -11850,11 +11785,9 @@
             <w:tcW w:w="3325" w:type="dxa"/>
           </w:tcPr>
           <w:p>
-            <w:proofErr w:type="spellStart"/>
             <w:r>
               <w:t>Pydantic</w:t>
             </w:r>
-            <w:proofErr w:type="spellEnd"/>
           </w:p>
         </w:tc>
         <w:tc>
@@ -11863,14 +11796,12 @@
           </w:tcPr>
           <w:p>
             <w:hyperlink r:id="rId23" w:history="1">
-              <w:proofErr w:type="spellStart"/>
               <w:r>
                 <w:rPr>
                   <w:rStyle w:val="Hyperlink"/>
                 </w:rPr>
                 <w:t>Pydantic</w:t>
               </w:r>
-              <w:proofErr w:type="spellEnd"/>
             </w:hyperlink>
             <w:r>
               <w:t xml:space="preserve"> is a Python library for data validation using type annotations. In ACBI, it supports checking the structure and types of request and response data.</w:t>
@@ -12092,11 +12023,11 @@
       <w:pPr>
         <w:pStyle w:val="Heading1"/>
       </w:pPr>
-      <w:bookmarkStart w:id="49" w:name="_Toc240609510"/>
+      <w:bookmarkStart w:id="48" w:name="_Toc240609510"/>
       <w:r>
         <w:t>Appendix A. Implementation Roadmap</w:t>
       </w:r>
-      <w:bookmarkEnd w:id="49"/>
+      <w:bookmarkEnd w:id="48"/>
     </w:p>
     <w:p>
       <w:r>
@@ -12290,12 +12221,12 @@
       <w:pPr>
         <w:pStyle w:val="Heading1"/>
       </w:pPr>
-      <w:bookmarkStart w:id="50" w:name="_Toc240609511"/>
+      <w:bookmarkStart w:id="49" w:name="_Toc240609511"/>
       <w:r>
         <w:lastRenderedPageBreak/>
         <w:t>Appendix B. Cost and Resource Estimation</w:t>
       </w:r>
-      <w:bookmarkEnd w:id="50"/>
+      <w:bookmarkEnd w:id="49"/>
     </w:p>
     <w:p>
       <w:r>
@@ -12469,15 +12400,7 @@
           </w:tcPr>
           <w:p>
             <w:r>
-              <w:t xml:space="preserve">Registration and renewal if a custom domain </w:t>
-            </w:r>
-            <w:proofErr w:type="gramStart"/>
-            <w:r>
-              <w:t>is</w:t>
-            </w:r>
-            <w:proofErr w:type="gramEnd"/>
-            <w:r>
-              <w:t xml:space="preserve"> required.</w:t>
+              <w:t>Registration and renewal if a custom domain is required.</w:t>
             </w:r>
           </w:p>
         </w:tc>
@@ -12495,12 +12418,12 @@
           <w:b/>
           <w:bCs/>
         </w:rPr>
-        <w:t xml:space="preserve">Indicative AI Cost</w:t>
+        <w:t>Indicative AI Cost</w:t>
       </w:r>
     </w:p>
     <w:p>
       <w:r>
-        <w:t xml:space="preserve">An indicative estimate for the AI service alone, at October 2026 prices. It assumes the worst case, in which every question calls the AI service for interpretation, SQL proposal and chart selection; it leaves out SQL correction attempts, summaries and replies about the data. Prices and token counts must be confirmed before a decision, and the Claude options have not yet been run against the project test set.</w:t>
+        <w:t>An indicative estimate for the AI service alone, at October 2026 prices. It assumes the worst case, in which every question calls the AI service for interpretation, SQL proposal and chart selection; it leaves out SQL correction attempts, summaries and replies about the data. Prices and token counts must be confirmed before a decision, and the Claude options have not yet been run against the project test set.</w:t>
       </w:r>
     </w:p>
     <w:tbl>
@@ -12535,7 +12458,7 @@
                 <w:bCs/>
                 <w:sz w:val="20"/>
               </w:rPr>
-              <w:t xml:space="preserve">Option</w:t>
+              <w:t>Option</w:t>
             </w:r>
           </w:p>
         </w:tc>
@@ -12554,7 +12477,7 @@
                 <w:bCs/>
                 <w:sz w:val="20"/>
               </w:rPr>
-              <w:t xml:space="preserve">Estimated cost</w:t>
+              <w:t>Estimated cost</w:t>
             </w:r>
           </w:p>
         </w:tc>
@@ -12573,7 +12496,7 @@
                 <w:bCs/>
                 <w:sz w:val="20"/>
               </w:rPr>
-              <w:t xml:space="preserve">Notes</w:t>
+              <w:t>Notes</w:t>
             </w:r>
           </w:p>
         </w:tc>
@@ -12594,7 +12517,7 @@
               <w:rPr>
                 <w:sz w:val="18"/>
               </w:rPr>
-              <w:t xml:space="preserve">Claude Haiku 5.5 API</w:t>
+              <w:t>Claude Haiku 5.5 API</w:t>
             </w:r>
           </w:p>
         </w:tc>
@@ -12610,7 +12533,7 @@
               <w:rPr>
                 <w:sz w:val="18"/>
               </w:rPr>
-              <w:t xml:space="preserve">About USD 4 (5,000 questions), 16 (20,000) and 79 (100,000) per month</w:t>
+              <w:t>About USD 4 (5,000 questions), 16 (20,000) and 79 (100,000) per month</w:t>
             </w:r>
           </w:p>
         </w:tc>
@@ -12626,7 +12549,7 @@
               <w:rPr>
                 <w:sz w:val="18"/>
               </w:rPr>
-              <w:t xml:space="preserve">Not yet benchmarked on the project test set</w:t>
+              <w:t>Not yet benchmarked on the project test set</w:t>
             </w:r>
           </w:p>
         </w:tc>
@@ -12647,7 +12570,7 @@
               <w:rPr>
                 <w:sz w:val="18"/>
               </w:rPr>
-              <w:t xml:space="preserve">Claude Sonnet 5.5 API</w:t>
+              <w:t>Claude Sonnet 5.5 API</w:t>
             </w:r>
           </w:p>
         </w:tc>
@@ -12663,7 +12586,7 @@
               <w:rPr>
                 <w:sz w:val="18"/>
               </w:rPr>
-              <w:t xml:space="preserve">About 20 times the Haiku cost</w:t>
+              <w:t>About 20 times the Haiku cost</w:t>
             </w:r>
           </w:p>
         </w:tc>
@@ -12679,7 +12602,7 @@
               <w:rPr>
                 <w:sz w:val="18"/>
               </w:rPr>
-              <w:t xml:space="preserve">Only if Haiku quality is insufficient</w:t>
+              <w:t>Only if Haiku quality is insufficient</w:t>
             </w:r>
           </w:p>
         </w:tc>
@@ -12700,7 +12623,7 @@
               <w:rPr>
                 <w:sz w:val="18"/>
               </w:rPr>
-              <w:t xml:space="preserve">GPU server with an offline model</w:t>
+              <w:t>GPU server with an offline model</w:t>
             </w:r>
           </w:p>
         </w:tc>
@@ -12716,7 +12639,7 @@
               <w:rPr>
                 <w:sz w:val="18"/>
               </w:rPr>
-              <w:t xml:space="preserve">About USD 200 to 500 per month, fixed</w:t>
+              <w:t>About USD 200 to 500 per month, fixed</w:t>
             </w:r>
           </w:p>
         </w:tc>
@@ -12732,7 +12655,7 @@
               <w:rPr>
                 <w:sz w:val="18"/>
               </w:rPr>
-              <w:t xml:space="preserve">Excludes staff cost; data stays inside the company</w:t>
+              <w:t>Excludes staff cost; data stays inside the company</w:t>
             </w:r>
           </w:p>
         </w:tc>
@@ -12753,7 +12676,7 @@
               <w:rPr>
                 <w:sz w:val="18"/>
               </w:rPr>
-              <w:t xml:space="preserve">Break-even between the API and the server</w:t>
+              <w:t>Break-even between the API and the server</w:t>
             </w:r>
           </w:p>
         </w:tc>
@@ -12769,7 +12692,7 @@
               <w:rPr>
                 <w:sz w:val="18"/>
               </w:rPr>
-              <w:t xml:space="preserve">About 250,000 questions per month at USD 200, about 630,000 at USD 500</w:t>
+              <w:t>About 250,000 questions per month at USD 200, about 630,000 at USD 500</w:t>
             </w:r>
           </w:p>
         </w:tc>
@@ -12785,7 +12708,7 @@
               <w:rPr>
                 <w:sz w:val="18"/>
               </w:rPr>
-              <w:t xml:space="preserve">Below this volume the API is cheaper</w:t>
+              <w:t>Below this volume the API is cheaper</w:t>
             </w:r>
           </w:p>
         </w:tc>
@@ -12793,7 +12716,7 @@
     </w:tbl>
     <w:p>
       <w:r>
-        <w:t xml:space="preserve">Operating staff cost is not yet estimated and is to be completed.</w:t>
+        <w:t>Operating staff cost is not yet estimated and is to be completed.</w:t>
       </w:r>
     </w:p>
     <w:sectPr>
@@ -12843,23 +12766,7 @@
         <w:color w:val="787878"/>
         <w:sz w:val="16"/>
       </w:rPr>
-      <w:t xml:space="preserve">Technical Solution </w:t>
-    </w:r>
-    <w:proofErr w:type="gramStart"/>
-    <w:r>
-      <w:rPr>
-        <w:color w:val="787878"/>
-        <w:sz w:val="16"/>
-      </w:rPr>
-      <w:t>Proposal  |</w:t>
-    </w:r>
-    <w:proofErr w:type="gramEnd"/>
-    <w:r>
-      <w:rPr>
-        <w:color w:val="787878"/>
-        <w:sz w:val="16"/>
-      </w:rPr>
-      <w:t xml:space="preserve">  AI-Powered Conversational BI</w:t>
+      <w:t>Technical Solution Proposal  |  AI-Powered Conversational BI</w:t>
     </w:r>
   </w:p>
   <w:p>

</xml_diff>

<commit_message>
Proposal 8.2: state that the interpretation catalogue is not yet filtered by role
</commit_message>
<xml_diff>
--- a/docs/ACBI_Technical_Solution_Proposal_v1.1.docx
+++ b/docs/ACBI_Technical_Solution_Proposal_v1.1.docx
@@ -426,13 +426,7 @@
               <w:rPr>
                 <w:sz w:val="18"/>
               </w:rPr>
-              <w:t>1</w:t>
-            </w:r>
-            <w:r>
-              <w:rPr>
-                <w:sz w:val="18"/>
-              </w:rPr>
-              <w:t>/10/2026</w:t>
+              <w:t>1/10/2026</w:t>
             </w:r>
           </w:p>
         </w:tc>
@@ -485,13 +479,7 @@
               <w:rPr>
                 <w:sz w:val="18"/>
               </w:rPr>
-              <w:t>4</w:t>
-            </w:r>
-            <w:r>
-              <w:rPr>
-                <w:sz w:val="18"/>
-              </w:rPr>
-              <w:t>/10/2026</w:t>
+              <w:t>4/10/2026</w:t>
             </w:r>
           </w:p>
         </w:tc>
@@ -544,13 +532,7 @@
               <w:rPr>
                 <w:sz w:val="18"/>
               </w:rPr>
-              <w:t>8</w:t>
-            </w:r>
-            <w:r>
-              <w:rPr>
-                <w:sz w:val="18"/>
-              </w:rPr>
-              <w:t>/10/2026</w:t>
+              <w:t>8/10/2026</w:t>
             </w:r>
           </w:p>
         </w:tc>
@@ -4678,11 +4660,16 @@
     </w:p>
     <w:p>
       <w:r>
-        <w:t>The system must not fabricate data or present unsupported conclusions. If the available data is insufficient to answer a question</w:t>
+        <w:t xml:space="preserve">The system must not fabricate data or present unsupported conclusions. If the available data is insufficient to answer a </w:t>
+      </w:r>
+      <w:proofErr w:type="gramStart"/>
+      <w:r>
+        <w:t>question</w:t>
       </w:r>
       <w:r>
         <w:t>s</w:t>
       </w:r>
+      <w:proofErr w:type="gramEnd"/>
       <w:r>
         <w:t xml:space="preserve">, it must clearly state this limitation </w:t>
       </w:r>
@@ -4698,7 +4685,15 @@
     </w:p>
     <w:p>
       <w:r>
-        <w:t>The system must ask follow-up question when a request is ambiguous, such as “ Are there any problem</w:t>
+        <w:t xml:space="preserve">The system must ask follow-up question when a request is ambiguous, such as </w:t>
+      </w:r>
+      <w:proofErr w:type="gramStart"/>
+      <w:r>
+        <w:t>“ Are</w:t>
+      </w:r>
+      <w:proofErr w:type="gramEnd"/>
+      <w:r>
+        <w:t xml:space="preserve"> there any problem</w:t>
       </w:r>
       <w:r>
         <w:t>s</w:t>
@@ -6412,7 +6407,15 @@
         <w:t>standardized</w:t>
       </w:r>
       <w:r>
-        <w:t xml:space="preserve"> business data, such as sales, production, quality,… It </w:t>
+        <w:t xml:space="preserve"> business data, such as sales, production, </w:t>
+      </w:r>
+      <w:proofErr w:type="gramStart"/>
+      <w:r>
+        <w:t>quality,…</w:t>
+      </w:r>
+      <w:proofErr w:type="gramEnd"/>
+      <w:r>
+        <w:t xml:space="preserve"> It </w:t>
       </w:r>
       <w:r>
         <w:t>supplies data requested by ACBI</w:t>
@@ -7395,7 +7398,15 @@
     </w:p>
     <w:p>
       <w:r>
-        <w:t>ACBI is developed as a web application that enables users to retrieve and compare business data through natural language, reducing manual navigation of dashboards and reports. Python/FastAPI is selected for the backend to support integration with AI libraries, document retrieval, and data processing. The system accesses a pretrained LLM through an external API, while data queries and numerical calculations are executed in the database.</w:t>
+        <w:t>ACBI is developed as a web application that enables users to retrieve and compare business data through natural language, reducing manual navigation of dashboards and reports. Python/</w:t>
+      </w:r>
+      <w:proofErr w:type="spellStart"/>
+      <w:r>
+        <w:t>FastAPI</w:t>
+      </w:r>
+      <w:proofErr w:type="spellEnd"/>
+      <w:r>
+        <w:t xml:space="preserve"> is selected for the backend to support integration with AI libraries, document retrieval, and data processing. The system accesses a pretrained LLM through an external API, while data queries and numerical calculations are executed in the database.</w:t>
       </w:r>
     </w:p>
     <w:p>
@@ -8313,7 +8324,15 @@
           </w:tcPr>
           <w:p>
             <w:r>
-              <w:t>Coordinates request processing and selects Structured Intent or RAG Text-to-SQL based on whether the standard query builder fully supports the request.</w:t>
+              <w:t xml:space="preserve">Coordinates request processing and </w:t>
+            </w:r>
+            <w:proofErr w:type="gramStart"/>
+            <w:r>
+              <w:t>selects</w:t>
+            </w:r>
+            <w:proofErr w:type="gramEnd"/>
+            <w:r>
+              <w:t xml:space="preserve"> Structured Intent or RAG Text-to-SQL based on whether the standard query builder fully supports the request.</w:t>
             </w:r>
           </w:p>
         </w:tc>
@@ -8482,7 +8501,15 @@
           </w:tcPr>
           <w:p>
             <w:r>
-              <w:t>Formats query results and validates chart configurations. Uses AI Integration for optional summarization when permitted.</w:t>
+              <w:t xml:space="preserve">Formats query results and </w:t>
+            </w:r>
+            <w:proofErr w:type="gramStart"/>
+            <w:r>
+              <w:t>validates</w:t>
+            </w:r>
+            <w:proofErr w:type="gramEnd"/>
+            <w:r>
+              <w:t xml:space="preserve"> chart configurations. Uses AI Integration for optional summarization when permitted.</w:t>
             </w:r>
           </w:p>
         </w:tc>
@@ -9407,7 +9434,15 @@
     </w:p>
     <w:p>
       <w:r>
-        <w:t>Docker Compose will manage three containers: a web server serving the frontend, the FastAPI backend, and the application database. This approach provides a consistent deployment configuration across development and production environments.</w:t>
+        <w:t xml:space="preserve">Docker Compose will manage three containers: a web server serving the frontend, the </w:t>
+      </w:r>
+      <w:proofErr w:type="spellStart"/>
+      <w:r>
+        <w:t>FastAPI</w:t>
+      </w:r>
+      <w:proofErr w:type="spellEnd"/>
+      <w:r>
+        <w:t xml:space="preserve"> backend, and the application database. This approach provides a consistent deployment configuration across development and production environments.</w:t>
       </w:r>
     </w:p>
     <w:p>
@@ -9602,7 +9637,7 @@
     </w:p>
     <w:p>
       <w:r>
-        <w:t>Both Structured Intent and RAG Text-to-SQL use this dictionary. The standard query builder applies predefined calculation rules, while the RAG path retrieves relevant definitions, table and column descriptions and data relationships to support SQL generation. Retrieved metadata is restricted to the user’s authorized scope.</w:t>
+        <w:t>Both Structured Intent and RAG Text-to-SQL use this dictionary. The standard query builder applies predefined calculation rules, while the RAG path retrieves relevant definitions, table and column descriptions and data relationships to support SQL generation. Retrieved metadata is restricted to the user’s authorized scope. The catalogue of metric names, dimensions and members that is sent to the AI service to interpret a question is not yet filtered by role (Section 3.2); each request is still authorized by the backend before any query runs, and limiting the catalogue to what the role may see is to be reviewed before real company data is used.</w:t>
       </w:r>
     </w:p>
     <w:p>
@@ -9741,12 +9776,28 @@
     </w:p>
     <w:p>
       <w:r>
-        <w:t>ACBI treats AI-generated output as a proposal that must be checked by the backend before use. For structured requests, the backend validates the output format, required fields, metric identifiers where applicable, time ranges, and filters against the available business definitions and metadata. Requests with missing or ambiguous business information lead to clarification rather than query execution. Malformed AI output is rejected and may be regenerated within a limited number of attempts.</w:t>
+        <w:t xml:space="preserve">ACBI treats AI-generated output as a proposal that must be checked by the backend before use. For structured requests, the backend validates the output format, required fields, metric identifiers where applicable, time ranges, and filters against the available business definitions and metadata. Requests with missing or ambiguous business information </w:t>
+      </w:r>
+      <w:proofErr w:type="gramStart"/>
+      <w:r>
+        <w:t>lead</w:t>
+      </w:r>
+      <w:proofErr w:type="gramEnd"/>
+      <w:r>
+        <w:t xml:space="preserve"> to clarification rather than query execution. Malformed AI output is rejected and may be regenerated within a limited number of attempts.</w:t>
       </w:r>
     </w:p>
     <w:p>
       <w:r>
-        <w:t>SQL produced by either the standard query builder or RAG Text-to-SQL passes through a shared validation process. The backend parses the SQL to check permitted operations, tables, columns, and functions, and enforces the user's access scope. User-supplied filter values are passed as query parameters. Approved queries are executed using read-only credentials, with execution time and result-size limits. By default a query is stopped after 15 seconds or the remaining request time, whichever is shorter, and returns at most 100 rows (250 for stacked charts, 400 when grouped by day, week or month); when a result reaches the limit and the user did not ask for a top N, the answer says that only the first rows are shown.</w:t>
+        <w:t xml:space="preserve">SQL produced by either the standard query builder or RAG Text-to-SQL passes through a shared validation process. The backend parses the SQL to check permitted operations, tables, columns, and functions, and enforces the user's access scope. User-supplied filter values are passed as query parameters. Approved queries are executed using read-only credentials, with execution time and result-size limits. By </w:t>
+      </w:r>
+      <w:proofErr w:type="gramStart"/>
+      <w:r>
+        <w:t>default</w:t>
+      </w:r>
+      <w:proofErr w:type="gramEnd"/>
+      <w:r>
+        <w:t xml:space="preserve"> a query is stopped after 15 seconds or the remaining request time, whichever is shorter, and returns at most 100 rows (250 for stacked charts, 400 when grouped by day, week or month); when a result reaches the limit and the user did not ask for a top N, the answer says that only the first rows are shown.</w:t>
       </w:r>
     </w:p>
     <w:p>
@@ -9924,7 +9975,15 @@
     </w:p>
     <w:p>
       <w:r>
-        <w:t>Both Structured Intent and RAG Text-to-SQL use the same presentation process. After query execution, the backend prepares the results and approved metadata, including column names, data types, units, and reporting periods. The backend first applies deterministic rules to the shape of the result: a single value becomes a KPI card, a date axis a line chart, two groupings stacked bars, and a small whole a pie or donut chart; other results use bars. Only when no rule fits does the AI propose a visualization configuration based on this information and the user’s question. Supported outputs include bar, line, pie/donut, stacked bar, and scatter charts, as well as tables and KPI cards.</w:t>
+        <w:t xml:space="preserve">Both Structured Intent and RAG Text-to-SQL use the same presentation process. After query execution, the backend prepares the results and approved metadata, including column names, data types, units, and reporting periods. The backend first applies deterministic rules to the shape of the result: a single value becomes a KPI card, a date axis a line chart, two groupings stacked bars, and a small whole a pie or donut chart; other results use bars. Only when no rule fits </w:t>
+      </w:r>
+      <w:proofErr w:type="gramStart"/>
+      <w:r>
+        <w:t>does</w:t>
+      </w:r>
+      <w:proofErr w:type="gramEnd"/>
+      <w:r>
+        <w:t xml:space="preserve"> the AI propose a visualization configuration based on this information and the user’s question. Supported outputs include bar, line, pie/donut, stacked bar, and scatter charts, as well as tables and KPI cards.</w:t>
       </w:r>
     </w:p>
     <w:p>
@@ -10250,7 +10309,15 @@
     <w:p/>
     <w:p>
       <w:r>
-        <w:t>External AI calls use server-side credentials and include only information permitted by company policy. Each call has a timeout, and temporary failures may be retried with a delay. Both retries and SQL-correction attempts are constrained by an overall request budget to prevent indefinite processing; by default the budget is 30 seconds and four AI calls. When a provider reports that a rate limit has been reached (HTTP 429, or 403 mentioning a limit) or that it is overloaded (5xx), the user is told that the AI service is busy and should retry later, and no partial or guessed answer is returned. While the AI service is unavailable, plain questions and short follow-ups that backend rules can read are still answered.</w:t>
+        <w:t xml:space="preserve">External AI calls use server-side credentials and include only information permitted by company policy. Each call has a timeout, and temporary failures may be retried with a delay. Both retries and SQL-correction attempts are constrained by an overall request budget to prevent indefinite processing; by </w:t>
+      </w:r>
+      <w:proofErr w:type="gramStart"/>
+      <w:r>
+        <w:t>default</w:t>
+      </w:r>
+      <w:proofErr w:type="gramEnd"/>
+      <w:r>
+        <w:t xml:space="preserve"> the budget is 30 seconds and four AI calls. When a provider reports that a rate limit has been reached (HTTP 429, or 403 mentioning a limit) or that it is overloaded (5xx), the user is told that the AI service is busy and should retry later, and no partial or guessed answer is returned. While the AI service is unavailable, plain questions and short follow-ups that backend rules can read are still answered.</w:t>
       </w:r>
     </w:p>
     <w:p>
@@ -10496,7 +10563,15 @@
         <w:t xml:space="preserve"> </w:t>
       </w:r>
       <w:r>
-        <w:t>Modular FastAPI Backend</w:t>
+        <w:t xml:space="preserve">Modular </w:t>
+      </w:r>
+      <w:proofErr w:type="spellStart"/>
+      <w:r>
+        <w:t>FastAPI</w:t>
+      </w:r>
+      <w:proofErr w:type="spellEnd"/>
+      <w:r>
+        <w:t xml:space="preserve"> Backend</w:t>
       </w:r>
       <w:bookmarkEnd w:id="37"/>
     </w:p>
@@ -10521,7 +10596,15 @@
         <w:t>Decision:</w:t>
       </w:r>
       <w:r>
-        <w:t xml:space="preserve"> Implement a single Python/FastAPI backend with separate modules for its main responsibilities. Python is selected for its readable syntax, extensive library ecosystem</w:t>
+        <w:t xml:space="preserve"> Implement a single Python/</w:t>
+      </w:r>
+      <w:proofErr w:type="spellStart"/>
+      <w:r>
+        <w:t>FastAPI</w:t>
+      </w:r>
+      <w:proofErr w:type="spellEnd"/>
+      <w:r>
+        <w:t xml:space="preserve"> backend with separate modules for its main responsibilities. Python is selected for its readable syntax, extensive library ecosystem</w:t>
       </w:r>
       <w:r>
         <w:t xml:space="preserve"> for AI</w:t>
@@ -10531,8 +10614,29 @@
       </w:r>
     </w:p>
     <w:p>
-      <w:r>
-        <w:t>FastAPI provides API development features, including Pydantic-based data validation and automatic OpenAPI documentation.</w:t>
+      <w:proofErr w:type="spellStart"/>
+      <w:r>
+        <w:t>FastAPI</w:t>
+      </w:r>
+      <w:proofErr w:type="spellEnd"/>
+      <w:r>
+        <w:t xml:space="preserve"> provides API development features, including </w:t>
+      </w:r>
+      <w:proofErr w:type="spellStart"/>
+      <w:r>
+        <w:t>Pydantic</w:t>
+      </w:r>
+      <w:proofErr w:type="spellEnd"/>
+      <w:r>
+        <w:t xml:space="preserve">-based data validation and automatic </w:t>
+      </w:r>
+      <w:proofErr w:type="spellStart"/>
+      <w:r>
+        <w:t>OpenAPI</w:t>
+      </w:r>
+      <w:proofErr w:type="spellEnd"/>
+      <w:r>
+        <w:t xml:space="preserve"> documentation.</w:t>
       </w:r>
     </w:p>
     <w:p>
@@ -11210,7 +11314,15 @@
         <w:t>Mitigation:</w:t>
       </w:r>
       <w:r>
-        <w:t xml:space="preserve"> Use approved KPI definitions and verified data mappings for both query paths. Ask for clarification when necessary, compare results against independently verified reference answers, and retain query and source information for investigation. Revalidate affected mappings and tests when definitions or schemas change.</w:t>
+        <w:t xml:space="preserve"> Use approved KPI definitions and verified data mappings for both query paths. Ask for </w:t>
+      </w:r>
+      <w:proofErr w:type="gramStart"/>
+      <w:r>
+        <w:t>clarification</w:t>
+      </w:r>
+      <w:proofErr w:type="gramEnd"/>
+      <w:r>
+        <w:t xml:space="preserve"> when necessary, compare results against independently verified reference answers, and retain query and source information for investigation. Revalidate affected mappings and tests when definitions or schemas change.</w:t>
       </w:r>
     </w:p>
     <w:p>
@@ -11627,9 +11739,11 @@
             <w:tcW w:w="3325" w:type="dxa"/>
           </w:tcPr>
           <w:p>
+            <w:proofErr w:type="spellStart"/>
             <w:r>
               <w:t>FastAPI</w:t>
             </w:r>
+            <w:proofErr w:type="spellEnd"/>
           </w:p>
         </w:tc>
         <w:tc>
@@ -11638,12 +11752,14 @@
           </w:tcPr>
           <w:p>
             <w:hyperlink r:id="rId22" w:history="1">
+              <w:proofErr w:type="spellStart"/>
               <w:r>
                 <w:rPr>
                   <w:rStyle w:val="Hyperlink"/>
                 </w:rPr>
                 <w:t>FastAPI</w:t>
               </w:r>
+              <w:proofErr w:type="spellEnd"/>
             </w:hyperlink>
             <w:r>
               <w:t xml:space="preserve"> is a Python framework for building APIs using type annotations. It is used to implement the ACBI application backend.</w:t>
@@ -11785,9 +11901,11 @@
             <w:tcW w:w="3325" w:type="dxa"/>
           </w:tcPr>
           <w:p>
+            <w:proofErr w:type="spellStart"/>
             <w:r>
               <w:t>Pydantic</w:t>
             </w:r>
+            <w:proofErr w:type="spellEnd"/>
           </w:p>
         </w:tc>
         <w:tc>
@@ -11796,12 +11914,14 @@
           </w:tcPr>
           <w:p>
             <w:hyperlink r:id="rId23" w:history="1">
+              <w:proofErr w:type="spellStart"/>
               <w:r>
                 <w:rPr>
                   <w:rStyle w:val="Hyperlink"/>
                 </w:rPr>
                 <w:t>Pydantic</w:t>
               </w:r>
+              <w:proofErr w:type="spellEnd"/>
             </w:hyperlink>
             <w:r>
               <w:t xml:space="preserve"> is a Python library for data validation using type annotations. In ACBI, it supports checking the structure and types of request and response data.</w:t>
@@ -12400,7 +12520,15 @@
           </w:tcPr>
           <w:p>
             <w:r>
-              <w:t>Registration and renewal if a custom domain is required.</w:t>
+              <w:t xml:space="preserve">Registration and renewal if a custom domain </w:t>
+            </w:r>
+            <w:proofErr w:type="gramStart"/>
+            <w:r>
+              <w:t>is</w:t>
+            </w:r>
+            <w:proofErr w:type="gramEnd"/>
+            <w:r>
+              <w:t xml:space="preserve"> required.</w:t>
             </w:r>
           </w:p>
         </w:tc>
@@ -12423,7 +12551,15 @@
     </w:p>
     <w:p>
       <w:r>
-        <w:t>An indicative estimate for the AI service alone, at October 2026 prices. It assumes the worst case, in which every question calls the AI service for interpretation, SQL proposal and chart selection; it leaves out SQL correction attempts, summaries and replies about the data. Prices and token counts must be confirmed before a decision, and the Claude options have not yet been run against the project test set.</w:t>
+        <w:t xml:space="preserve">An indicative estimate for the AI </w:t>
+      </w:r>
+      <w:proofErr w:type="gramStart"/>
+      <w:r>
+        <w:t>service</w:t>
+      </w:r>
+      <w:proofErr w:type="gramEnd"/>
+      <w:r>
+        <w:t xml:space="preserve"> alone, at October 2026 prices. It assumes the worst case, in which every question calls the AI service for interpretation, SQL proposal and chart selection; it leaves out SQL correction attempts, summaries and replies about the data. Prices and token counts must be confirmed before a decision, and the Claude options have not yet been run against the project test set.</w:t>
       </w:r>
     </w:p>
     <w:tbl>
@@ -12719,6 +12855,8 @@
         <w:t>Operating staff cost is not yet estimated and is to be completed.</w:t>
       </w:r>
     </w:p>
+    <w:p/>
+    <w:p/>
     <w:sectPr>
       <w:footerReference w:type="default" r:id="rId25"/>
       <w:pgSz w:w="12240" w:h="15840"/>
@@ -12766,7 +12904,23 @@
         <w:color w:val="787878"/>
         <w:sz w:val="16"/>
       </w:rPr>
-      <w:t>Technical Solution Proposal  |  AI-Powered Conversational BI</w:t>
+      <w:t xml:space="preserve">Technical Solution </w:t>
+    </w:r>
+    <w:proofErr w:type="gramStart"/>
+    <w:r>
+      <w:rPr>
+        <w:color w:val="787878"/>
+        <w:sz w:val="16"/>
+      </w:rPr>
+      <w:t>Proposal  |</w:t>
+    </w:r>
+    <w:proofErr w:type="gramEnd"/>
+    <w:r>
+      <w:rPr>
+        <w:color w:val="787878"/>
+        <w:sz w:val="16"/>
+      </w:rPr>
+      <w:t xml:space="preserve">  AI-Powered Conversational BI</w:t>
     </w:r>
   </w:p>
   <w:p>

</xml_diff>

<commit_message>
Drop the staff-cost placeholders from the Excel, the proposal and the script
</commit_message>
<xml_diff>
--- a/docs/ACBI_Technical_Solution_Proposal_v1.1.docx
+++ b/docs/ACBI_Technical_Solution_Proposal_v1.1.docx
@@ -12559,7 +12559,7 @@
       </w:r>
       <w:proofErr w:type="gramEnd"/>
       <w:r>
-        <w:t xml:space="preserve"> alone, at October 2026 prices. It assumes the worst case, in which every question calls the AI service for interpretation, SQL proposal and chart selection; it leaves out SQL correction attempts, summaries and replies about the data. Prices and token counts must be confirmed before a decision, and the Claude options have not yet been run against the project test set.</w:t>
+        <w:t xml:space="preserve"> alone, at October 2026 prices. It assumes the worst case, in which every question calls the AI service for interpretation, SQL proposal and chart selection; it leaves out SQL correction attempts, summaries, replies about the data and operating staff cost. Prices and token counts must be confirmed before a decision, and the Claude options have not yet been run against the project test set.</w:t>
       </w:r>
     </w:p>
     <w:tbl>
@@ -12850,11 +12850,6 @@
         </w:tc>
       </w:tr>
     </w:tbl>
-    <w:p>
-      <w:r>
-        <w:t>Operating staff cost is not yet estimated and is to be completed.</w:t>
-      </w:r>
-    </w:p>
     <w:p/>
     <w:p/>
     <w:sectPr>

</xml_diff>